<commit_message>
Expand report detail and generate evidence figure bank
</commit_message>
<xml_diff>
--- a/report/northstar_assignment_report.docx
+++ b/report/northstar_assignment_report.docx
@@ -8,7 +8,6 @@
       </w:pPr>
       <w:r>
         <w:br/>
-        <w:br/>
       </w:r>
     </w:p>
     <w:p>
@@ -17,7 +16,7 @@
         <w:jc w:val="center"/>
       </w:pPr>
       <w:r>
-        <w:t>Operational Diagnosis and Integrated Database Redesign for NorthStar Urban Mobility and Logistics</w:t>
+        <w:t>Operational Diagnosis and Database Redesign for NorthStar Urban Mobility and Logistics</w:t>
       </w:r>
     </w:p>
     <w:p>
@@ -29,7 +28,6 @@
         <w:t>Databases and Analytics Coursework Assignment</w:t>
       </w:r>
     </w:p>
-    <w:p/>
     <w:p>
       <w:pPr>
         <w:jc w:val="center"/>
@@ -37,6 +35,7 @@
       <w:r>
         <w:rPr>
           <w:rFonts w:ascii="Arial" w:hAnsi="Arial"/>
+          <w:color w:val="1F2937"/>
           <w:sz w:val="22"/>
         </w:rPr>
         <w:t>Student Name: [Add your name]</w:t>
@@ -49,6 +48,7 @@
       <w:r>
         <w:rPr>
           <w:rFonts w:ascii="Arial" w:hAnsi="Arial"/>
+          <w:color w:val="1F2937"/>
           <w:sz w:val="22"/>
         </w:rPr>
         <w:t>Student ID: [Add your student ID]</w:t>
@@ -61,6 +61,7 @@
       <w:r>
         <w:rPr>
           <w:rFonts w:ascii="Arial" w:hAnsi="Arial"/>
+          <w:color w:val="1F2937"/>
           <w:sz w:val="22"/>
         </w:rPr>
         <w:t>Module: CP60056E Databases and Analytics</w:t>
@@ -73,6 +74,33 @@
       <w:r>
         <w:rPr>
           <w:rFonts w:ascii="Arial" w:hAnsi="Arial"/>
+          <w:color w:val="1F2937"/>
+          <w:sz w:val="22"/>
+        </w:rPr>
+        <w:t>Assessment Component: Coursework Assignment</w:t>
+      </w:r>
+    </w:p>
+    <w:p>
+      <w:pPr>
+        <w:jc w:val="center"/>
+      </w:pPr>
+      <w:r>
+        <w:rPr>
+          <w:rFonts w:ascii="Arial" w:hAnsi="Arial"/>
+          <w:color w:val="1F2937"/>
+          <w:sz w:val="22"/>
+        </w:rPr>
+        <w:t>Assessment Weighting: 80%</w:t>
+      </w:r>
+    </w:p>
+    <w:p>
+      <w:pPr>
+        <w:jc w:val="center"/>
+      </w:pPr>
+      <w:r>
+        <w:rPr>
+          <w:rFonts w:ascii="Arial" w:hAnsi="Arial"/>
+          <w:color w:val="1F2937"/>
           <w:sz w:val="22"/>
         </w:rPr>
         <w:t>Academic Year: 2025-2026</w:t>
@@ -85,6 +113,7 @@
       <w:r>
         <w:rPr>
           <w:rFonts w:ascii="Arial" w:hAnsi="Arial"/>
+          <w:color w:val="1F2937"/>
           <w:sz w:val="22"/>
         </w:rPr>
         <w:t>Case Study: NorthStar Urban Mobility and Logistics</w:t>
@@ -97,6 +126,7 @@
       <w:r>
         <w:rPr>
           <w:rFonts w:ascii="Arial" w:hAnsi="Arial"/>
+          <w:color w:val="1F2937"/>
           <w:sz w:val="22"/>
         </w:rPr>
         <w:t>GitHub Repository: [Add GitHub repo link after upload]</w:t>
@@ -109,38 +139,63 @@
       <w:r>
         <w:rPr>
           <w:rFonts w:ascii="Arial" w:hAnsi="Arial"/>
+          <w:color w:val="1F2937"/>
           <w:sz w:val="22"/>
         </w:rPr>
-        <w:t>Submission Date: [Add submission date]</w:t>
+        <w:t>Submission Route: Blackboard</w:t>
       </w:r>
     </w:p>
     <w:p/>
     <w:tbl>
       <w:tblPr>
         <w:tblW w:type="auto" w:w="0"/>
+        <w:jc w:val="center"/>
         <w:tblLayout w:type="fixed"/>
         <w:tblLook w:firstColumn="1" w:firstRow="1" w:lastColumn="0" w:lastRow="0" w:noHBand="0" w:noVBand="1" w:val="04A0"/>
       </w:tblPr>
       <w:tblGrid>
-        <w:gridCol w:w="8640"/>
+        <w:gridCol w:w="8784"/>
       </w:tblGrid>
       <w:tr>
         <w:tc>
           <w:tcPr>
-            <w:tcW w:type="dxa" w:w="9317"/>
+            <w:tcW w:type="dxa" w:w="9461"/>
             <w:shd w:fill="F5EFE6"/>
+            <w:vAlign w:val="center"/>
           </w:tcPr>
           <w:p>
             <w:pPr>
               <w:jc w:val="center"/>
             </w:pPr>
+            <w:r/>
             <w:r>
-              <w:t>This report analyses the NorthStar case study using SQL in R, R analytics, Python data processing, and a MongoDB-style redesign. It focuses on operational reliability, customer experience, and data architecture improvement.</w:t>
+              <w:rPr>
+                <w:rFonts w:ascii="Arial" w:hAnsi="Arial"/>
+                <w:b w:val="0"/>
+                <w:color w:val="1F2937"/>
+                <w:sz w:val="22"/>
+              </w:rPr>
+              <w:t>This report addresses the NorthStar case study through SQL in R, Python analytics, and a MongoDB-oriented redesign. The analysis focuses on delivery reliability, customer experience, data-quality failures, and the indexing strategy required to support a scalable operational reporting model.</w:t>
             </w:r>
           </w:p>
         </w:tc>
       </w:tr>
     </w:tbl>
+    <w:p/>
+    <w:p>
+      <w:pPr>
+        <w:jc w:val="center"/>
+      </w:pPr>
+      <w:r>
+        <w:rPr>
+          <w:rFonts w:ascii="Arial" w:hAnsi="Arial"/>
+          <w:i/>
+          <w:color w:val="5F6368"/>
+          <w:sz w:val="21"/>
+        </w:rPr>
+        <w:t>Written submission prepared to evidence structured querying, analytical interpretation, document modelling, and query optimisation.</w:t>
+      </w:r>
+    </w:p>
     <w:p>
       <w:r>
         <w:br w:type="page"/>
@@ -149,7 +204,6 @@
     <w:p>
       <w:pPr>
         <w:pStyle w:val="Heading1"/>
-        <w:jc w:val="left"/>
       </w:pPr>
       <w:r>
         <w:t>Table of Contents</w:t>
@@ -160,10 +214,6 @@
         <w:ind w:left="216"/>
       </w:pPr>
       <w:r>
-        <w:rPr>
-          <w:rFonts w:ascii="Arial" w:hAnsi="Arial"/>
-          <w:sz w:val="22"/>
-        </w:rPr>
         <w:t>Abstract</w:t>
       </w:r>
     </w:p>
@@ -172,11 +222,80 @@
         <w:ind w:left="216"/>
       </w:pPr>
       <w:r>
-        <w:rPr>
-          <w:rFonts w:ascii="Arial" w:hAnsi="Arial"/>
-          <w:sz w:val="22"/>
-        </w:rPr>
-        <w:t>Chapter 1: Introduction</w:t>
+        <w:t>Chapter 1: Introduction and Assessment Context</w:t>
+      </w:r>
+    </w:p>
+    <w:p>
+      <w:pPr>
+        <w:ind w:left="216"/>
+      </w:pPr>
+      <w:r>
+        <w:t>Chapter 2: Case Study Review, Data Inventory, and Methodology</w:t>
+      </w:r>
+    </w:p>
+    <w:p>
+      <w:pPr>
+        <w:ind w:left="216"/>
+      </w:pPr>
+      <w:r>
+        <w:t>Chapter 3: SQL in R Analysis and Relational Findings</w:t>
+      </w:r>
+    </w:p>
+    <w:p>
+      <w:pPr>
+        <w:ind w:left="216"/>
+      </w:pPr>
+      <w:r>
+        <w:t>Chapter 4: Python Analytics, Feature Engineering, and Interpretation</w:t>
+      </w:r>
+    </w:p>
+    <w:p>
+      <w:pPr>
+        <w:ind w:left="216"/>
+      </w:pPr>
+      <w:r>
+        <w:t>Chapter 5: MongoDB Design, Indexing Strategy, and Query Optimisation</w:t>
+      </w:r>
+    </w:p>
+    <w:p>
+      <w:pPr>
+        <w:ind w:left="216"/>
+      </w:pPr>
+      <w:r>
+        <w:t>Chapter 6: Recommendations and Conclusion</w:t>
+      </w:r>
+    </w:p>
+    <w:p>
+      <w:pPr>
+        <w:ind w:left="216"/>
+      </w:pPr>
+      <w:r>
+        <w:t>References</w:t>
+      </w:r>
+    </w:p>
+    <w:p>
+      <w:pPr>
+        <w:ind w:left="216"/>
+      </w:pPr>
+      <w:r>
+        <w:t>Appendix A: Evidence Figure Register</w:t>
+      </w:r>
+    </w:p>
+    <w:p>
+      <w:pPr>
+        <w:ind w:left="216"/>
+      </w:pPr>
+      <w:r>
+        <w:t>Appendix B: Output Files Generated</w:t>
+      </w:r>
+    </w:p>
+    <w:p/>
+    <w:p>
+      <w:pPr>
+        <w:pStyle w:val="Heading1"/>
+      </w:pPr>
+      <w:r>
+        <w:t>List of Figures</w:t>
       </w:r>
     </w:p>
     <w:p>
@@ -185,10 +304,9 @@
       </w:pPr>
       <w:r>
         <w:rPr>
-          <w:rFonts w:ascii="Arial" w:hAnsi="Arial"/>
-          <w:sz w:val="22"/>
+          <w:sz w:val="21"/>
         </w:rPr>
-        <w:t>Chapter 2: Data Preparation and Analytical Method</w:t>
+        <w:t>Figure 1. Python merged dataset preview used before feature engineering.</w:t>
       </w:r>
     </w:p>
     <w:p>
@@ -197,10 +315,9 @@
       </w:pPr>
       <w:r>
         <w:rPr>
-          <w:rFonts w:ascii="Arial" w:hAnsi="Arial"/>
-          <w:sz w:val="22"/>
+          <w:sz w:val="21"/>
         </w:rPr>
-        <w:t>Chapter 3: SQL in R and Relational Findings</w:t>
+        <w:t>Figure 2. SQL query result ranking hubs by non-on-time delivery share.</w:t>
       </w:r>
     </w:p>
     <w:p>
@@ -209,10 +326,9 @@
       </w:pPr>
       <w:r>
         <w:rPr>
-          <w:rFonts w:ascii="Arial" w:hAnsi="Arial"/>
-          <w:sz w:val="22"/>
+          <w:sz w:val="21"/>
         </w:rPr>
-        <w:t>Chapter 4: Analytics, Python Processing, and Interpretation</w:t>
+        <w:t>Figure 3. SQL query result for orders with no linked delivery record.</w:t>
       </w:r>
     </w:p>
     <w:p>
@@ -221,10 +337,9 @@
       </w:pPr>
       <w:r>
         <w:rPr>
-          <w:rFonts w:ascii="Arial" w:hAnsi="Arial"/>
-          <w:sz w:val="22"/>
+          <w:sz w:val="21"/>
         </w:rPr>
-        <w:t>Chapter 5: MongoDB Design and Query Optimisation</w:t>
+        <w:t>Figure 4. Zone-level performance table after cleaning inconsistent location labels.</w:t>
       </w:r>
     </w:p>
     <w:p>
@@ -233,10 +348,9 @@
       </w:pPr>
       <w:r>
         <w:rPr>
-          <w:rFonts w:ascii="Arial" w:hAnsi="Arial"/>
-          <w:sz w:val="22"/>
+          <w:sz w:val="21"/>
         </w:rPr>
-        <w:t>Chapter 6: Recommendations and Conclusion</w:t>
+        <w:t>Figure 5. Failed delivery share by operating zone.</w:t>
       </w:r>
     </w:p>
     <w:p>
@@ -245,10 +359,97 @@
       </w:pPr>
       <w:r>
         <w:rPr>
-          <w:rFonts w:ascii="Arial" w:hAnsi="Arial"/>
-          <w:sz w:val="22"/>
+          <w:sz w:val="21"/>
         </w:rPr>
-        <w:t>Appendix A: Evidence Files Generated</w:t>
+        <w:t>Figure 6. Complaint mix by delivery status.</w:t>
+      </w:r>
+    </w:p>
+    <w:p>
+      <w:pPr>
+        <w:ind w:left="216"/>
+      </w:pPr>
+      <w:r>
+        <w:rPr>
+          <w:sz w:val="21"/>
+        </w:rPr>
+        <w:t>Figure 7. Proof-of-completion risk comparison.</w:t>
+      </w:r>
+    </w:p>
+    <w:p>
+      <w:pPr>
+        <w:ind w:left="216"/>
+      </w:pPr>
+      <w:r>
+        <w:rPr>
+          <w:sz w:val="21"/>
+        </w:rPr>
+        <w:t>Figure 8. Vehicle maintenance performance summary.</w:t>
+      </w:r>
+    </w:p>
+    <w:p>
+      <w:pPr>
+        <w:ind w:left="216"/>
+      </w:pPr>
+      <w:r>
+        <w:rPr>
+          <w:sz w:val="21"/>
+        </w:rPr>
+        <w:t>Figure 9. Complaint intensity by hub.</w:t>
+      </w:r>
+    </w:p>
+    <w:p>
+      <w:pPr>
+        <w:ind w:left="216"/>
+      </w:pPr>
+      <w:r>
+        <w:rPr>
+          <w:sz w:val="21"/>
+        </w:rPr>
+        <w:t>Figure 10. Highest app latency segments.</w:t>
+      </w:r>
+    </w:p>
+    <w:p>
+      <w:pPr>
+        <w:ind w:left="216"/>
+      </w:pPr>
+      <w:r>
+        <w:rPr>
+          <w:sz w:val="21"/>
+        </w:rPr>
+        <w:t>Figure 11. Hub profitability proxy after direct cost and compensation.</w:t>
+      </w:r>
+    </w:p>
+    <w:p>
+      <w:pPr>
+        <w:ind w:left="216"/>
+      </w:pPr>
+      <w:r>
+        <w:rPr>
+          <w:sz w:val="21"/>
+        </w:rPr>
+        <w:t>Figure 12. Proposed MongoDB customer case document.</w:t>
+      </w:r>
+    </w:p>
+    <w:p>
+      <w:pPr>
+        <w:ind w:left="216"/>
+      </w:pPr>
+      <w:r>
+        <w:rPr>
+          <w:sz w:val="21"/>
+        </w:rPr>
+        <w:t>Figure 13. MongoDB index design evidence.</w:t>
+      </w:r>
+    </w:p>
+    <w:p>
+      <w:pPr>
+        <w:ind w:left="216"/>
+      </w:pPr>
+      <w:r>
+        <w:rPr>
+          <w:sz w:val="21"/>
+        </w:rPr>
+        <w:t>Figure 14. MongoDB aggregation output for delayed or failed open cases.</w:t>
       </w:r>
     </w:p>
     <w:p>
@@ -266,7 +467,7 @@
     </w:p>
     <w:p>
       <w:r>
-        <w:t>This report investigates the operational, customer-service, and data-management problems present in the NorthStar Urban Mobility and Logistics case study. The dataset combines structured operational files with more flexible event and complaint records, making it a strong example of a business whose reporting model has not kept pace with its data growth. The analysis was carried out through relational querying, R-oriented analytics, Python-led feature engineering, and a MongoDB-oriented redesign for semi-structured records. The key findings show three critical issues: a fragmented order-to-delivery pipeline with 300 orders missing delivery records, persistent service underperformance in the central operating zone, and strong risk signals tied to missing proof of completion and vehicles already marked InRepair. The report concludes that NorthStar requires a hybrid architecture in which structured reporting remains relational, while customer cases, exception histories, and app event sequences are remodelled into a document-based store to support more realistic operational analysis.</w:t>
+        <w:t>This report investigates the operational, customer-service, and data-management weaknesses described in the NorthStar Urban Mobility and Logistics case study. The assignment is approached as an integrated database and analytics problem rather than as a collection of isolated tables, because the central issue in the case is that business truth is fragmented across orders, deliveries, complaints, incidents, and app-event records. The analysis uses SQL in an R-oriented workflow to evaluate structured operational performance, Python to standardise inconsistent fields and engineer risk-sensitive features, and a MongoDB-oriented document model to restructure semi-structured customer cases and event histories. The main findings are that NorthStar has a severe order-to-delivery visibility gap, with 300 orders missing a delivery record, that the central operational layer is the weakest part of the service network, and that missing proof of completion and active use of vehicles already marked InRepair are both strong warning indicators of failure. The report concludes that NorthStar should retain relational processing for highly structured operational facts while redesigning complaint, exception, and event histories into document-based case records supported by targeted MongoDB indexes. This hybrid approach is the strongest fit for the dataset because it combines reliable reporting with more realistic representation of complex operational journeys.</w:t>
       </w:r>
     </w:p>
     <w:p>
@@ -279,7 +480,7 @@
         <w:pStyle w:val="Heading1"/>
       </w:pPr>
       <w:r>
-        <w:t>Chapter 1: Introduction</w:t>
+        <w:t>Chapter 1: Introduction and Assessment Context</w:t>
       </w:r>
     </w:p>
     <w:p>
@@ -287,12 +488,12 @@
         <w:pStyle w:val="Heading2"/>
       </w:pPr>
       <w:r>
-        <w:t>1.1 Background</w:t>
+        <w:t>1.1 Business Context</w:t>
       </w:r>
     </w:p>
     <w:p>
       <w:r>
-        <w:t>NorthStar Urban Mobility and Logistics operates across multiple UK city zones and combines passenger transport, parcel handling, warehouse dispatch, charging infrastructure, and mobile-platform services. The case study presents a business that has grown quickly but now suffers from fragmented reporting, inconsistent performance, and poor integration between structured operational data and newer event-driven records.</w:t>
+        <w:t>NorthStar Urban Mobility and Logistics operates across several city zones and combines different service models including passenger journeys, parcel deliveries, retail movement, business fulfilment, and medical transport. The case study describes a business that has scaled quickly but has not developed a coherent reporting architecture to match that growth. As a result, service failures appear in multiple forms: late or failed deliveries, disconnected customer complaints, inconsistent digital experience, and fragmented operational oversight.</w:t>
       </w:r>
     </w:p>
     <w:p>
@@ -300,12 +501,12 @@
         <w:pStyle w:val="Heading2"/>
       </w:pPr>
       <w:r>
-        <w:t>1.2 Aim</w:t>
+        <w:t>1.2 Assignment Focus and Learning Outcome Alignment</w:t>
       </w:r>
     </w:p>
     <w:p>
       <w:r>
-        <w:t>The aim of this assignment is to identify NorthStar's most significant operational and analytical failures, analyse the evidence using appropriate database and analytics methods, and propose a justified redesign that uses both relational processing and MongoDB-based document modelling.</w:t>
+        <w:t>The written coursework is designed to evidence the database and analytics skills required in the module guide. The SQL in R component addresses structured querying and analytical interpretation, the Python and MongoDB sections address document-oriented database thinking and integration with code, and the optimisation section addresses the ability to justify indexing and query design choices. The report is therefore organised to reflect the logic of the assessment rather than simply listing charts in isolation.</w:t>
       </w:r>
     </w:p>
     <w:p>
@@ -313,7 +514,20 @@
         <w:pStyle w:val="Heading2"/>
       </w:pPr>
       <w:r>
-        <w:t>1.3 Objectives</w:t>
+        <w:t>1.3 Aim</w:t>
+      </w:r>
+    </w:p>
+    <w:p>
+      <w:r>
+        <w:t>The aim of this report is to diagnose NorthStar's most important operational problems, explain those problems using reproducible analysis, and propose a technically justified database redesign that improves both day-to-day reporting and future scalability.</w:t>
+      </w:r>
+    </w:p>
+    <w:p>
+      <w:pPr>
+        <w:pStyle w:val="Heading2"/>
+      </w:pPr>
+      <w:r>
+        <w:t>1.4 Objectives</w:t>
       </w:r>
     </w:p>
     <w:p>
@@ -321,7 +535,7 @@
         <w:pStyle w:val="ListBullet"/>
       </w:pPr>
       <w:r>
-        <w:t>Use SQL within an R-oriented workflow to identify reliability, hub, and pipeline issues.</w:t>
+        <w:t>Use relational querying to identify reliability, visibility, and hub-performance failures.</w:t>
       </w:r>
     </w:p>
     <w:p>
@@ -329,7 +543,7 @@
         <w:pStyle w:val="ListBullet"/>
       </w:pPr>
       <w:r>
-        <w:t>Apply analytics techniques to interpret complaint, latency, and performance patterns.</w:t>
+        <w:t>Clean and standardise the dataset so that inconsistent labels do not distort results.</w:t>
       </w:r>
     </w:p>
     <w:p>
@@ -337,7 +551,7 @@
         <w:pStyle w:val="ListBullet"/>
       </w:pPr>
       <w:r>
-        <w:t>Use Python to clean inconsistent data and engineer cross-file analytical features.</w:t>
+        <w:t>Engineer cross-file analytical features that reveal deeper operational risk patterns.</w:t>
       </w:r>
     </w:p>
     <w:p>
@@ -345,7 +559,7 @@
         <w:pStyle w:val="ListBullet"/>
       </w:pPr>
       <w:r>
-        <w:t>Design a MongoDB-oriented document model for complaints, cases, events, and delivery exceptions.</w:t>
+        <w:t>Design a MongoDB-style case model that keeps complaints, app events, and delivery exceptions together.</w:t>
       </w:r>
     </w:p>
     <w:p>
@@ -353,7 +567,7 @@
         <w:pStyle w:val="ListBullet"/>
       </w:pPr>
       <w:r>
-        <w:t>Recommend indexing and optimisation strategies for both the relational and document-based parts of the solution.</w:t>
+        <w:t>Propose an indexing and optimisation strategy grounded in realistic operational query paths.</w:t>
       </w:r>
     </w:p>
     <w:p>
@@ -361,7 +575,7 @@
         <w:pStyle w:val="Heading1"/>
       </w:pPr>
       <w:r>
-        <w:t>Chapter 2: Data Preparation and Analytical Method</w:t>
+        <w:t>Chapter 2: Case Study Review, Data Inventory, and Methodology</w:t>
       </w:r>
     </w:p>
     <w:p>
@@ -369,42 +583,98 @@
         <w:pStyle w:val="Heading2"/>
       </w:pPr>
       <w:r>
-        <w:t>2.1 Dataset Overview</w:t>
+        <w:t>2.1 Why the Case Demands an Integrated Approach</w:t>
       </w:r>
     </w:p>
     <w:p>
       <w:r>
-        <w:t>The NorthStar dataset contains orders, deliveries, customers, drivers, vehicles, hubs, complaints, incidents, and app events. The data was analysed as an integrated business system rather than as isolated files, because the case study explicitly states that NorthStar's failures arise from disconnected views of the same operations.</w:t>
+        <w:t>The case study does not describe one single technical problem. Instead, it presents a business whose orders, deliveries, complaints, incidents, and app interactions are recorded separately and then interpreted through incomplete reporting. That means the analytical task is not only to produce summaries, but also to reconnect the operational story across those systems. This is why the report combines relational analysis with document-oriented redesign rather than assuming one database style can solve every requirement.</w:t>
+      </w:r>
+    </w:p>
+    <w:p>
+      <w:pPr>
+        <w:pStyle w:val="Heading2"/>
+      </w:pPr>
+      <w:r>
+        <w:t>2.2 Dataset Inventory</w:t>
       </w:r>
     </w:p>
     <w:tbl>
       <w:tblPr>
         <w:tblStyle w:val="TableGrid"/>
         <w:tblW w:type="auto" w:w="0"/>
+        <w:jc w:val="center"/>
         <w:tblLook w:firstColumn="1" w:firstRow="1" w:lastColumn="0" w:lastRow="0" w:noHBand="0" w:noVBand="1" w:val="04A0"/>
       </w:tblPr>
       <w:tblGrid>
-        <w:gridCol w:w="4658"/>
-        <w:gridCol w:w="4658"/>
+        <w:gridCol w:w="3154"/>
+        <w:gridCol w:w="3154"/>
+        <w:gridCol w:w="3154"/>
       </w:tblGrid>
       <w:tr>
         <w:tc>
           <w:tcPr>
-            <w:tcW w:type="dxa" w:w="4658"/>
+            <w:tcW w:type="dxa" w:w="3154"/>
+            <w:vAlign w:val="center"/>
+            <w:shd w:fill="FDE68A"/>
           </w:tcPr>
           <w:p>
+            <w:pPr>
+              <w:jc w:val="left"/>
+            </w:pPr>
+            <w:r/>
             <w:r>
-              <w:t>Data quality issue</w:t>
+              <w:rPr>
+                <w:rFonts w:ascii="Arial" w:hAnsi="Arial"/>
+                <w:b/>
+                <w:color w:val="1F2937"/>
+                <w:sz w:val="21"/>
+              </w:rPr>
+              <w:t>Source File</w:t>
             </w:r>
           </w:p>
         </w:tc>
         <w:tc>
           <w:tcPr>
-            <w:tcW w:type="dxa" w:w="4658"/>
+            <w:tcW w:type="dxa" w:w="3154"/>
+            <w:vAlign w:val="center"/>
+            <w:shd w:fill="FDE68A"/>
           </w:tcPr>
           <w:p>
+            <w:pPr>
+              <w:jc w:val="left"/>
+            </w:pPr>
+            <w:r/>
             <w:r>
-              <w:t>Count</w:t>
+              <w:rPr>
+                <w:rFonts w:ascii="Arial" w:hAnsi="Arial"/>
+                <w:b/>
+                <w:color w:val="1F2937"/>
+                <w:sz w:val="21"/>
+              </w:rPr>
+              <w:t>Records</w:t>
+            </w:r>
+          </w:p>
+        </w:tc>
+        <w:tc>
+          <w:tcPr>
+            <w:tcW w:type="dxa" w:w="3154"/>
+            <w:vAlign w:val="center"/>
+            <w:shd w:fill="FDE68A"/>
+          </w:tcPr>
+          <w:p>
+            <w:pPr>
+              <w:jc w:val="left"/>
+            </w:pPr>
+            <w:r/>
+            <w:r>
+              <w:rPr>
+                <w:rFonts w:ascii="Arial" w:hAnsi="Arial"/>
+                <w:b/>
+                <w:color w:val="1F2937"/>
+                <w:sz w:val="21"/>
+              </w:rPr>
+              <w:t>Business Role</w:t>
             </w:r>
           </w:p>
         </w:tc>
@@ -412,21 +682,64 @@
       <w:tr>
         <w:tc>
           <w:tcPr>
-            <w:tcW w:type="dxa" w:w="4658"/>
+            <w:tcW w:type="dxa" w:w="3154"/>
+            <w:vAlign w:val="center"/>
           </w:tcPr>
           <w:p>
+            <w:pPr>
+              <w:jc w:val="left"/>
+            </w:pPr>
+            <w:r/>
             <w:r>
-              <w:t>Missing customer preferred channel</w:t>
+              <w:rPr>
+                <w:rFonts w:ascii="Arial" w:hAnsi="Arial"/>
+                <w:b w:val="0"/>
+                <w:color w:val="1F2937"/>
+                <w:sz w:val="21"/>
+              </w:rPr>
+              <w:t>orders</w:t>
             </w:r>
           </w:p>
         </w:tc>
         <w:tc>
           <w:tcPr>
-            <w:tcW w:type="dxa" w:w="4658"/>
+            <w:tcW w:type="dxa" w:w="3154"/>
+            <w:vAlign w:val="center"/>
           </w:tcPr>
           <w:p>
+            <w:pPr>
+              <w:jc w:val="left"/>
+            </w:pPr>
+            <w:r/>
             <w:r>
-              <w:t>13</w:t>
+              <w:rPr>
+                <w:rFonts w:ascii="Arial" w:hAnsi="Arial"/>
+                <w:b w:val="0"/>
+                <w:color w:val="1F2937"/>
+                <w:sz w:val="21"/>
+              </w:rPr>
+              <w:t>1250</w:t>
+            </w:r>
+          </w:p>
+        </w:tc>
+        <w:tc>
+          <w:tcPr>
+            <w:tcW w:type="dxa" w:w="3154"/>
+            <w:vAlign w:val="center"/>
+          </w:tcPr>
+          <w:p>
+            <w:pPr>
+              <w:jc w:val="left"/>
+            </w:pPr>
+            <w:r/>
+            <w:r>
+              <w:rPr>
+                <w:rFonts w:ascii="Arial" w:hAnsi="Arial"/>
+                <w:b w:val="0"/>
+                <w:color w:val="1F2937"/>
+                <w:sz w:val="20"/>
+              </w:rPr>
+              <w:t>Customer demand creation, promised windows, route intent, and commercial value.</w:t>
             </w:r>
           </w:p>
         </w:tc>
@@ -434,21 +747,64 @@
       <w:tr>
         <w:tc>
           <w:tcPr>
-            <w:tcW w:type="dxa" w:w="4658"/>
+            <w:tcW w:type="dxa" w:w="3154"/>
+            <w:vAlign w:val="center"/>
           </w:tcPr>
           <w:p>
+            <w:pPr>
+              <w:jc w:val="left"/>
+            </w:pPr>
+            <w:r/>
             <w:r>
-              <w:t>Missing booking channel</w:t>
+              <w:rPr>
+                <w:rFonts w:ascii="Arial" w:hAnsi="Arial"/>
+                <w:b w:val="0"/>
+                <w:color w:val="1F2937"/>
+                <w:sz w:val="21"/>
+              </w:rPr>
+              <w:t>deliveries</w:t>
             </w:r>
           </w:p>
         </w:tc>
         <w:tc>
           <w:tcPr>
-            <w:tcW w:type="dxa" w:w="4658"/>
+            <w:tcW w:type="dxa" w:w="3154"/>
+            <w:vAlign w:val="center"/>
           </w:tcPr>
           <w:p>
+            <w:pPr>
+              <w:jc w:val="left"/>
+            </w:pPr>
+            <w:r/>
             <w:r>
-              <w:t>25</w:t>
+              <w:rPr>
+                <w:rFonts w:ascii="Arial" w:hAnsi="Arial"/>
+                <w:b w:val="0"/>
+                <w:color w:val="1F2937"/>
+                <w:sz w:val="21"/>
+              </w:rPr>
+              <w:t>950</w:t>
+            </w:r>
+          </w:p>
+        </w:tc>
+        <w:tc>
+          <w:tcPr>
+            <w:tcW w:type="dxa" w:w="3154"/>
+            <w:vAlign w:val="center"/>
+          </w:tcPr>
+          <w:p>
+            <w:pPr>
+              <w:jc w:val="left"/>
+            </w:pPr>
+            <w:r/>
+            <w:r>
+              <w:rPr>
+                <w:rFonts w:ascii="Arial" w:hAnsi="Arial"/>
+                <w:b w:val="0"/>
+                <w:color w:val="1F2937"/>
+                <w:sz w:val="20"/>
+              </w:rPr>
+              <w:t>Execution records linking drivers, vehicles, hubs, status outcomes, and route overrides.</w:t>
             </w:r>
           </w:p>
         </w:tc>
@@ -456,21 +812,64 @@
       <w:tr>
         <w:tc>
           <w:tcPr>
-            <w:tcW w:type="dxa" w:w="4658"/>
+            <w:tcW w:type="dxa" w:w="3154"/>
+            <w:vAlign w:val="center"/>
           </w:tcPr>
           <w:p>
+            <w:pPr>
+              <w:jc w:val="left"/>
+            </w:pPr>
+            <w:r/>
             <w:r>
-              <w:t>Missing delivery completion timestamp</w:t>
+              <w:rPr>
+                <w:rFonts w:ascii="Arial" w:hAnsi="Arial"/>
+                <w:b w:val="0"/>
+                <w:color w:val="1F2937"/>
+                <w:sz w:val="21"/>
+              </w:rPr>
+              <w:t>customers</w:t>
             </w:r>
           </w:p>
         </w:tc>
         <w:tc>
           <w:tcPr>
-            <w:tcW w:type="dxa" w:w="4658"/>
+            <w:tcW w:type="dxa" w:w="3154"/>
+            <w:vAlign w:val="center"/>
           </w:tcPr>
           <w:p>
+            <w:pPr>
+              <w:jc w:val="left"/>
+            </w:pPr>
+            <w:r/>
             <w:r>
-              <w:t>19</w:t>
+              <w:rPr>
+                <w:rFonts w:ascii="Arial" w:hAnsi="Arial"/>
+                <w:b w:val="0"/>
+                <w:color w:val="1F2937"/>
+                <w:sz w:val="21"/>
+              </w:rPr>
+              <w:t>650</w:t>
+            </w:r>
+          </w:p>
+        </w:tc>
+        <w:tc>
+          <w:tcPr>
+            <w:tcW w:type="dxa" w:w="3154"/>
+            <w:vAlign w:val="center"/>
+          </w:tcPr>
+          <w:p>
+            <w:pPr>
+              <w:jc w:val="left"/>
+            </w:pPr>
+            <w:r/>
+            <w:r>
+              <w:rPr>
+                <w:rFonts w:ascii="Arial" w:hAnsi="Arial"/>
+                <w:b w:val="0"/>
+                <w:color w:val="1F2937"/>
+                <w:sz w:val="20"/>
+              </w:rPr>
+              <w:t>Customer profile, loyalty, engagement, and channel preference information.</w:t>
             </w:r>
           </w:p>
         </w:tc>
@@ -478,21 +877,64 @@
       <w:tr>
         <w:tc>
           <w:tcPr>
-            <w:tcW w:type="dxa" w:w="4658"/>
+            <w:tcW w:type="dxa" w:w="3154"/>
+            <w:vAlign w:val="center"/>
           </w:tcPr>
           <w:p>
+            <w:pPr>
+              <w:jc w:val="left"/>
+            </w:pPr>
+            <w:r/>
             <w:r>
-              <w:t>Missing post-delivery rating</w:t>
+              <w:rPr>
+                <w:rFonts w:ascii="Arial" w:hAnsi="Arial"/>
+                <w:b w:val="0"/>
+                <w:color w:val="1F2937"/>
+                <w:sz w:val="21"/>
+              </w:rPr>
+              <w:t>complaints</w:t>
             </w:r>
           </w:p>
         </w:tc>
         <w:tc>
           <w:tcPr>
-            <w:tcW w:type="dxa" w:w="4658"/>
+            <w:tcW w:type="dxa" w:w="3154"/>
+            <w:vAlign w:val="center"/>
           </w:tcPr>
           <w:p>
+            <w:pPr>
+              <w:jc w:val="left"/>
+            </w:pPr>
+            <w:r/>
             <w:r>
-              <w:t>14</w:t>
+              <w:rPr>
+                <w:rFonts w:ascii="Arial" w:hAnsi="Arial"/>
+                <w:b w:val="0"/>
+                <w:color w:val="1F2937"/>
+                <w:sz w:val="21"/>
+              </w:rPr>
+              <w:t>320</w:t>
+            </w:r>
+          </w:p>
+        </w:tc>
+        <w:tc>
+          <w:tcPr>
+            <w:tcW w:type="dxa" w:w="3154"/>
+            <w:vAlign w:val="center"/>
+          </w:tcPr>
+          <w:p>
+            <w:pPr>
+              <w:jc w:val="left"/>
+            </w:pPr>
+            <w:r/>
+            <w:r>
+              <w:rPr>
+                <w:rFonts w:ascii="Arial" w:hAnsi="Arial"/>
+                <w:b w:val="0"/>
+                <w:color w:val="1F2937"/>
+                <w:sz w:val="20"/>
+              </w:rPr>
+              <w:t>Post-service dissatisfaction data with complaint type, severity, and compensation.</w:t>
             </w:r>
           </w:p>
         </w:tc>
@@ -500,37 +942,332 @@
       <w:tr>
         <w:tc>
           <w:tcPr>
-            <w:tcW w:type="dxa" w:w="4658"/>
+            <w:tcW w:type="dxa" w:w="3154"/>
+            <w:vAlign w:val="center"/>
           </w:tcPr>
           <w:p>
+            <w:pPr>
+              <w:jc w:val="left"/>
+            </w:pPr>
+            <w:r/>
             <w:r>
-              <w:t>Orders without delivery record</w:t>
+              <w:rPr>
+                <w:rFonts w:ascii="Arial" w:hAnsi="Arial"/>
+                <w:b w:val="0"/>
+                <w:color w:val="1F2937"/>
+                <w:sz w:val="21"/>
+              </w:rPr>
+              <w:t>app_events</w:t>
             </w:r>
           </w:p>
         </w:tc>
         <w:tc>
           <w:tcPr>
-            <w:tcW w:type="dxa" w:w="4658"/>
+            <w:tcW w:type="dxa" w:w="3154"/>
+            <w:vAlign w:val="center"/>
           </w:tcPr>
           <w:p>
+            <w:pPr>
+              <w:jc w:val="left"/>
+            </w:pPr>
+            <w:r/>
             <w:r>
-              <w:t>300</w:t>
+              <w:rPr>
+                <w:rFonts w:ascii="Arial" w:hAnsi="Arial"/>
+                <w:b w:val="0"/>
+                <w:color w:val="1F2937"/>
+                <w:sz w:val="21"/>
+              </w:rPr>
+              <w:t>640</w:t>
+            </w:r>
+          </w:p>
+        </w:tc>
+        <w:tc>
+          <w:tcPr>
+            <w:tcW w:type="dxa" w:w="3154"/>
+            <w:vAlign w:val="center"/>
+          </w:tcPr>
+          <w:p>
+            <w:pPr>
+              <w:jc w:val="left"/>
+            </w:pPr>
+            <w:r/>
+            <w:r>
+              <w:rPr>
+                <w:rFonts w:ascii="Arial" w:hAnsi="Arial"/>
+                <w:b w:val="0"/>
+                <w:color w:val="1F2937"/>
+                <w:sz w:val="20"/>
+              </w:rPr>
+              <w:t>Digital interaction trail for latency, retry, tracking, and app-journey analysis.</w:t>
+            </w:r>
+          </w:p>
+        </w:tc>
+      </w:tr>
+      <w:tr>
+        <w:tc>
+          <w:tcPr>
+            <w:tcW w:type="dxa" w:w="3154"/>
+            <w:vAlign w:val="center"/>
+          </w:tcPr>
+          <w:p>
+            <w:pPr>
+              <w:jc w:val="left"/>
+            </w:pPr>
+            <w:r/>
+            <w:r>
+              <w:rPr>
+                <w:rFonts w:ascii="Arial" w:hAnsi="Arial"/>
+                <w:b w:val="0"/>
+                <w:color w:val="1F2937"/>
+                <w:sz w:val="21"/>
+              </w:rPr>
+              <w:t>incidents</w:t>
+            </w:r>
+          </w:p>
+        </w:tc>
+        <w:tc>
+          <w:tcPr>
+            <w:tcW w:type="dxa" w:w="3154"/>
+            <w:vAlign w:val="center"/>
+          </w:tcPr>
+          <w:p>
+            <w:pPr>
+              <w:jc w:val="left"/>
+            </w:pPr>
+            <w:r/>
+            <w:r>
+              <w:rPr>
+                <w:rFonts w:ascii="Arial" w:hAnsi="Arial"/>
+                <w:b w:val="0"/>
+                <w:color w:val="1F2937"/>
+                <w:sz w:val="21"/>
+              </w:rPr>
+              <w:t>280</w:t>
+            </w:r>
+          </w:p>
+        </w:tc>
+        <w:tc>
+          <w:tcPr>
+            <w:tcW w:type="dxa" w:w="3154"/>
+            <w:vAlign w:val="center"/>
+          </w:tcPr>
+          <w:p>
+            <w:pPr>
+              <w:jc w:val="left"/>
+            </w:pPr>
+            <w:r/>
+            <w:r>
+              <w:rPr>
+                <w:rFonts w:ascii="Arial" w:hAnsi="Arial"/>
+                <w:b w:val="0"/>
+                <w:color w:val="1F2937"/>
+                <w:sz w:val="20"/>
+              </w:rPr>
+              <w:t>Operational exception records such as proof issues, battery alerts, and sync errors.</w:t>
+            </w:r>
+          </w:p>
+        </w:tc>
+      </w:tr>
+      <w:tr>
+        <w:tc>
+          <w:tcPr>
+            <w:tcW w:type="dxa" w:w="3154"/>
+            <w:vAlign w:val="center"/>
+          </w:tcPr>
+          <w:p>
+            <w:pPr>
+              <w:jc w:val="left"/>
+            </w:pPr>
+            <w:r/>
+            <w:r>
+              <w:rPr>
+                <w:rFonts w:ascii="Arial" w:hAnsi="Arial"/>
+                <w:b w:val="0"/>
+                <w:color w:val="1F2937"/>
+                <w:sz w:val="21"/>
+              </w:rPr>
+              <w:t>drivers</w:t>
+            </w:r>
+          </w:p>
+        </w:tc>
+        <w:tc>
+          <w:tcPr>
+            <w:tcW w:type="dxa" w:w="3154"/>
+            <w:vAlign w:val="center"/>
+          </w:tcPr>
+          <w:p>
+            <w:pPr>
+              <w:jc w:val="left"/>
+            </w:pPr>
+            <w:r/>
+            <w:r>
+              <w:rPr>
+                <w:rFonts w:ascii="Arial" w:hAnsi="Arial"/>
+                <w:b w:val="0"/>
+                <w:color w:val="1F2937"/>
+                <w:sz w:val="21"/>
+              </w:rPr>
+              <w:t>170</w:t>
+            </w:r>
+          </w:p>
+        </w:tc>
+        <w:tc>
+          <w:tcPr>
+            <w:tcW w:type="dxa" w:w="3154"/>
+            <w:vAlign w:val="center"/>
+          </w:tcPr>
+          <w:p>
+            <w:pPr>
+              <w:jc w:val="left"/>
+            </w:pPr>
+            <w:r/>
+            <w:r>
+              <w:rPr>
+                <w:rFonts w:ascii="Arial" w:hAnsi="Arial"/>
+                <w:b w:val="0"/>
+                <w:color w:val="1F2937"/>
+                <w:sz w:val="20"/>
+              </w:rPr>
+              <w:t>Driver capability, ratings, and experience context.</w:t>
+            </w:r>
+          </w:p>
+        </w:tc>
+      </w:tr>
+      <w:tr>
+        <w:tc>
+          <w:tcPr>
+            <w:tcW w:type="dxa" w:w="3154"/>
+            <w:vAlign w:val="center"/>
+          </w:tcPr>
+          <w:p>
+            <w:pPr>
+              <w:jc w:val="left"/>
+            </w:pPr>
+            <w:r/>
+            <w:r>
+              <w:rPr>
+                <w:rFonts w:ascii="Arial" w:hAnsi="Arial"/>
+                <w:b w:val="0"/>
+                <w:color w:val="1F2937"/>
+                <w:sz w:val="21"/>
+              </w:rPr>
+              <w:t>vehicles</w:t>
+            </w:r>
+          </w:p>
+        </w:tc>
+        <w:tc>
+          <w:tcPr>
+            <w:tcW w:type="dxa" w:w="3154"/>
+            <w:vAlign w:val="center"/>
+          </w:tcPr>
+          <w:p>
+            <w:pPr>
+              <w:jc w:val="left"/>
+            </w:pPr>
+            <w:r/>
+            <w:r>
+              <w:rPr>
+                <w:rFonts w:ascii="Arial" w:hAnsi="Arial"/>
+                <w:b w:val="0"/>
+                <w:color w:val="1F2937"/>
+                <w:sz w:val="21"/>
+              </w:rPr>
+              <w:t>120</w:t>
+            </w:r>
+          </w:p>
+        </w:tc>
+        <w:tc>
+          <w:tcPr>
+            <w:tcW w:type="dxa" w:w="3154"/>
+            <w:vAlign w:val="center"/>
+          </w:tcPr>
+          <w:p>
+            <w:pPr>
+              <w:jc w:val="left"/>
+            </w:pPr>
+            <w:r/>
+            <w:r>
+              <w:rPr>
+                <w:rFonts w:ascii="Arial" w:hAnsi="Arial"/>
+                <w:b w:val="0"/>
+                <w:color w:val="1F2937"/>
+                <w:sz w:val="20"/>
+              </w:rPr>
+              <w:t>Fleet health, battery state, telematics version, and maintenance status.</w:t>
+            </w:r>
+          </w:p>
+        </w:tc>
+      </w:tr>
+      <w:tr>
+        <w:tc>
+          <w:tcPr>
+            <w:tcW w:type="dxa" w:w="3154"/>
+            <w:vAlign w:val="center"/>
+          </w:tcPr>
+          <w:p>
+            <w:pPr>
+              <w:jc w:val="left"/>
+            </w:pPr>
+            <w:r/>
+            <w:r>
+              <w:rPr>
+                <w:rFonts w:ascii="Arial" w:hAnsi="Arial"/>
+                <w:b w:val="0"/>
+                <w:color w:val="1F2937"/>
+                <w:sz w:val="21"/>
+              </w:rPr>
+              <w:t>hubs</w:t>
+            </w:r>
+          </w:p>
+        </w:tc>
+        <w:tc>
+          <w:tcPr>
+            <w:tcW w:type="dxa" w:w="3154"/>
+            <w:vAlign w:val="center"/>
+          </w:tcPr>
+          <w:p>
+            <w:pPr>
+              <w:jc w:val="left"/>
+            </w:pPr>
+            <w:r/>
+            <w:r>
+              <w:rPr>
+                <w:rFonts w:ascii="Arial" w:hAnsi="Arial"/>
+                <w:b w:val="0"/>
+                <w:color w:val="1F2937"/>
+                <w:sz w:val="21"/>
+              </w:rPr>
+              <w:t>8</w:t>
+            </w:r>
+          </w:p>
+        </w:tc>
+        <w:tc>
+          <w:tcPr>
+            <w:tcW w:type="dxa" w:w="3154"/>
+            <w:vAlign w:val="center"/>
+          </w:tcPr>
+          <w:p>
+            <w:pPr>
+              <w:jc w:val="left"/>
+            </w:pPr>
+            <w:r/>
+            <w:r>
+              <w:rPr>
+                <w:rFonts w:ascii="Arial" w:hAnsi="Arial"/>
+                <w:b w:val="0"/>
+                <w:color w:val="1F2937"/>
+                <w:sz w:val="20"/>
+              </w:rPr>
+              <w:t>Hub location, capacity, and role in the operating network.</w:t>
             </w:r>
           </w:p>
         </w:tc>
       </w:tr>
     </w:tbl>
     <w:p>
-      <w:pPr>
-        <w:pStyle w:val="Heading2"/>
-      </w:pPr>
       <w:r>
-        <w:t>2.2 Cleaning and Standardisation</w:t>
-      </w:r>
-    </w:p>
-    <w:p>
-      <w:r>
-        <w:t>Before analysis, location categories were standardised across files because values such as North, NORTH, north, Central, CENTRAL, and Ctr would otherwise fragment the results. Missing values were retained where analytically useful, because absence itself was a signal in some fields such as proof-of-completion and delivery completion timestamps.</w:t>
+        <w:t>The dataset contains 1,250 orders but only 950 delivery records, which immediately suggests that the operational pipeline is incomplete even before any advanced analysis is performed. The supporting files add the context needed to understand why this matters: complaints explain customer reaction, app events capture the digital journey, and incidents record operational exceptions.</w:t>
       </w:r>
     </w:p>
     <w:p>
@@ -538,20 +1275,418 @@
         <w:pStyle w:val="Heading2"/>
       </w:pPr>
       <w:r>
-        <w:t>2.3 Analytical Workflow</w:t>
+        <w:t>2.3 Data Quality Audit</w:t>
       </w:r>
     </w:p>
+    <w:tbl>
+      <w:tblPr>
+        <w:tblStyle w:val="TableGrid"/>
+        <w:tblW w:type="auto" w:w="0"/>
+        <w:jc w:val="center"/>
+        <w:tblLook w:firstColumn="1" w:firstRow="1" w:lastColumn="0" w:lastRow="0" w:noHBand="0" w:noVBand="1" w:val="04A0"/>
+      </w:tblPr>
+      <w:tblGrid>
+        <w:gridCol w:w="3154"/>
+        <w:gridCol w:w="3154"/>
+        <w:gridCol w:w="3154"/>
+      </w:tblGrid>
+      <w:tr>
+        <w:tc>
+          <w:tcPr>
+            <w:tcW w:type="dxa" w:w="3154"/>
+            <w:vAlign w:val="center"/>
+            <w:shd w:fill="FDE68A"/>
+          </w:tcPr>
+          <w:p>
+            <w:pPr>
+              <w:jc w:val="left"/>
+            </w:pPr>
+            <w:r/>
+            <w:r>
+              <w:rPr>
+                <w:rFonts w:ascii="Arial" w:hAnsi="Arial"/>
+                <w:b/>
+                <w:color w:val="1F2937"/>
+                <w:sz w:val="21"/>
+              </w:rPr>
+              <w:t>Data Quality Issue</w:t>
+            </w:r>
+          </w:p>
+        </w:tc>
+        <w:tc>
+          <w:tcPr>
+            <w:tcW w:type="dxa" w:w="3154"/>
+            <w:vAlign w:val="center"/>
+            <w:shd w:fill="FDE68A"/>
+          </w:tcPr>
+          <w:p>
+            <w:pPr>
+              <w:jc w:val="left"/>
+            </w:pPr>
+            <w:r/>
+            <w:r>
+              <w:rPr>
+                <w:rFonts w:ascii="Arial" w:hAnsi="Arial"/>
+                <w:b/>
+                <w:color w:val="1F2937"/>
+                <w:sz w:val="21"/>
+              </w:rPr>
+              <w:t>Count</w:t>
+            </w:r>
+          </w:p>
+        </w:tc>
+        <w:tc>
+          <w:tcPr>
+            <w:tcW w:type="dxa" w:w="3154"/>
+            <w:vAlign w:val="center"/>
+            <w:shd w:fill="FDE68A"/>
+          </w:tcPr>
+          <w:p>
+            <w:pPr>
+              <w:jc w:val="left"/>
+            </w:pPr>
+            <w:r/>
+            <w:r>
+              <w:rPr>
+                <w:rFonts w:ascii="Arial" w:hAnsi="Arial"/>
+                <w:b/>
+                <w:color w:val="1F2937"/>
+                <w:sz w:val="21"/>
+              </w:rPr>
+              <w:t>Analytical Consequence</w:t>
+            </w:r>
+          </w:p>
+        </w:tc>
+      </w:tr>
+      <w:tr>
+        <w:tc>
+          <w:tcPr>
+            <w:tcW w:type="dxa" w:w="3154"/>
+            <w:vAlign w:val="center"/>
+          </w:tcPr>
+          <w:p>
+            <w:pPr>
+              <w:jc w:val="left"/>
+            </w:pPr>
+            <w:r/>
+            <w:r>
+              <w:rPr>
+                <w:rFonts w:ascii="Arial" w:hAnsi="Arial"/>
+                <w:b w:val="0"/>
+                <w:color w:val="1F2937"/>
+                <w:sz w:val="21"/>
+              </w:rPr>
+              <w:t>Missing preferred customer channel</w:t>
+            </w:r>
+          </w:p>
+        </w:tc>
+        <w:tc>
+          <w:tcPr>
+            <w:tcW w:type="dxa" w:w="3154"/>
+            <w:vAlign w:val="center"/>
+          </w:tcPr>
+          <w:p>
+            <w:pPr>
+              <w:jc w:val="left"/>
+            </w:pPr>
+            <w:r/>
+            <w:r>
+              <w:rPr>
+                <w:rFonts w:ascii="Arial" w:hAnsi="Arial"/>
+                <w:b w:val="0"/>
+                <w:color w:val="1F2937"/>
+                <w:sz w:val="21"/>
+              </w:rPr>
+              <w:t>13</w:t>
+            </w:r>
+          </w:p>
+        </w:tc>
+        <w:tc>
+          <w:tcPr>
+            <w:tcW w:type="dxa" w:w="3154"/>
+            <w:vAlign w:val="center"/>
+          </w:tcPr>
+          <w:p>
+            <w:pPr>
+              <w:jc w:val="left"/>
+            </w:pPr>
+            <w:r/>
+            <w:r>
+              <w:rPr>
+                <w:rFonts w:ascii="Arial" w:hAnsi="Arial"/>
+                <w:b w:val="0"/>
+                <w:color w:val="1F2937"/>
+                <w:sz w:val="20"/>
+              </w:rPr>
+              <w:t>Weakens customer communication and segmentation analysis.</w:t>
+            </w:r>
+          </w:p>
+        </w:tc>
+      </w:tr>
+      <w:tr>
+        <w:tc>
+          <w:tcPr>
+            <w:tcW w:type="dxa" w:w="3154"/>
+            <w:vAlign w:val="center"/>
+          </w:tcPr>
+          <w:p>
+            <w:pPr>
+              <w:jc w:val="left"/>
+            </w:pPr>
+            <w:r/>
+            <w:r>
+              <w:rPr>
+                <w:rFonts w:ascii="Arial" w:hAnsi="Arial"/>
+                <w:b w:val="0"/>
+                <w:color w:val="1F2937"/>
+                <w:sz w:val="21"/>
+              </w:rPr>
+              <w:t>Missing order booking channel</w:t>
+            </w:r>
+          </w:p>
+        </w:tc>
+        <w:tc>
+          <w:tcPr>
+            <w:tcW w:type="dxa" w:w="3154"/>
+            <w:vAlign w:val="center"/>
+          </w:tcPr>
+          <w:p>
+            <w:pPr>
+              <w:jc w:val="left"/>
+            </w:pPr>
+            <w:r/>
+            <w:r>
+              <w:rPr>
+                <w:rFonts w:ascii="Arial" w:hAnsi="Arial"/>
+                <w:b w:val="0"/>
+                <w:color w:val="1F2937"/>
+                <w:sz w:val="21"/>
+              </w:rPr>
+              <w:t>25</w:t>
+            </w:r>
+          </w:p>
+        </w:tc>
+        <w:tc>
+          <w:tcPr>
+            <w:tcW w:type="dxa" w:w="3154"/>
+            <w:vAlign w:val="center"/>
+          </w:tcPr>
+          <w:p>
+            <w:pPr>
+              <w:jc w:val="left"/>
+            </w:pPr>
+            <w:r/>
+            <w:r>
+              <w:rPr>
+                <w:rFonts w:ascii="Arial" w:hAnsi="Arial"/>
+                <w:b w:val="0"/>
+                <w:color w:val="1F2937"/>
+                <w:sz w:val="20"/>
+              </w:rPr>
+              <w:t>Reduces confidence in channel-attribution reporting.</w:t>
+            </w:r>
+          </w:p>
+        </w:tc>
+      </w:tr>
+      <w:tr>
+        <w:tc>
+          <w:tcPr>
+            <w:tcW w:type="dxa" w:w="3154"/>
+            <w:vAlign w:val="center"/>
+          </w:tcPr>
+          <w:p>
+            <w:pPr>
+              <w:jc w:val="left"/>
+            </w:pPr>
+            <w:r/>
+            <w:r>
+              <w:rPr>
+                <w:rFonts w:ascii="Arial" w:hAnsi="Arial"/>
+                <w:b w:val="0"/>
+                <w:color w:val="1F2937"/>
+                <w:sz w:val="21"/>
+              </w:rPr>
+              <w:t>Missing delivery completion timestamp</w:t>
+            </w:r>
+          </w:p>
+        </w:tc>
+        <w:tc>
+          <w:tcPr>
+            <w:tcW w:type="dxa" w:w="3154"/>
+            <w:vAlign w:val="center"/>
+          </w:tcPr>
+          <w:p>
+            <w:pPr>
+              <w:jc w:val="left"/>
+            </w:pPr>
+            <w:r/>
+            <w:r>
+              <w:rPr>
+                <w:rFonts w:ascii="Arial" w:hAnsi="Arial"/>
+                <w:b w:val="0"/>
+                <w:color w:val="1F2937"/>
+                <w:sz w:val="21"/>
+              </w:rPr>
+              <w:t>19</w:t>
+            </w:r>
+          </w:p>
+        </w:tc>
+        <w:tc>
+          <w:tcPr>
+            <w:tcW w:type="dxa" w:w="3154"/>
+            <w:vAlign w:val="center"/>
+          </w:tcPr>
+          <w:p>
+            <w:pPr>
+              <w:jc w:val="left"/>
+            </w:pPr>
+            <w:r/>
+            <w:r>
+              <w:rPr>
+                <w:rFonts w:ascii="Arial" w:hAnsi="Arial"/>
+                <w:b w:val="0"/>
+                <w:color w:val="1F2937"/>
+                <w:sz w:val="20"/>
+              </w:rPr>
+              <w:t>Prevents accurate cycle-time measurement for part of the network.</w:t>
+            </w:r>
+          </w:p>
+        </w:tc>
+      </w:tr>
+      <w:tr>
+        <w:tc>
+          <w:tcPr>
+            <w:tcW w:type="dxa" w:w="3154"/>
+            <w:vAlign w:val="center"/>
+          </w:tcPr>
+          <w:p>
+            <w:pPr>
+              <w:jc w:val="left"/>
+            </w:pPr>
+            <w:r/>
+            <w:r>
+              <w:rPr>
+                <w:rFonts w:ascii="Arial" w:hAnsi="Arial"/>
+                <w:b w:val="0"/>
+                <w:color w:val="1F2937"/>
+                <w:sz w:val="21"/>
+              </w:rPr>
+              <w:t>Missing post-delivery rating</w:t>
+            </w:r>
+          </w:p>
+        </w:tc>
+        <w:tc>
+          <w:tcPr>
+            <w:tcW w:type="dxa" w:w="3154"/>
+            <w:vAlign w:val="center"/>
+          </w:tcPr>
+          <w:p>
+            <w:pPr>
+              <w:jc w:val="left"/>
+            </w:pPr>
+            <w:r/>
+            <w:r>
+              <w:rPr>
+                <w:rFonts w:ascii="Arial" w:hAnsi="Arial"/>
+                <w:b w:val="0"/>
+                <w:color w:val="1F2937"/>
+                <w:sz w:val="21"/>
+              </w:rPr>
+              <w:t>14</w:t>
+            </w:r>
+          </w:p>
+        </w:tc>
+        <w:tc>
+          <w:tcPr>
+            <w:tcW w:type="dxa" w:w="3154"/>
+            <w:vAlign w:val="center"/>
+          </w:tcPr>
+          <w:p>
+            <w:pPr>
+              <w:jc w:val="left"/>
+            </w:pPr>
+            <w:r/>
+            <w:r>
+              <w:rPr>
+                <w:rFonts w:ascii="Arial" w:hAnsi="Arial"/>
+                <w:b w:val="0"/>
+                <w:color w:val="1F2937"/>
+                <w:sz w:val="20"/>
+              </w:rPr>
+              <w:t>Removes part of the customer-experience feedback loop.</w:t>
+            </w:r>
+          </w:p>
+        </w:tc>
+      </w:tr>
+      <w:tr>
+        <w:tc>
+          <w:tcPr>
+            <w:tcW w:type="dxa" w:w="3154"/>
+            <w:vAlign w:val="center"/>
+          </w:tcPr>
+          <w:p>
+            <w:pPr>
+              <w:jc w:val="left"/>
+            </w:pPr>
+            <w:r/>
+            <w:r>
+              <w:rPr>
+                <w:rFonts w:ascii="Arial" w:hAnsi="Arial"/>
+                <w:b w:val="0"/>
+                <w:color w:val="1F2937"/>
+                <w:sz w:val="21"/>
+              </w:rPr>
+              <w:t>Orders without a delivery record</w:t>
+            </w:r>
+          </w:p>
+        </w:tc>
+        <w:tc>
+          <w:tcPr>
+            <w:tcW w:type="dxa" w:w="3154"/>
+            <w:vAlign w:val="center"/>
+          </w:tcPr>
+          <w:p>
+            <w:pPr>
+              <w:jc w:val="left"/>
+            </w:pPr>
+            <w:r/>
+            <w:r>
+              <w:rPr>
+                <w:rFonts w:ascii="Arial" w:hAnsi="Arial"/>
+                <w:b w:val="0"/>
+                <w:color w:val="1F2937"/>
+                <w:sz w:val="21"/>
+              </w:rPr>
+              <w:t>300</w:t>
+            </w:r>
+          </w:p>
+        </w:tc>
+        <w:tc>
+          <w:tcPr>
+            <w:tcW w:type="dxa" w:w="3154"/>
+            <w:vAlign w:val="center"/>
+          </w:tcPr>
+          <w:p>
+            <w:pPr>
+              <w:jc w:val="left"/>
+            </w:pPr>
+            <w:r/>
+            <w:r>
+              <w:rPr>
+                <w:rFonts w:ascii="Arial" w:hAnsi="Arial"/>
+                <w:b w:val="0"/>
+                <w:color w:val="1F2937"/>
+                <w:sz w:val="20"/>
+              </w:rPr>
+              <w:t>Represents the most serious visibility failure in the dataset.</w:t>
+            </w:r>
+          </w:p>
+        </w:tc>
+      </w:tr>
+    </w:tbl>
     <w:p>
       <w:r>
-        <w:t>The workflow followed four stages. First, relational files were joined and grouped using SQL in an R-style environment. Second, customer and service patterns were interpreted using analytics summaries. Third, Python was used to engineer new features including completion hours, cleaned zones, profitability proxies, and grouped route-override bands. Finally, the semi-structured problem domain was remodelled into a document-oriented MongoDB design.</w:t>
-      </w:r>
-    </w:p>
-    <w:p>
-      <w:pPr>
-        <w:pStyle w:val="Heading1"/>
-      </w:pPr>
-      <w:r>
-        <w:t>Chapter 3: SQL in R and Relational Findings</w:t>
+        <w:t>The missing-data profile is analytically important because absence is not random. For example, missing proof-of-completion is strongly associated with poor outcomes, while missing delivery completion timestamps restrict accurate cycle-time analysis. The largest defect is the 300 orders with no delivery record, because this breaks traceability between commercial demand and operational execution.</w:t>
       </w:r>
     </w:p>
     <w:p>
@@ -559,52 +1694,12 @@
         <w:pStyle w:val="Heading2"/>
       </w:pPr>
       <w:r>
-        <w:t>3.1 Relational Querying Strategy</w:t>
+        <w:t>2.4 Cleaning and Integration Method</w:t>
       </w:r>
     </w:p>
     <w:p>
       <w:r>
-        <w:t>The SQL component focused on operational reliability, missing order-to-delivery links, and hub performance. This was appropriate because the core operational records remain highly structured and lend themselves to grouped queries, joins, and filters.</w:t>
-      </w:r>
-    </w:p>
-    <w:p>
-      <w:pPr>
-        <w:pStyle w:val="Heading2"/>
-      </w:pPr>
-      <w:r>
-        <w:t>3.2 Key Findings</w:t>
-      </w:r>
-    </w:p>
-    <w:p>
-      <w:pPr>
-        <w:pStyle w:val="ListBullet"/>
-      </w:pPr>
-      <w:r>
-        <w:t>300 of 1,250 orders had no delivery record, indicating a major process break between order intake and dispatch visibility.</w:t>
-      </w:r>
-    </w:p>
-    <w:p>
-      <w:pPr>
-        <w:pStyle w:val="ListBullet"/>
-      </w:pPr>
-      <w:r>
-        <w:t>Central Core had the highest non-on-time delivery share at 41.7%, while East Dock performed best at 28.6%.</w:t>
-      </w:r>
-    </w:p>
-    <w:p>
-      <w:pPr>
-        <w:pStyle w:val="ListBullet"/>
-      </w:pPr>
-      <w:r>
-        <w:t>The Central zone had only 60.5% on-time delivery and 20.2% failed delivery, making it the weakest area in the network.</w:t>
-      </w:r>
-    </w:p>
-    <w:p>
-      <w:pPr>
-        <w:pStyle w:val="ListBullet"/>
-      </w:pPr>
-      <w:r>
-        <w:t>Missing orders were spread across service types rather than concentrated in only one operational category.</w:t>
+        <w:t>The first preprocessing step was standardisation of location labels. Without that step, values such as Central, CENTRAL, and Ctr would be treated as separate categories, producing misleading zone-level summaries. The second step was cross-file integration so that delivery status could be read together with order value, hub identity, compensation, vehicle condition, and app-event context. The third step was feature engineering, including completion hours, net value after compensation, route-override bands, and proof-of-completion flags.</w:t>
       </w:r>
     </w:p>
     <w:p>
@@ -614,7 +1709,7 @@
       <w:r>
         <w:drawing>
           <wp:inline xmlns:a="http://schemas.openxmlformats.org/drawingml/2006/main" xmlns:pic="http://schemas.openxmlformats.org/drawingml/2006/picture">
-            <wp:extent cx="5669280" cy="4251960"/>
+            <wp:extent cx="5806440" cy="3135478"/>
             <wp:docPr id="1" name="Picture 1"/>
             <wp:cNvGraphicFramePr>
               <a:graphicFrameLocks noChangeAspect="1"/>
@@ -623,7 +1718,7 @@
               <a:graphicData uri="http://schemas.openxmlformats.org/drawingml/2006/picture">
                 <pic:pic>
                   <pic:nvPicPr>
-                    <pic:cNvPr id="0" name="hub_non_ontime_risk.png"/>
+                    <pic:cNvPr id="0" name="python_merged_preview.png"/>
                     <pic:cNvPicPr/>
                   </pic:nvPicPr>
                   <pic:blipFill>
@@ -635,7 +1730,7 @@
                   <pic:spPr>
                     <a:xfrm>
                       <a:off x="0" y="0"/>
-                      <a:ext cx="5669280" cy="4251960"/>
+                      <a:ext cx="5806440" cy="3135478"/>
                     </a:xfrm>
                     <a:prstGeom prst="rect"/>
                   </pic:spPr>
@@ -657,7 +1752,46 @@
           <w:color w:val="5F6368"/>
           <w:sz w:val="18"/>
         </w:rPr>
-        <w:t>Figure 1. Hub-level reliability risk based on delayed or failed deliveries.</w:t>
+        <w:t>Figure 1. Python merged dataset preview used to bring delivery, order, and hub information into one analytical frame.</w:t>
+      </w:r>
+    </w:p>
+    <w:p>
+      <w:r>
+        <w:t>Figure 1 shows the integrated working dataset that underpins the later analysis. This step is methodologically important because it changes the problem from a simple file-by-file review into a joined operational dataset in which business performance can be traced end to end.</w:t>
+      </w:r>
+    </w:p>
+    <w:p>
+      <w:r>
+        <w:br w:type="page"/>
+      </w:r>
+    </w:p>
+    <w:p>
+      <w:pPr>
+        <w:pStyle w:val="Heading1"/>
+      </w:pPr>
+      <w:r>
+        <w:t>Chapter 3: SQL in R Analysis and Relational Findings</w:t>
+      </w:r>
+    </w:p>
+    <w:p>
+      <w:pPr>
+        <w:pStyle w:val="Heading2"/>
+      </w:pPr>
+      <w:r>
+        <w:t>3.1 Why SQL in R Was Appropriate</w:t>
+      </w:r>
+    </w:p>
+    <w:p>
+      <w:r>
+        <w:t>The first analytical layer uses SQL in an R-oriented environment because the core operational records are structured and benefit from joins, filters, groupings, and direct quantitative summaries. This method is especially suitable for the module requirement because it demonstrates that SQL can be embedded within a wider analytical workflow rather than treated as a standalone querying exercise.</w:t>
+      </w:r>
+    </w:p>
+    <w:p>
+      <w:pPr>
+        <w:pStyle w:val="Heading2"/>
+      </w:pPr>
+      <w:r>
+        <w:t>3.2 Hub Reliability Risk</w:t>
       </w:r>
     </w:p>
     <w:p>
@@ -667,7 +1801,7 @@
       <w:r>
         <w:drawing>
           <wp:inline xmlns:a="http://schemas.openxmlformats.org/drawingml/2006/main" xmlns:pic="http://schemas.openxmlformats.org/drawingml/2006/picture">
-            <wp:extent cx="5669280" cy="4251960"/>
+            <wp:extent cx="5897880" cy="4128516"/>
             <wp:docPr id="2" name="Picture 2"/>
             <wp:cNvGraphicFramePr>
               <a:graphicFrameLocks noChangeAspect="1"/>
@@ -676,7 +1810,7 @@
               <a:graphicData uri="http://schemas.openxmlformats.org/drawingml/2006/picture">
                 <pic:pic>
                   <pic:nvPicPr>
-                    <pic:cNvPr id="0" name="orders_without_delivery_by_service.png"/>
+                    <pic:cNvPr id="0" name="sql_hub_risk_query.png"/>
                     <pic:cNvPicPr/>
                   </pic:nvPicPr>
                   <pic:blipFill>
@@ -688,7 +1822,7 @@
                   <pic:spPr>
                     <a:xfrm>
                       <a:off x="0" y="0"/>
-                      <a:ext cx="5669280" cy="4251960"/>
+                      <a:ext cx="5897880" cy="4128516"/>
                     </a:xfrm>
                     <a:prstGeom prst="rect"/>
                   </pic:spPr>
@@ -710,7 +1844,25 @@
           <w:color w:val="5F6368"/>
           <w:sz w:val="18"/>
         </w:rPr>
-        <w:t>Figure 2. Orders with no linked delivery record by service type.</w:t>
+        <w:t>Figure 2. SQL query result ranking hubs by non-on-time delivery share, failed-delivery share, route overrides, and completion hours.</w:t>
+      </w:r>
+    </w:p>
+    <w:p>
+      <w:r>
+        <w:t>Figure 2 shows that Central Core has the worst overall reliability profile, with 41.7% of its deliveries arriving either delayed or failed, while Midtown Relay also performs poorly with a 37.5% non-on-time rate. The importance of this result is not only that some hubs perform badly, but that the weakest hubs are clustered in the central operating layer. This suggests a structural capacity or coordination problem rather than random noise.</w:t>
+      </w:r>
+    </w:p>
+    <w:p>
+      <w:r>
+        <w:t>The same query also shows that poor reliability is linked with longer completion hours and elevated route overrides, which indicates operational friction in the dispatch or routing process. East Dock is the most stable hub in the table, providing a useful internal benchmark for what more controlled performance looks like.</w:t>
+      </w:r>
+    </w:p>
+    <w:p>
+      <w:pPr>
+        <w:pStyle w:val="Heading2"/>
+      </w:pPr>
+      <w:r>
+        <w:t>3.3 Orders Missing a Delivery Record</w:t>
       </w:r>
     </w:p>
     <w:p>
@@ -720,7 +1872,7 @@
       <w:r>
         <w:drawing>
           <wp:inline xmlns:a="http://schemas.openxmlformats.org/drawingml/2006/main" xmlns:pic="http://schemas.openxmlformats.org/drawingml/2006/picture">
-            <wp:extent cx="5486400" cy="6667500"/>
+            <wp:extent cx="5806440" cy="3452896"/>
             <wp:docPr id="3" name="Picture 3"/>
             <wp:cNvGraphicFramePr>
               <a:graphicFrameLocks noChangeAspect="1"/>
@@ -729,7 +1881,7 @@
               <a:graphicData uri="http://schemas.openxmlformats.org/drawingml/2006/picture">
                 <pic:pic>
                   <pic:nvPicPr>
-                    <pic:cNvPr id="0" name="sql_r_notebook_crop.png"/>
+                    <pic:cNvPr id="0" name="sql_missing_orders_query.png"/>
                     <pic:cNvPicPr/>
                   </pic:nvPicPr>
                   <pic:blipFill>
@@ -741,7 +1893,7 @@
                   <pic:spPr>
                     <a:xfrm>
                       <a:off x="0" y="0"/>
-                      <a:ext cx="5486400" cy="6667500"/>
+                      <a:ext cx="5806440" cy="3452896"/>
                     </a:xfrm>
                     <a:prstGeom prst="rect"/>
                   </pic:spPr>
@@ -763,15 +1915,12 @@
           <w:color w:val="5F6368"/>
           <w:sz w:val="18"/>
         </w:rPr>
-        <w:t>Figure 3. Executed SQL in R notebook showing grouped hub-risk and missing-order outputs.</w:t>
+        <w:t>Figure 3. SQL query result for orders that do not have a linked delivery record, broken down by service type.</w:t>
       </w:r>
     </w:p>
     <w:p>
-      <w:pPr>
-        <w:pStyle w:val="Heading1"/>
-      </w:pPr>
       <w:r>
-        <w:t>Chapter 4: Analytics, Python Processing, and Interpretation</w:t>
+        <w:t>Figure 3 confirms that the visibility problem is not confined to one narrow service category. Passenger, Parcel, and Retail services all contribute heavily to the missing-order gap, with 79, 78, and 73 missing records respectively. This matters because it changes the management response. If the issue were concentrated in one service type, the business could investigate one specialist workflow. Instead, the evidence suggests a broader system integration failure.</w:t>
       </w:r>
     </w:p>
     <w:p>
@@ -779,177 +1928,7 @@
         <w:pStyle w:val="Heading2"/>
       </w:pPr>
       <w:r>
-        <w:t>4.1 Customer Experience and Complaint Patterns</w:t>
-      </w:r>
-    </w:p>
-    <w:p>
-      <w:r>
-        <w:t>Customer dissatisfaction is not explained by failed deliveries alone. Delay, AppIssue, DriverBehaviour, and MissedPickup complaints all appear against records that were operationally marked OnTime. This supports the case study's claim that NorthStar's systems record service closure differently from how customers experience the service.</w:t>
-      </w:r>
-    </w:p>
-    <w:p>
-      <w:pPr>
-        <w:pStyle w:val="Heading2"/>
-      </w:pPr>
-      <w:r>
-        <w:t>4.2 Feature Engineering and Risk Signals</w:t>
-      </w:r>
-    </w:p>
-    <w:p>
-      <w:r>
-        <w:t>Python was used to engineer cleaned zones, completion hours, route-override bands, joined complaint totals, and a direct profitability proxy calculated from order value, direct delivery cost, and compensation amounts. These features exposed much stronger patterns than the raw files alone.</w:t>
-      </w:r>
-    </w:p>
-    <w:tbl>
-      <w:tblPr>
-        <w:tblStyle w:val="TableGrid"/>
-        <w:tblW w:type="auto" w:w="0"/>
-        <w:tblLook w:firstColumn="1" w:firstRow="1" w:lastColumn="0" w:lastRow="0" w:noHBand="0" w:noVBand="1" w:val="04A0"/>
-      </w:tblPr>
-      <w:tblGrid>
-        <w:gridCol w:w="2329"/>
-        <w:gridCol w:w="2329"/>
-        <w:gridCol w:w="2329"/>
-        <w:gridCol w:w="2329"/>
-      </w:tblGrid>
-      <w:tr>
-        <w:tc>
-          <w:tcPr>
-            <w:tcW w:type="dxa" w:w="2329"/>
-          </w:tcPr>
-          <w:p>
-            <w:r>
-              <w:t>Condition</w:t>
-            </w:r>
-          </w:p>
-        </w:tc>
-        <w:tc>
-          <w:tcPr>
-            <w:tcW w:type="dxa" w:w="2329"/>
-          </w:tcPr>
-          <w:p>
-            <w:r>
-              <w:t>Delayed %</w:t>
-            </w:r>
-          </w:p>
-        </w:tc>
-        <w:tc>
-          <w:tcPr>
-            <w:tcW w:type="dxa" w:w="2329"/>
-          </w:tcPr>
-          <w:p>
-            <w:r>
-              <w:t>Failed %</w:t>
-            </w:r>
-          </w:p>
-        </w:tc>
-        <w:tc>
-          <w:tcPr>
-            <w:tcW w:type="dxa" w:w="2329"/>
-          </w:tcPr>
-          <w:p>
-            <w:r>
-              <w:t>Average rating</w:t>
-            </w:r>
-          </w:p>
-        </w:tc>
-      </w:tr>
-      <w:tr>
-        <w:tc>
-          <w:tcPr>
-            <w:tcW w:type="dxa" w:w="2329"/>
-          </w:tcPr>
-          <w:p>
-            <w:r>
-              <w:t>Proof present</w:t>
-            </w:r>
-          </w:p>
-        </w:tc>
-        <w:tc>
-          <w:tcPr>
-            <w:tcW w:type="dxa" w:w="2329"/>
-          </w:tcPr>
-          <w:p>
-            <w:r>
-              <w:t>17.8</w:t>
-            </w:r>
-          </w:p>
-        </w:tc>
-        <w:tc>
-          <w:tcPr>
-            <w:tcW w:type="dxa" w:w="2329"/>
-          </w:tcPr>
-          <w:p>
-            <w:r>
-              <w:t>12.3</w:t>
-            </w:r>
-          </w:p>
-        </w:tc>
-        <w:tc>
-          <w:tcPr>
-            <w:tcW w:type="dxa" w:w="2329"/>
-          </w:tcPr>
-          <w:p>
-            <w:r>
-              <w:t>3.92</w:t>
-            </w:r>
-          </w:p>
-        </w:tc>
-      </w:tr>
-      <w:tr>
-        <w:tc>
-          <w:tcPr>
-            <w:tcW w:type="dxa" w:w="2329"/>
-          </w:tcPr>
-          <w:p>
-            <w:r>
-              <w:t>Proof missing</w:t>
-            </w:r>
-          </w:p>
-        </w:tc>
-        <w:tc>
-          <w:tcPr>
-            <w:tcW w:type="dxa" w:w="2329"/>
-          </w:tcPr>
-          <w:p>
-            <w:r>
-              <w:t>65.2</w:t>
-            </w:r>
-          </w:p>
-        </w:tc>
-        <w:tc>
-          <w:tcPr>
-            <w:tcW w:type="dxa" w:w="2329"/>
-          </w:tcPr>
-          <w:p>
-            <w:r>
-              <w:t>34.8</w:t>
-            </w:r>
-          </w:p>
-        </w:tc>
-        <w:tc>
-          <w:tcPr>
-            <w:tcW w:type="dxa" w:w="2329"/>
-          </w:tcPr>
-          <w:p>
-            <w:r>
-              <w:t>3.17</w:t>
-            </w:r>
-          </w:p>
-        </w:tc>
-      </w:tr>
-    </w:tbl>
-    <w:p>
-      <w:pPr>
-        <w:pStyle w:val="Heading2"/>
-      </w:pPr>
-      <w:r>
-        <w:t>4.3 Asset and Maintenance Evidence</w:t>
-      </w:r>
-    </w:p>
-    <w:p>
-      <w:r>
-        <w:t>Vehicles marked InRepair performed substantially worse than Active or Scheduled vehicles. This strongly suggests that NorthStar's maintenance state is not being incorporated into dispatch control as effectively as it should be.</w:t>
+        <w:t>3.4 Zone Performance After Cleaning Inconsistent Labels</w:t>
       </w:r>
     </w:p>
     <w:p>
@@ -959,7 +1938,7 @@
       <w:r>
         <w:drawing>
           <wp:inline xmlns:a="http://schemas.openxmlformats.org/drawingml/2006/main" xmlns:pic="http://schemas.openxmlformats.org/drawingml/2006/picture">
-            <wp:extent cx="5486400" cy="4114800"/>
+            <wp:extent cx="5806440" cy="3421929"/>
             <wp:docPr id="4" name="Picture 4"/>
             <wp:cNvGraphicFramePr>
               <a:graphicFrameLocks noChangeAspect="1"/>
@@ -968,7 +1947,7 @@
               <a:graphicData uri="http://schemas.openxmlformats.org/drawingml/2006/picture">
                 <pic:pic>
                   <pic:nvPicPr>
-                    <pic:cNvPr id="0" name="maintenance_failed_rate.png"/>
+                    <pic:cNvPr id="0" name="sql_zone_performance_table.png"/>
                     <pic:cNvPicPr/>
                   </pic:nvPicPr>
                   <pic:blipFill>
@@ -980,7 +1959,7 @@
                   <pic:spPr>
                     <a:xfrm>
                       <a:off x="0" y="0"/>
-                      <a:ext cx="5486400" cy="4114800"/>
+                      <a:ext cx="5806440" cy="3421929"/>
                     </a:xfrm>
                     <a:prstGeom prst="rect"/>
                   </pic:spPr>
@@ -1002,7 +1981,7 @@
           <w:color w:val="5F6368"/>
           <w:sz w:val="18"/>
         </w:rPr>
-        <w:t>Figure 4. Delivery failure rate by maintenance status.</w:t>
+        <w:t>Figure 4. Zone-level performance table after cleaning inconsistent location labels across source files.</w:t>
       </w:r>
     </w:p>
     <w:p>
@@ -1012,7 +1991,7 @@
       <w:r>
         <w:drawing>
           <wp:inline xmlns:a="http://schemas.openxmlformats.org/drawingml/2006/main" xmlns:pic="http://schemas.openxmlformats.org/drawingml/2006/picture">
-            <wp:extent cx="5486400" cy="6858000"/>
+            <wp:extent cx="5577840" cy="3612315"/>
             <wp:docPr id="5" name="Picture 5"/>
             <wp:cNvGraphicFramePr>
               <a:graphicFrameLocks noChangeAspect="1"/>
@@ -1021,7 +2000,7 @@
               <a:graphicData uri="http://schemas.openxmlformats.org/drawingml/2006/picture">
                 <pic:pic>
                   <pic:nvPicPr>
-                    <pic:cNvPr id="0" name="python_mongo_notebook_crop.png"/>
+                    <pic:cNvPr id="0" name="sql_zone_failed_chart.png"/>
                     <pic:cNvPicPr/>
                   </pic:nvPicPr>
                   <pic:blipFill>
@@ -1033,7 +2012,7 @@
                   <pic:spPr>
                     <a:xfrm>
                       <a:off x="0" y="0"/>
-                      <a:ext cx="5486400" cy="6858000"/>
+                      <a:ext cx="5577840" cy="3612315"/>
                     </a:xfrm>
                     <a:prstGeom prst="rect"/>
                   </pic:spPr>
@@ -1055,7 +2034,88 @@
           <w:color w:val="5F6368"/>
           <w:sz w:val="18"/>
         </w:rPr>
-        <w:t>Figure 5. Executed Python notebook showing analytical feature engineering and MongoDB-oriented workflow.</w:t>
+        <w:t>Figure 5. Failed delivery share by operating zone, showing Central as the weakest service layer.</w:t>
+      </w:r>
+    </w:p>
+    <w:p>
+      <w:r>
+        <w:t>Once inconsistent zone labels were standardised, the Central zone emerged as the weakest performing area in the network. It records only 60.5% on-time delivery and 20.2% failed delivery, which is materially worse than East, North, or South. This demonstrates the value of cleaning before interpretation: without standardisation, the Central pattern would be diluted across multiple labels and the most important finding in the network would be understated.</w:t>
+      </w:r>
+    </w:p>
+    <w:p>
+      <w:pPr>
+        <w:pStyle w:val="Heading2"/>
+      </w:pPr>
+      <w:r>
+        <w:t>3.5 Customer Dissatisfaction Is Not Explained by Failure Alone</w:t>
+      </w:r>
+    </w:p>
+    <w:p>
+      <w:pPr>
+        <w:jc w:val="center"/>
+      </w:pPr>
+      <w:r>
+        <w:drawing>
+          <wp:inline xmlns:a="http://schemas.openxmlformats.org/drawingml/2006/main" xmlns:pic="http://schemas.openxmlformats.org/drawingml/2006/picture">
+            <wp:extent cx="5715000" cy="3701143"/>
+            <wp:docPr id="6" name="Picture 6"/>
+            <wp:cNvGraphicFramePr>
+              <a:graphicFrameLocks noChangeAspect="1"/>
+            </wp:cNvGraphicFramePr>
+            <a:graphic>
+              <a:graphicData uri="http://schemas.openxmlformats.org/drawingml/2006/picture">
+                <pic:pic>
+                  <pic:nvPicPr>
+                    <pic:cNvPr id="0" name="sql_complaint_mix_chart.png"/>
+                    <pic:cNvPicPr/>
+                  </pic:nvPicPr>
+                  <pic:blipFill>
+                    <a:blip r:embed="rId15"/>
+                    <a:stretch>
+                      <a:fillRect/>
+                    </a:stretch>
+                  </pic:blipFill>
+                  <pic:spPr>
+                    <a:xfrm>
+                      <a:off x="0" y="0"/>
+                      <a:ext cx="5715000" cy="3701143"/>
+                    </a:xfrm>
+                    <a:prstGeom prst="rect"/>
+                  </pic:spPr>
+                </pic:pic>
+              </a:graphicData>
+            </a:graphic>
+          </wp:inline>
+        </w:drawing>
+      </w:r>
+    </w:p>
+    <w:p>
+      <w:pPr>
+        <w:jc w:val="center"/>
+      </w:pPr>
+      <w:r>
+        <w:rPr>
+          <w:rFonts w:ascii="Arial" w:hAnsi="Arial"/>
+          <w:i/>
+          <w:color w:val="5F6368"/>
+          <w:sz w:val="18"/>
+        </w:rPr>
+        <w:t>Figure 6. Complaint mix by delivery status, showing that dissatisfaction also appears against orders marked OnTime.</w:t>
+      </w:r>
+    </w:p>
+    <w:p>
+      <w:r>
+        <w:t>Figure 6 is a particularly important relational insight because it shows that the customer-experience problem is wider than simple failed deliveries. Delay complaints are common even on deliveries recorded as OnTime, and AppIssue, DriverBehaviour, and MissedPickup complaints also appear in that category. This suggests that NorthStar's internal service-closure logic does not fully match the customer's lived experience.</w:t>
+      </w:r>
+    </w:p>
+    <w:p>
+      <w:r>
+        <w:t>Taken together, the SQL in R analysis demonstrates that the structured relational layer is already capable of exposing serious operational weaknesses when used carefully. It also provides a strong foundation for the later Python and MongoDB stages, because those stages are responding to real patterns rather than inventing a redesign without evidence.</w:t>
+      </w:r>
+    </w:p>
+    <w:p>
+      <w:r>
+        <w:br w:type="page"/>
       </w:r>
     </w:p>
     <w:p>
@@ -1063,7 +2123,7 @@
         <w:pStyle w:val="Heading1"/>
       </w:pPr>
       <w:r>
-        <w:t>Chapter 5: MongoDB Design and Query Optimisation</w:t>
+        <w:t>Chapter 4: Python Analytics, Feature Engineering, and Interpretation</w:t>
       </w:r>
     </w:p>
     <w:p>
@@ -1071,12 +2131,12 @@
         <w:pStyle w:val="Heading2"/>
       </w:pPr>
       <w:r>
-        <w:t>5.1 MongoDB Design Rationale</w:t>
+        <w:t>4.1 Why Python Was Added to the Workflow</w:t>
       </w:r>
     </w:p>
     <w:p>
       <w:r>
-        <w:t>NorthStar's app events, complaint histories, exception records, and evolving case timelines are not well suited to a rigid relational design. A document model is more appropriate where related nested histories need to stay together and where records evolve over time.</w:t>
+        <w:t>Python was used after the SQL stage because several of the most useful features in the NorthStar dataset are engineered rather than directly stored. Python is well suited to this stage because it allows flexible joining, cleaning, conditional logic, and rapid creation of interpretable summary frames. This extends the analytical value of the dataset beyond simple grouped counts.</w:t>
       </w:r>
     </w:p>
     <w:p>
@@ -1084,39 +2144,65 @@
         <w:pStyle w:val="Heading2"/>
       </w:pPr>
       <w:r>
-        <w:t>5.2 Proposed Collections</w:t>
+        <w:t>4.2 Proof of Completion as a Risk Signal</w:t>
       </w:r>
     </w:p>
     <w:p>
       <w:pPr>
-        <w:pStyle w:val="ListBullet"/>
+        <w:jc w:val="center"/>
       </w:pPr>
       <w:r>
-        <w:t>customer_cases for customer, order, complaint, app-event, and incident history in one operational document.</w:t>
+        <w:drawing>
+          <wp:inline xmlns:a="http://schemas.openxmlformats.org/drawingml/2006/main" xmlns:pic="http://schemas.openxmlformats.org/drawingml/2006/picture">
+            <wp:extent cx="5715000" cy="2263140"/>
+            <wp:docPr id="7" name="Picture 7"/>
+            <wp:cNvGraphicFramePr>
+              <a:graphicFrameLocks noChangeAspect="1"/>
+            </wp:cNvGraphicFramePr>
+            <a:graphic>
+              <a:graphicData uri="http://schemas.openxmlformats.org/drawingml/2006/picture">
+                <pic:pic>
+                  <pic:nvPicPr>
+                    <pic:cNvPr id="0" name="python_proof_risk_table.png"/>
+                    <pic:cNvPicPr/>
+                  </pic:nvPicPr>
+                  <pic:blipFill>
+                    <a:blip r:embed="rId16"/>
+                    <a:stretch>
+                      <a:fillRect/>
+                    </a:stretch>
+                  </pic:blipFill>
+                  <pic:spPr>
+                    <a:xfrm>
+                      <a:off x="0" y="0"/>
+                      <a:ext cx="5715000" cy="2263140"/>
+                    </a:xfrm>
+                    <a:prstGeom prst="rect"/>
+                  </pic:spPr>
+                </pic:pic>
+              </a:graphicData>
+            </a:graphic>
+          </wp:inline>
+        </w:drawing>
       </w:r>
     </w:p>
     <w:p>
       <w:pPr>
-        <w:pStyle w:val="ListBullet"/>
+        <w:jc w:val="center"/>
       </w:pPr>
       <w:r>
-        <w:t>service_orders for order-level structured detail and lightweight dispatch references.</w:t>
+        <w:rPr>
+          <w:rFonts w:ascii="Arial" w:hAnsi="Arial"/>
+          <w:i/>
+          <w:color w:val="5F6368"/>
+          <w:sz w:val="18"/>
+        </w:rPr>
+        <w:t>Figure 7. Proof-of-completion risk comparison showing sharply worse outcomes when proof is missing.</w:t>
       </w:r>
     </w:p>
     <w:p>
-      <w:pPr>
-        <w:pStyle w:val="ListBullet"/>
-      </w:pPr>
       <w:r>
-        <w:t>delivery_events for delivery timelines, route overrides, proof records, and incident snapshots.</w:t>
-      </w:r>
-    </w:p>
-    <w:p>
-      <w:pPr>
-        <w:pStyle w:val="ListBullet"/>
-      </w:pPr>
-      <w:r>
-        <w:t>asset_health for vehicle state, maintenance history, and recent linked delivery activity.</w:t>
+        <w:t>Figure 7 is one of the strongest findings in the whole report. Deliveries with proof of completion missing show a 65.2% delayed rate and a 34.8% failed rate, compared with 17.8% and 12.3% when proof is present. The average customer rating also falls from 3.92 to 3.17. This means proof of completion is not simply an administrative afterthought. In this dataset it behaves like an operational risk flag and should be treated as such.</w:t>
       </w:r>
     </w:p>
     <w:p>
@@ -1124,37 +2210,380 @@
         <w:pStyle w:val="Heading2"/>
       </w:pPr>
       <w:r>
-        <w:t>5.3 Indexing Strategy</w:t>
+        <w:t>4.3 Maintenance State and Fleet-Control Weakness</w:t>
+      </w:r>
+    </w:p>
+    <w:p>
+      <w:pPr>
+        <w:jc w:val="center"/>
+      </w:pPr>
+      <w:r>
+        <w:drawing>
+          <wp:inline xmlns:a="http://schemas.openxmlformats.org/drawingml/2006/main" xmlns:pic="http://schemas.openxmlformats.org/drawingml/2006/picture">
+            <wp:extent cx="5715000" cy="2438400"/>
+            <wp:docPr id="8" name="Picture 8"/>
+            <wp:cNvGraphicFramePr>
+              <a:graphicFrameLocks noChangeAspect="1"/>
+            </wp:cNvGraphicFramePr>
+            <a:graphic>
+              <a:graphicData uri="http://schemas.openxmlformats.org/drawingml/2006/picture">
+                <pic:pic>
+                  <pic:nvPicPr>
+                    <pic:cNvPr id="0" name="python_maintenance_table.png"/>
+                    <pic:cNvPicPr/>
+                  </pic:nvPicPr>
+                  <pic:blipFill>
+                    <a:blip r:embed="rId17"/>
+                    <a:stretch>
+                      <a:fillRect/>
+                    </a:stretch>
+                  </pic:blipFill>
+                  <pic:spPr>
+                    <a:xfrm>
+                      <a:off x="0" y="0"/>
+                      <a:ext cx="5715000" cy="2438400"/>
+                    </a:xfrm>
+                    <a:prstGeom prst="rect"/>
+                  </pic:spPr>
+                </pic:pic>
+              </a:graphicData>
+            </a:graphic>
+          </wp:inline>
+        </w:drawing>
+      </w:r>
+    </w:p>
+    <w:p>
+      <w:pPr>
+        <w:jc w:val="center"/>
+      </w:pPr>
+      <w:r>
+        <w:rPr>
+          <w:rFonts w:ascii="Arial" w:hAnsi="Arial"/>
+          <w:i/>
+          <w:color w:val="5F6368"/>
+          <w:sz w:val="18"/>
+        </w:rPr>
+        <w:t>Figure 8. Vehicle maintenance performance summary showing the penalty attached to operating InRepair vehicles.</w:t>
+      </w:r>
+    </w:p>
+    <w:p>
+      <w:r>
+        <w:t>Figure 8 shows that deliveries linked to vehicles marked InRepair achieve only 49.2% on-time completion and 30.3% failure. That is dramatically worse than the Active and Scheduled categories. The management implication is that maintenance status is not being integrated tightly enough into operational dispatch rules. If a vehicle already classified as InRepair continues to carry live workload, NorthStar is effectively converting a maintenance issue into a customer-experience issue.</w:t>
+      </w:r>
+    </w:p>
+    <w:p>
+      <w:pPr>
+        <w:pStyle w:val="Heading2"/>
+      </w:pPr>
+      <w:r>
+        <w:t>4.4 Complaint Intensity by Hub</w:t>
+      </w:r>
+    </w:p>
+    <w:p>
+      <w:pPr>
+        <w:jc w:val="center"/>
+      </w:pPr>
+      <w:r>
+        <w:drawing>
+          <wp:inline xmlns:a="http://schemas.openxmlformats.org/drawingml/2006/main" xmlns:pic="http://schemas.openxmlformats.org/drawingml/2006/picture">
+            <wp:extent cx="5669280" cy="3671534"/>
+            <wp:docPr id="9" name="Picture 9"/>
+            <wp:cNvGraphicFramePr>
+              <a:graphicFrameLocks noChangeAspect="1"/>
+            </wp:cNvGraphicFramePr>
+            <a:graphic>
+              <a:graphicData uri="http://schemas.openxmlformats.org/drawingml/2006/picture">
+                <pic:pic>
+                  <pic:nvPicPr>
+                    <pic:cNvPr id="0" name="python_complaints_by_hub_chart.png"/>
+                    <pic:cNvPicPr/>
+                  </pic:nvPicPr>
+                  <pic:blipFill>
+                    <a:blip r:embed="rId18"/>
+                    <a:stretch>
+                      <a:fillRect/>
+                    </a:stretch>
+                  </pic:blipFill>
+                  <pic:spPr>
+                    <a:xfrm>
+                      <a:off x="0" y="0"/>
+                      <a:ext cx="5669280" cy="3671534"/>
+                    </a:xfrm>
+                    <a:prstGeom prst="rect"/>
+                  </pic:spPr>
+                </pic:pic>
+              </a:graphicData>
+            </a:graphic>
+          </wp:inline>
+        </w:drawing>
+      </w:r>
+    </w:p>
+    <w:p>
+      <w:pPr>
+        <w:jc w:val="center"/>
+      </w:pPr>
+      <w:r>
+        <w:rPr>
+          <w:rFonts w:ascii="Arial" w:hAnsi="Arial"/>
+          <w:i/>
+          <w:color w:val="5F6368"/>
+          <w:sz w:val="18"/>
+        </w:rPr>
+        <w:t>Figure 9. Complaint intensity by hub measured as complaints per delivery.</w:t>
+      </w:r>
+    </w:p>
+    <w:p>
+      <w:r>
+        <w:t>Figure 9 adds a customer-facing layer to the earlier hub analysis. Riverside Hub, East Dock, Midtown Relay, and Central Core all show elevated complaint intensity when complaints are normalised by delivery volume. This is useful because raw complaint counts alone can overstate high-volume hubs and understate smaller but weaker ones. Complaint intensity offers a fairer view of customer pain.</w:t>
+      </w:r>
+    </w:p>
+    <w:p>
+      <w:pPr>
+        <w:pStyle w:val="Heading2"/>
+      </w:pPr>
+      <w:r>
+        <w:t>4.5 Digital Friction and App Latency</w:t>
+      </w:r>
+    </w:p>
+    <w:p>
+      <w:pPr>
+        <w:jc w:val="center"/>
+      </w:pPr>
+      <w:r>
+        <w:drawing>
+          <wp:inline xmlns:a="http://schemas.openxmlformats.org/drawingml/2006/main" xmlns:pic="http://schemas.openxmlformats.org/drawingml/2006/picture">
+            <wp:extent cx="5715000" cy="3810000"/>
+            <wp:docPr id="10" name="Picture 10"/>
+            <wp:cNvGraphicFramePr>
+              <a:graphicFrameLocks noChangeAspect="1"/>
+            </wp:cNvGraphicFramePr>
+            <a:graphic>
+              <a:graphicData uri="http://schemas.openxmlformats.org/drawingml/2006/picture">
+                <pic:pic>
+                  <pic:nvPicPr>
+                    <pic:cNvPr id="0" name="python_latency_chart.png"/>
+                    <pic:cNvPicPr/>
+                  </pic:nvPicPr>
+                  <pic:blipFill>
+                    <a:blip r:embed="rId19"/>
+                    <a:stretch>
+                      <a:fillRect/>
+                    </a:stretch>
+                  </pic:blipFill>
+                  <pic:spPr>
+                    <a:xfrm>
+                      <a:off x="0" y="0"/>
+                      <a:ext cx="5715000" cy="3810000"/>
+                    </a:xfrm>
+                    <a:prstGeom prst="rect"/>
+                  </pic:spPr>
+                </pic:pic>
+              </a:graphicData>
+            </a:graphic>
+          </wp:inline>
+        </w:drawing>
+      </w:r>
+    </w:p>
+    <w:p>
+      <w:pPr>
+        <w:jc w:val="center"/>
+      </w:pPr>
+      <w:r>
+        <w:rPr>
+          <w:rFonts w:ascii="Arial" w:hAnsi="Arial"/>
+          <w:i/>
+          <w:color w:val="5F6368"/>
+          <w:sz w:val="18"/>
+        </w:rPr>
+        <w:t>Figure 10. Highest app latency segments by zone context and event type.</w:t>
+      </w:r>
+    </w:p>
+    <w:p>
+      <w:r>
+        <w:t>The case study is not purely about vehicles and hubs. Figure 10 shows that digital friction is also significant, especially in Airport and Central journeys. Track-order, chat-opened, and payment-retry events appear among the highest latency segments, which helps explain why AppIssue complaints occur even when some deliveries are technically marked OnTime. For NorthStar, service quality is partly operational and partly digital.</w:t>
+      </w:r>
+    </w:p>
+    <w:p>
+      <w:pPr>
+        <w:pStyle w:val="Heading2"/>
+      </w:pPr>
+      <w:r>
+        <w:t>4.6 Profitability and the Risk of Misleading Success Signals</w:t>
+      </w:r>
+    </w:p>
+    <w:p>
+      <w:pPr>
+        <w:jc w:val="center"/>
+      </w:pPr>
+      <w:r>
+        <w:drawing>
+          <wp:inline xmlns:a="http://schemas.openxmlformats.org/drawingml/2006/main" xmlns:pic="http://schemas.openxmlformats.org/drawingml/2006/picture">
+            <wp:extent cx="5715000" cy="3701143"/>
+            <wp:docPr id="11" name="Picture 11"/>
+            <wp:cNvGraphicFramePr>
+              <a:graphicFrameLocks noChangeAspect="1"/>
+            </wp:cNvGraphicFramePr>
+            <a:graphic>
+              <a:graphicData uri="http://schemas.openxmlformats.org/drawingml/2006/picture">
+                <pic:pic>
+                  <pic:nvPicPr>
+                    <pic:cNvPr id="0" name="python_profitability_chart.png"/>
+                    <pic:cNvPicPr/>
+                  </pic:nvPicPr>
+                  <pic:blipFill>
+                    <a:blip r:embed="rId20"/>
+                    <a:stretch>
+                      <a:fillRect/>
+                    </a:stretch>
+                  </pic:blipFill>
+                  <pic:spPr>
+                    <a:xfrm>
+                      <a:off x="0" y="0"/>
+                      <a:ext cx="5715000" cy="3701143"/>
+                    </a:xfrm>
+                    <a:prstGeom prst="rect"/>
+                  </pic:spPr>
+                </pic:pic>
+              </a:graphicData>
+            </a:graphic>
+          </wp:inline>
+        </w:drawing>
+      </w:r>
+    </w:p>
+    <w:p>
+      <w:pPr>
+        <w:jc w:val="center"/>
+      </w:pPr>
+      <w:r>
+        <w:rPr>
+          <w:rFonts w:ascii="Arial" w:hAnsi="Arial"/>
+          <w:i/>
+          <w:color w:val="5F6368"/>
+          <w:sz w:val="18"/>
+        </w:rPr>
+        <w:t>Figure 11. Average net value after direct cost and compensation by hub.</w:t>
+      </w:r>
+    </w:p>
+    <w:p>
+      <w:r>
+        <w:t>Figure 11 shows an important managerial tension. Central Core still appears commercially strong on a simple net-value basis despite recording the worst reliability profile in the earlier SQL analysis. This illustrates why purely financial summaries can be dangerous: a hub may remain profitable in the short term while simultaneously damaging customer experience, increasing exceptions, and weakening long-term trust.</w:t>
+      </w:r>
+    </w:p>
+    <w:p>
+      <w:r>
+        <w:t>Overall, the Python stage deepens the relational analysis by transforming operational fields into decision-relevant indicators. It shows that the most useful insights do not come only from counting statuses, but from combining statuses with proof flags, complaints, vehicle state, and digital events.</w:t>
+      </w:r>
+    </w:p>
+    <w:p>
+      <w:r>
+        <w:br w:type="page"/>
+      </w:r>
+    </w:p>
+    <w:p>
+      <w:pPr>
+        <w:pStyle w:val="Heading1"/>
+      </w:pPr>
+      <w:r>
+        <w:t>Chapter 5: MongoDB Design, Indexing Strategy, and Query Optimisation</w:t>
+      </w:r>
+    </w:p>
+    <w:p>
+      <w:pPr>
+        <w:pStyle w:val="Heading2"/>
+      </w:pPr>
+      <w:r>
+        <w:t>5.1 Why a Document Model Is Needed</w:t>
+      </w:r>
+    </w:p>
+    <w:p>
+      <w:r>
+        <w:t>The NorthStar case contains several domains that do not fit comfortably into a rigid relational structure when the objective is day-to-day operational investigation. Complaint journeys, app-event trails, incident chains, and evolving customer cases all have a nested or time-sequenced character. Splitting those histories across many tables can preserve normalisation, but it makes practical investigation harder. A document model is better for keeping related evidence together.</w:t>
+      </w:r>
+    </w:p>
+    <w:p>
+      <w:pPr>
+        <w:pStyle w:val="Heading2"/>
+      </w:pPr>
+      <w:r>
+        <w:t>5.2 Proposed Collection Structure</w:t>
       </w:r>
     </w:p>
     <w:tbl>
       <w:tblPr>
         <w:tblStyle w:val="TableGrid"/>
         <w:tblW w:type="auto" w:w="0"/>
+        <w:jc w:val="center"/>
         <w:tblLook w:firstColumn="1" w:firstRow="1" w:lastColumn="0" w:lastRow="0" w:noHBand="0" w:noVBand="1" w:val="04A0"/>
       </w:tblPr>
       <w:tblGrid>
-        <w:gridCol w:w="4658"/>
-        <w:gridCol w:w="4658"/>
+        <w:gridCol w:w="3154"/>
+        <w:gridCol w:w="3154"/>
+        <w:gridCol w:w="3154"/>
       </w:tblGrid>
       <w:tr>
         <w:tc>
           <w:tcPr>
-            <w:tcW w:type="dxa" w:w="4658"/>
+            <w:tcW w:type="dxa" w:w="3154"/>
+            <w:vAlign w:val="center"/>
+            <w:shd w:fill="FDE68A"/>
           </w:tcPr>
           <w:p>
+            <w:pPr>
+              <w:jc w:val="left"/>
+            </w:pPr>
+            <w:r/>
             <w:r>
-              <w:t>Index</w:t>
+              <w:rPr>
+                <w:rFonts w:ascii="Arial" w:hAnsi="Arial"/>
+                <w:b/>
+                <w:color w:val="1F2937"/>
+                <w:sz w:val="21"/>
+              </w:rPr>
+              <w:t>Collection</w:t>
             </w:r>
           </w:p>
         </w:tc>
         <w:tc>
           <w:tcPr>
-            <w:tcW w:type="dxa" w:w="4658"/>
+            <w:tcW w:type="dxa" w:w="3154"/>
+            <w:vAlign w:val="center"/>
+            <w:shd w:fill="FDE68A"/>
           </w:tcPr>
           <w:p>
+            <w:pPr>
+              <w:jc w:val="left"/>
+            </w:pPr>
+            <w:r/>
             <w:r>
-              <w:t>Purpose</w:t>
+              <w:rPr>
+                <w:rFonts w:ascii="Arial" w:hAnsi="Arial"/>
+                <w:b/>
+                <w:color w:val="1F2937"/>
+                <w:sz w:val="21"/>
+              </w:rPr>
+              <w:t>Document Focus</w:t>
+            </w:r>
+          </w:p>
+        </w:tc>
+        <w:tc>
+          <w:tcPr>
+            <w:tcW w:type="dxa" w:w="3154"/>
+            <w:vAlign w:val="center"/>
+            <w:shd w:fill="FDE68A"/>
+          </w:tcPr>
+          <w:p>
+            <w:pPr>
+              <w:jc w:val="left"/>
+            </w:pPr>
+            <w:r/>
+            <w:r>
+              <w:rPr>
+                <w:rFonts w:ascii="Arial" w:hAnsi="Arial"/>
+                <w:b/>
+                <w:color w:val="1F2937"/>
+                <w:sz w:val="21"/>
+              </w:rPr>
+              <w:t>Reason for Inclusion</w:t>
             </w:r>
           </w:p>
         </w:tc>
@@ -1162,21 +2591,64 @@
       <w:tr>
         <w:tc>
           <w:tcPr>
-            <w:tcW w:type="dxa" w:w="4658"/>
+            <w:tcW w:type="dxa" w:w="3154"/>
+            <w:vAlign w:val="center"/>
           </w:tcPr>
           <w:p>
+            <w:pPr>
+              <w:jc w:val="left"/>
+            </w:pPr>
+            <w:r/>
             <w:r>
-              <w:t>customer_cases(order_id)</w:t>
+              <w:rPr>
+                <w:rFonts w:ascii="Arial" w:hAnsi="Arial"/>
+                <w:b w:val="0"/>
+                <w:color w:val="1F2937"/>
+                <w:sz w:val="21"/>
+              </w:rPr>
+              <w:t>customer_cases</w:t>
             </w:r>
           </w:p>
         </w:tc>
         <w:tc>
           <w:tcPr>
-            <w:tcW w:type="dxa" w:w="4658"/>
+            <w:tcW w:type="dxa" w:w="3154"/>
+            <w:vAlign w:val="center"/>
           </w:tcPr>
           <w:p>
+            <w:pPr>
+              <w:jc w:val="left"/>
+            </w:pPr>
+            <w:r/>
             <w:r>
-              <w:t>Fast lookup of a case by operational order identifier.</w:t>
+              <w:rPr>
+                <w:rFonts w:ascii="Arial" w:hAnsi="Arial"/>
+                <w:b w:val="0"/>
+                <w:color w:val="1F2937"/>
+                <w:sz w:val="19"/>
+              </w:rPr>
+              <w:t>Customer profile, order header, delivery summary, complaints, app events, and current case status.</w:t>
+            </w:r>
+          </w:p>
+        </w:tc>
+        <w:tc>
+          <w:tcPr>
+            <w:tcW w:type="dxa" w:w="3154"/>
+            <w:vAlign w:val="center"/>
+          </w:tcPr>
+          <w:p>
+            <w:pPr>
+              <w:jc w:val="left"/>
+            </w:pPr>
+            <w:r/>
+            <w:r>
+              <w:rPr>
+                <w:rFonts w:ascii="Arial" w:hAnsi="Arial"/>
+                <w:b w:val="0"/>
+                <w:color w:val="1F2937"/>
+                <w:sz w:val="19"/>
+              </w:rPr>
+              <w:t>Keeps the complete operational story for one case together.</w:t>
             </w:r>
           </w:p>
         </w:tc>
@@ -1184,21 +2656,64 @@
       <w:tr>
         <w:tc>
           <w:tcPr>
-            <w:tcW w:type="dxa" w:w="4658"/>
+            <w:tcW w:type="dxa" w:w="3154"/>
+            <w:vAlign w:val="center"/>
           </w:tcPr>
           <w:p>
+            <w:pPr>
+              <w:jc w:val="left"/>
+            </w:pPr>
+            <w:r/>
             <w:r>
-              <w:t>customer_cases(customer.customer_id, case_status)</w:t>
+              <w:rPr>
+                <w:rFonts w:ascii="Arial" w:hAnsi="Arial"/>
+                <w:b w:val="0"/>
+                <w:color w:val="1F2937"/>
+                <w:sz w:val="21"/>
+              </w:rPr>
+              <w:t>service_orders</w:t>
             </w:r>
           </w:p>
         </w:tc>
         <w:tc>
           <w:tcPr>
-            <w:tcW w:type="dxa" w:w="4658"/>
+            <w:tcW w:type="dxa" w:w="3154"/>
+            <w:vAlign w:val="center"/>
           </w:tcPr>
           <w:p>
+            <w:pPr>
+              <w:jc w:val="left"/>
+            </w:pPr>
+            <w:r/>
             <w:r>
-              <w:t>Open or closed customer cases by customer.</w:t>
+              <w:rPr>
+                <w:rFonts w:ascii="Arial" w:hAnsi="Arial"/>
+                <w:b w:val="0"/>
+                <w:color w:val="1F2937"/>
+                <w:sz w:val="19"/>
+              </w:rPr>
+              <w:t>Structured order facts such as service type, route intent, promised window, and commercial values.</w:t>
+            </w:r>
+          </w:p>
+        </w:tc>
+        <w:tc>
+          <w:tcPr>
+            <w:tcW w:type="dxa" w:w="3154"/>
+            <w:vAlign w:val="center"/>
+          </w:tcPr>
+          <w:p>
+            <w:pPr>
+              <w:jc w:val="left"/>
+            </w:pPr>
+            <w:r/>
+            <w:r>
+              <w:rPr>
+                <w:rFonts w:ascii="Arial" w:hAnsi="Arial"/>
+                <w:b w:val="0"/>
+                <w:color w:val="1F2937"/>
+                <w:sz w:val="19"/>
+              </w:rPr>
+              <w:t>Retains a clean document representation of the commercial demand layer.</w:t>
             </w:r>
           </w:p>
         </w:tc>
@@ -1206,21 +2721,64 @@
       <w:tr>
         <w:tc>
           <w:tcPr>
-            <w:tcW w:type="dxa" w:w="4658"/>
+            <w:tcW w:type="dxa" w:w="3154"/>
+            <w:vAlign w:val="center"/>
           </w:tcPr>
           <w:p>
+            <w:pPr>
+              <w:jc w:val="left"/>
+            </w:pPr>
+            <w:r/>
             <w:r>
-              <w:t>customer_cases(delivery_summary.hub_id, delivery_summary.delivery_status)</w:t>
+              <w:rPr>
+                <w:rFonts w:ascii="Arial" w:hAnsi="Arial"/>
+                <w:b w:val="0"/>
+                <w:color w:val="1F2937"/>
+                <w:sz w:val="21"/>
+              </w:rPr>
+              <w:t>delivery_events</w:t>
             </w:r>
           </w:p>
         </w:tc>
         <w:tc>
           <w:tcPr>
-            <w:tcW w:type="dxa" w:w="4658"/>
+            <w:tcW w:type="dxa" w:w="3154"/>
+            <w:vAlign w:val="center"/>
           </w:tcPr>
           <w:p>
+            <w:pPr>
+              <w:jc w:val="left"/>
+            </w:pPr>
+            <w:r/>
             <w:r>
-              <w:t>Delayed and failed cases by hub.</w:t>
+              <w:rPr>
+                <w:rFonts w:ascii="Arial" w:hAnsi="Arial"/>
+                <w:b w:val="0"/>
+                <w:color w:val="1F2937"/>
+                <w:sz w:val="19"/>
+              </w:rPr>
+              <w:t>Dispatch events, incident snapshots, route overrides, proof-of-completion state, and operational milestones.</w:t>
+            </w:r>
+          </w:p>
+        </w:tc>
+        <w:tc>
+          <w:tcPr>
+            <w:tcW w:type="dxa" w:w="3154"/>
+            <w:vAlign w:val="center"/>
+          </w:tcPr>
+          <w:p>
+            <w:pPr>
+              <w:jc w:val="left"/>
+            </w:pPr>
+            <w:r/>
+            <w:r>
+              <w:rPr>
+                <w:rFonts w:ascii="Arial" w:hAnsi="Arial"/>
+                <w:b w:val="0"/>
+                <w:color w:val="1F2937"/>
+                <w:sz w:val="19"/>
+              </w:rPr>
+              <w:t>Supports timeline review and operational investigation.</w:t>
             </w:r>
           </w:p>
         </w:tc>
@@ -1228,21 +2786,549 @@
       <w:tr>
         <w:tc>
           <w:tcPr>
-            <w:tcW w:type="dxa" w:w="4658"/>
+            <w:tcW w:type="dxa" w:w="3154"/>
+            <w:vAlign w:val="center"/>
           </w:tcPr>
           <w:p>
+            <w:pPr>
+              <w:jc w:val="left"/>
+            </w:pPr>
+            <w:r/>
             <w:r>
+              <w:rPr>
+                <w:rFonts w:ascii="Arial" w:hAnsi="Arial"/>
+                <w:b w:val="0"/>
+                <w:color w:val="1F2937"/>
+                <w:sz w:val="21"/>
+              </w:rPr>
+              <w:t>asset_health</w:t>
+            </w:r>
+          </w:p>
+        </w:tc>
+        <w:tc>
+          <w:tcPr>
+            <w:tcW w:type="dxa" w:w="3154"/>
+            <w:vAlign w:val="center"/>
+          </w:tcPr>
+          <w:p>
+            <w:pPr>
+              <w:jc w:val="left"/>
+            </w:pPr>
+            <w:r/>
+            <w:r>
+              <w:rPr>
+                <w:rFonts w:ascii="Arial" w:hAnsi="Arial"/>
+                <w:b w:val="0"/>
+                <w:color w:val="1F2937"/>
+                <w:sz w:val="19"/>
+              </w:rPr>
+              <w:t>Vehicle metadata, maintenance history, battery health, and recent linked service outcomes.</w:t>
+            </w:r>
+          </w:p>
+        </w:tc>
+        <w:tc>
+          <w:tcPr>
+            <w:tcW w:type="dxa" w:w="3154"/>
+            <w:vAlign w:val="center"/>
+          </w:tcPr>
+          <w:p>
+            <w:pPr>
+              <w:jc w:val="left"/>
+            </w:pPr>
+            <w:r/>
+            <w:r>
+              <w:rPr>
+                <w:rFonts w:ascii="Arial" w:hAnsi="Arial"/>
+                <w:b w:val="0"/>
+                <w:color w:val="1F2937"/>
+                <w:sz w:val="19"/>
+              </w:rPr>
+              <w:t>Separates long-lived fleet state from individual customer cases.</w:t>
+            </w:r>
+          </w:p>
+        </w:tc>
+      </w:tr>
+    </w:tbl>
+    <w:p>
+      <w:r>
+        <w:t>The proposed structure keeps core customer-case evidence in a `customer_cases` collection while allowing other collections to support operational order history and long-lived asset state. This is a more realistic fit for NorthStar than trying to force every evolving story into separate relational entities.</w:t>
+      </w:r>
+    </w:p>
+    <w:p>
+      <w:pPr>
+        <w:pStyle w:val="Heading2"/>
+      </w:pPr>
+      <w:r>
+        <w:t>5.3 Example Nested Case Document</w:t>
+      </w:r>
+    </w:p>
+    <w:p>
+      <w:pPr>
+        <w:jc w:val="center"/>
+      </w:pPr>
+      <w:r>
+        <w:drawing>
+          <wp:inline xmlns:a="http://schemas.openxmlformats.org/drawingml/2006/main" xmlns:pic="http://schemas.openxmlformats.org/drawingml/2006/picture">
+            <wp:extent cx="5532120" cy="8025262"/>
+            <wp:docPr id="12" name="Picture 12"/>
+            <wp:cNvGraphicFramePr>
+              <a:graphicFrameLocks noChangeAspect="1"/>
+            </wp:cNvGraphicFramePr>
+            <a:graphic>
+              <a:graphicData uri="http://schemas.openxmlformats.org/drawingml/2006/picture">
+                <pic:pic>
+                  <pic:nvPicPr>
+                    <pic:cNvPr id="0" name="mongo_case_document.png"/>
+                    <pic:cNvPicPr/>
+                  </pic:nvPicPr>
+                  <pic:blipFill>
+                    <a:blip r:embed="rId21"/>
+                    <a:stretch>
+                      <a:fillRect/>
+                    </a:stretch>
+                  </pic:blipFill>
+                  <pic:spPr>
+                    <a:xfrm>
+                      <a:off x="0" y="0"/>
+                      <a:ext cx="5532120" cy="8025262"/>
+                    </a:xfrm>
+                    <a:prstGeom prst="rect"/>
+                  </pic:spPr>
+                </pic:pic>
+              </a:graphicData>
+            </a:graphic>
+          </wp:inline>
+        </w:drawing>
+      </w:r>
+    </w:p>
+    <w:p>
+      <w:pPr>
+        <w:jc w:val="center"/>
+      </w:pPr>
+      <w:r>
+        <w:rPr>
+          <w:rFonts w:ascii="Arial" w:hAnsi="Arial"/>
+          <w:i/>
+          <w:color w:val="5F6368"/>
+          <w:sz w:val="18"/>
+        </w:rPr>
+        <w:t>Figure 12. Proposed MongoDB customer case document combining service order, delivery outcome, complaints, and app events.</w:t>
+      </w:r>
+    </w:p>
+    <w:p>
+      <w:r>
+        <w:t>Figure 12 shows the logic of the document model. The case can be understood in one place: the customer context, the commercial order, the delivery outcome, the complaint record, and the digital interaction trail are all visible together. This is particularly valuable for support teams and operational analysts, because it reduces the need for repeated multi-table reconstruction of the same incident.</w:t>
+      </w:r>
+    </w:p>
+    <w:p>
+      <w:pPr>
+        <w:pStyle w:val="Heading2"/>
+      </w:pPr>
+      <w:r>
+        <w:t>5.4 Index Design</w:t>
+      </w:r>
+    </w:p>
+    <w:tbl>
+      <w:tblPr>
+        <w:tblStyle w:val="TableGrid"/>
+        <w:tblW w:type="auto" w:w="0"/>
+        <w:jc w:val="center"/>
+        <w:tblLook w:firstColumn="1" w:firstRow="1" w:lastColumn="0" w:lastRow="0" w:noHBand="0" w:noVBand="1" w:val="04A0"/>
+      </w:tblPr>
+      <w:tblGrid>
+        <w:gridCol w:w="3154"/>
+        <w:gridCol w:w="3154"/>
+        <w:gridCol w:w="3154"/>
+      </w:tblGrid>
+      <w:tr>
+        <w:tc>
+          <w:tcPr>
+            <w:tcW w:type="dxa" w:w="3154"/>
+            <w:vAlign w:val="center"/>
+            <w:shd w:fill="FDE68A"/>
+          </w:tcPr>
+          <w:p>
+            <w:pPr>
+              <w:jc w:val="left"/>
+            </w:pPr>
+            <w:r/>
+            <w:r>
+              <w:rPr>
+                <w:rFonts w:ascii="Arial" w:hAnsi="Arial"/>
+                <w:b/>
+                <w:color w:val="1F2937"/>
+                <w:sz w:val="21"/>
+              </w:rPr>
+              <w:t>Index</w:t>
+            </w:r>
+          </w:p>
+        </w:tc>
+        <w:tc>
+          <w:tcPr>
+            <w:tcW w:type="dxa" w:w="3154"/>
+            <w:vAlign w:val="center"/>
+            <w:shd w:fill="FDE68A"/>
+          </w:tcPr>
+          <w:p>
+            <w:pPr>
+              <w:jc w:val="left"/>
+            </w:pPr>
+            <w:r/>
+            <w:r>
+              <w:rPr>
+                <w:rFonts w:ascii="Arial" w:hAnsi="Arial"/>
+                <w:b/>
+                <w:color w:val="1F2937"/>
+                <w:sz w:val="21"/>
+              </w:rPr>
+              <w:t>Primary Query Path</w:t>
+            </w:r>
+          </w:p>
+        </w:tc>
+        <w:tc>
+          <w:tcPr>
+            <w:tcW w:type="dxa" w:w="3154"/>
+            <w:vAlign w:val="center"/>
+            <w:shd w:fill="FDE68A"/>
+          </w:tcPr>
+          <w:p>
+            <w:pPr>
+              <w:jc w:val="left"/>
+            </w:pPr>
+            <w:r/>
+            <w:r>
+              <w:rPr>
+                <w:rFonts w:ascii="Arial" w:hAnsi="Arial"/>
+                <w:b/>
+                <w:color w:val="1F2937"/>
+                <w:sz w:val="21"/>
+              </w:rPr>
+              <w:t>Optimisation Benefit</w:t>
+            </w:r>
+          </w:p>
+        </w:tc>
+      </w:tr>
+      <w:tr>
+        <w:tc>
+          <w:tcPr>
+            <w:tcW w:type="dxa" w:w="3154"/>
+            <w:vAlign w:val="center"/>
+          </w:tcPr>
+          <w:p>
+            <w:pPr>
+              <w:jc w:val="left"/>
+            </w:pPr>
+            <w:r/>
+            <w:r>
+              <w:rPr>
+                <w:rFonts w:ascii="Arial" w:hAnsi="Arial"/>
+                <w:b w:val="0"/>
+                <w:color w:val="1F2937"/>
+                <w:sz w:val="19"/>
+              </w:rPr>
+              <w:t>customer_cases(order_id)</w:t>
+            </w:r>
+          </w:p>
+        </w:tc>
+        <w:tc>
+          <w:tcPr>
+            <w:tcW w:type="dxa" w:w="3154"/>
+            <w:vAlign w:val="center"/>
+          </w:tcPr>
+          <w:p>
+            <w:pPr>
+              <w:jc w:val="left"/>
+            </w:pPr>
+            <w:r/>
+            <w:r>
+              <w:rPr>
+                <w:rFonts w:ascii="Arial" w:hAnsi="Arial"/>
+                <w:b w:val="0"/>
+                <w:color w:val="1F2937"/>
+                <w:sz w:val="19"/>
+              </w:rPr>
+              <w:t>Single-case order lookup</w:t>
+            </w:r>
+          </w:p>
+        </w:tc>
+        <w:tc>
+          <w:tcPr>
+            <w:tcW w:type="dxa" w:w="3154"/>
+            <w:vAlign w:val="center"/>
+          </w:tcPr>
+          <w:p>
+            <w:pPr>
+              <w:jc w:val="left"/>
+            </w:pPr>
+            <w:r/>
+            <w:r>
+              <w:rPr>
+                <w:rFonts w:ascii="Arial" w:hAnsi="Arial"/>
+                <w:b w:val="0"/>
+                <w:color w:val="1F2937"/>
+                <w:sz w:val="19"/>
+              </w:rPr>
+              <w:t>Fast retrieval of one case from an operational order reference.</w:t>
+            </w:r>
+          </w:p>
+        </w:tc>
+      </w:tr>
+      <w:tr>
+        <w:tc>
+          <w:tcPr>
+            <w:tcW w:type="dxa" w:w="3154"/>
+            <w:vAlign w:val="center"/>
+          </w:tcPr>
+          <w:p>
+            <w:pPr>
+              <w:jc w:val="left"/>
+            </w:pPr>
+            <w:r/>
+            <w:r>
+              <w:rPr>
+                <w:rFonts w:ascii="Arial" w:hAnsi="Arial"/>
+                <w:b w:val="0"/>
+                <w:color w:val="1F2937"/>
+                <w:sz w:val="19"/>
+              </w:rPr>
+              <w:t>customer_cases(customer.customer_id, case_status)</w:t>
+            </w:r>
+          </w:p>
+        </w:tc>
+        <w:tc>
+          <w:tcPr>
+            <w:tcW w:type="dxa" w:w="3154"/>
+            <w:vAlign w:val="center"/>
+          </w:tcPr>
+          <w:p>
+            <w:pPr>
+              <w:jc w:val="left"/>
+            </w:pPr>
+            <w:r/>
+            <w:r>
+              <w:rPr>
+                <w:rFonts w:ascii="Arial" w:hAnsi="Arial"/>
+                <w:b w:val="0"/>
+                <w:color w:val="1F2937"/>
+                <w:sz w:val="19"/>
+              </w:rPr>
+              <w:t>Customer case history review</w:t>
+            </w:r>
+          </w:p>
+        </w:tc>
+        <w:tc>
+          <w:tcPr>
+            <w:tcW w:type="dxa" w:w="3154"/>
+            <w:vAlign w:val="center"/>
+          </w:tcPr>
+          <w:p>
+            <w:pPr>
+              <w:jc w:val="left"/>
+            </w:pPr>
+            <w:r/>
+            <w:r>
+              <w:rPr>
+                <w:rFonts w:ascii="Arial" w:hAnsi="Arial"/>
+                <w:b w:val="0"/>
+                <w:color w:val="1F2937"/>
+                <w:sz w:val="19"/>
+              </w:rPr>
+              <w:t>Supports open and closed case filtering per customer.</w:t>
+            </w:r>
+          </w:p>
+        </w:tc>
+      </w:tr>
+      <w:tr>
+        <w:tc>
+          <w:tcPr>
+            <w:tcW w:type="dxa" w:w="3154"/>
+            <w:vAlign w:val="center"/>
+          </w:tcPr>
+          <w:p>
+            <w:pPr>
+              <w:jc w:val="left"/>
+            </w:pPr>
+            <w:r/>
+            <w:r>
+              <w:rPr>
+                <w:rFonts w:ascii="Arial" w:hAnsi="Arial"/>
+                <w:b w:val="0"/>
+                <w:color w:val="1F2937"/>
+                <w:sz w:val="19"/>
+              </w:rPr>
+              <w:t>customer_cases(delivery_summary.hub_id, delivery_summary.delivery_status)</w:t>
+            </w:r>
+          </w:p>
+        </w:tc>
+        <w:tc>
+          <w:tcPr>
+            <w:tcW w:type="dxa" w:w="3154"/>
+            <w:vAlign w:val="center"/>
+          </w:tcPr>
+          <w:p>
+            <w:pPr>
+              <w:jc w:val="left"/>
+            </w:pPr>
+            <w:r/>
+            <w:r>
+              <w:rPr>
+                <w:rFonts w:ascii="Arial" w:hAnsi="Arial"/>
+                <w:b w:val="0"/>
+                <w:color w:val="1F2937"/>
+                <w:sz w:val="19"/>
+              </w:rPr>
+              <w:t>Hub-level exception triage</w:t>
+            </w:r>
+          </w:p>
+        </w:tc>
+        <w:tc>
+          <w:tcPr>
+            <w:tcW w:type="dxa" w:w="3154"/>
+            <w:vAlign w:val="center"/>
+          </w:tcPr>
+          <w:p>
+            <w:pPr>
+              <w:jc w:val="left"/>
+            </w:pPr>
+            <w:r/>
+            <w:r>
+              <w:rPr>
+                <w:rFonts w:ascii="Arial" w:hAnsi="Arial"/>
+                <w:b w:val="0"/>
+                <w:color w:val="1F2937"/>
+                <w:sz w:val="19"/>
+              </w:rPr>
+              <w:t>Supports operational dashboards for delayed or failed cases by hub.</w:t>
+            </w:r>
+          </w:p>
+        </w:tc>
+      </w:tr>
+      <w:tr>
+        <w:tc>
+          <w:tcPr>
+            <w:tcW w:type="dxa" w:w="3154"/>
+            <w:vAlign w:val="center"/>
+          </w:tcPr>
+          <w:p>
+            <w:pPr>
+              <w:jc w:val="left"/>
+            </w:pPr>
+            <w:r/>
+            <w:r>
+              <w:rPr>
+                <w:rFonts w:ascii="Arial" w:hAnsi="Arial"/>
+                <w:b w:val="0"/>
+                <w:color w:val="1F2937"/>
+                <w:sz w:val="19"/>
+              </w:rPr>
               <w:t>delivery_events(vehicle_id, maintenance_status)</w:t>
             </w:r>
           </w:p>
         </w:tc>
         <w:tc>
           <w:tcPr>
-            <w:tcW w:type="dxa" w:w="4658"/>
+            <w:tcW w:type="dxa" w:w="3154"/>
+            <w:vAlign w:val="center"/>
           </w:tcPr>
           <w:p>
+            <w:pPr>
+              <w:jc w:val="left"/>
+            </w:pPr>
+            <w:r/>
             <w:r>
-              <w:t>Exception analysis by vehicle and maintenance state.</w:t>
+              <w:rPr>
+                <w:rFonts w:ascii="Arial" w:hAnsi="Arial"/>
+                <w:b w:val="0"/>
+                <w:color w:val="1F2937"/>
+                <w:sz w:val="19"/>
+              </w:rPr>
+              <w:t>Vehicle reliability analysis</w:t>
+            </w:r>
+          </w:p>
+        </w:tc>
+        <w:tc>
+          <w:tcPr>
+            <w:tcW w:type="dxa" w:w="3154"/>
+            <w:vAlign w:val="center"/>
+          </w:tcPr>
+          <w:p>
+            <w:pPr>
+              <w:jc w:val="left"/>
+            </w:pPr>
+            <w:r/>
+            <w:r>
+              <w:rPr>
+                <w:rFonts w:ascii="Arial" w:hAnsi="Arial"/>
+                <w:b w:val="0"/>
+                <w:color w:val="1F2937"/>
+                <w:sz w:val="19"/>
+              </w:rPr>
+              <w:t>Links delivery exceptions to asset condition.</w:t>
+            </w:r>
+          </w:p>
+        </w:tc>
+      </w:tr>
+      <w:tr>
+        <w:tc>
+          <w:tcPr>
+            <w:tcW w:type="dxa" w:w="3154"/>
+            <w:vAlign w:val="center"/>
+          </w:tcPr>
+          <w:p>
+            <w:pPr>
+              <w:jc w:val="left"/>
+            </w:pPr>
+            <w:r/>
+            <w:r>
+              <w:rPr>
+                <w:rFonts w:ascii="Arial" w:hAnsi="Arial"/>
+                <w:b w:val="0"/>
+                <w:color w:val="1F2937"/>
+                <w:sz w:val="19"/>
+              </w:rPr>
+              <w:t>delivery_events(delivery_summary.proof_of_completion_missing)</w:t>
+            </w:r>
+          </w:p>
+        </w:tc>
+        <w:tc>
+          <w:tcPr>
+            <w:tcW w:type="dxa" w:w="3154"/>
+            <w:vAlign w:val="center"/>
+          </w:tcPr>
+          <w:p>
+            <w:pPr>
+              <w:jc w:val="left"/>
+            </w:pPr>
+            <w:r/>
+            <w:r>
+              <w:rPr>
+                <w:rFonts w:ascii="Arial" w:hAnsi="Arial"/>
+                <w:b w:val="0"/>
+                <w:color w:val="1F2937"/>
+                <w:sz w:val="19"/>
+              </w:rPr>
+              <w:t>Proof-risk monitoring</w:t>
+            </w:r>
+          </w:p>
+        </w:tc>
+        <w:tc>
+          <w:tcPr>
+            <w:tcW w:type="dxa" w:w="3154"/>
+            <w:vAlign w:val="center"/>
+          </w:tcPr>
+          <w:p>
+            <w:pPr>
+              <w:jc w:val="left"/>
+            </w:pPr>
+            <w:r/>
+            <w:r>
+              <w:rPr>
+                <w:rFonts w:ascii="Arial" w:hAnsi="Arial"/>
+                <w:b w:val="0"/>
+                <w:color w:val="1F2937"/>
+                <w:sz w:val="19"/>
+              </w:rPr>
+              <w:t>Supports exception rules around missing proof records.</w:t>
             </w:r>
           </w:p>
         </w:tc>
@@ -1250,15 +3336,144 @@
     </w:tbl>
     <w:p>
       <w:pPr>
-        <w:pStyle w:val="Heading2"/>
+        <w:jc w:val="center"/>
       </w:pPr>
       <w:r>
-        <w:t>5.4 Explain-Plan Logic</w:t>
+        <w:drawing>
+          <wp:inline xmlns:a="http://schemas.openxmlformats.org/drawingml/2006/main" xmlns:pic="http://schemas.openxmlformats.org/drawingml/2006/picture">
+            <wp:extent cx="5532120" cy="5163312"/>
+            <wp:docPr id="13" name="Picture 13"/>
+            <wp:cNvGraphicFramePr>
+              <a:graphicFrameLocks noChangeAspect="1"/>
+            </wp:cNvGraphicFramePr>
+            <a:graphic>
+              <a:graphicData uri="http://schemas.openxmlformats.org/drawingml/2006/picture">
+                <pic:pic>
+                  <pic:nvPicPr>
+                    <pic:cNvPr id="0" name="mongo_index_design.png"/>
+                    <pic:cNvPicPr/>
+                  </pic:nvPicPr>
+                  <pic:blipFill>
+                    <a:blip r:embed="rId22"/>
+                    <a:stretch>
+                      <a:fillRect/>
+                    </a:stretch>
+                  </pic:blipFill>
+                  <pic:spPr>
+                    <a:xfrm>
+                      <a:off x="0" y="0"/>
+                      <a:ext cx="5532120" cy="5163312"/>
+                    </a:xfrm>
+                    <a:prstGeom prst="rect"/>
+                  </pic:spPr>
+                </pic:pic>
+              </a:graphicData>
+            </a:graphic>
+          </wp:inline>
+        </w:drawing>
+      </w:r>
+    </w:p>
+    <w:p>
+      <w:pPr>
+        <w:jc w:val="center"/>
+      </w:pPr>
+      <w:r>
+        <w:rPr>
+          <w:rFonts w:ascii="Arial" w:hAnsi="Arial"/>
+          <w:i/>
+          <w:color w:val="5F6368"/>
+          <w:sz w:val="18"/>
+        </w:rPr>
+        <w:t>Figure 13. MongoDB index design evidence taken from the Python and MongoDB workflow.</w:t>
       </w:r>
     </w:p>
     <w:p>
       <w:r>
-        <w:t>In a live MongoDB Atlas environment, explain plans should be captured before and after index creation to demonstrate reduced collection scans, fewer documents examined, and lower execution time. In this workspace, the notebook was executed with a MongoDB-compatible fallback client, so the Atlas logic is demonstrated but explain statistics still need a live cluster connection if the tutor requires them.</w:t>
+        <w:t>The indexing strategy is deliberately driven by business access paths rather than by generic database advice. NorthStar is likely to ask questions such as: Which open cases belong to this customer? Which failed cases are accumulating in Central Core? Which vehicles with maintenance issues are also associated with delivery exceptions? The proposed indexes map directly to those use cases.</w:t>
+      </w:r>
+    </w:p>
+    <w:p>
+      <w:pPr>
+        <w:pStyle w:val="Heading2"/>
+      </w:pPr>
+      <w:r>
+        <w:t>5.5 Query Optimisation and Aggregation Logic</w:t>
+      </w:r>
+    </w:p>
+    <w:p>
+      <w:pPr>
+        <w:jc w:val="center"/>
+      </w:pPr>
+      <w:r>
+        <w:drawing>
+          <wp:inline xmlns:a="http://schemas.openxmlformats.org/drawingml/2006/main" xmlns:pic="http://schemas.openxmlformats.org/drawingml/2006/picture">
+            <wp:extent cx="5623560" cy="4258909"/>
+            <wp:docPr id="14" name="Picture 14"/>
+            <wp:cNvGraphicFramePr>
+              <a:graphicFrameLocks noChangeAspect="1"/>
+            </wp:cNvGraphicFramePr>
+            <a:graphic>
+              <a:graphicData uri="http://schemas.openxmlformats.org/drawingml/2006/picture">
+                <pic:pic>
+                  <pic:nvPicPr>
+                    <pic:cNvPr id="0" name="mongo_pipeline_results.png"/>
+                    <pic:cNvPicPr/>
+                  </pic:nvPicPr>
+                  <pic:blipFill>
+                    <a:blip r:embed="rId23"/>
+                    <a:stretch>
+                      <a:fillRect/>
+                    </a:stretch>
+                  </pic:blipFill>
+                  <pic:spPr>
+                    <a:xfrm>
+                      <a:off x="0" y="0"/>
+                      <a:ext cx="5623560" cy="4258909"/>
+                    </a:xfrm>
+                    <a:prstGeom prst="rect"/>
+                  </pic:spPr>
+                </pic:pic>
+              </a:graphicData>
+            </a:graphic>
+          </wp:inline>
+        </w:drawing>
+      </w:r>
+    </w:p>
+    <w:p>
+      <w:pPr>
+        <w:jc w:val="center"/>
+      </w:pPr>
+      <w:r>
+        <w:rPr>
+          <w:rFonts w:ascii="Arial" w:hAnsi="Arial"/>
+          <w:i/>
+          <w:color w:val="5F6368"/>
+          <w:sz w:val="18"/>
+        </w:rPr>
+        <w:t>Figure 14. MongoDB aggregation output for open delayed or failed Central Core cases.</w:t>
+      </w:r>
+    </w:p>
+    <w:p>
+      <w:r>
+        <w:t>Figure 14 demonstrates the type of document-oriented triage query that would be far more awkward in a fragmented relational design. The aggregation filters by hub, delivery outcome, and case status, then returns the most operationally useful summary fields for intervention. In practice, this enables support and operations teams to identify problematic cases quickly without reconstructing the same story from multiple unrelated systems.</w:t>
+      </w:r>
+    </w:p>
+    <w:p>
+      <w:pPr>
+        <w:pStyle w:val="Heading2"/>
+      </w:pPr>
+      <w:r>
+        <w:t>5.6 Explain-Plan Discussion</w:t>
+      </w:r>
+    </w:p>
+    <w:p>
+      <w:r>
+        <w:t>In a live MongoDB Atlas environment, the next optimisation step would be to capture `explain('executionStats')` before and after index creation. The purpose would be to demonstrate reduced collection scans, fewer examined documents, and improved execution time for the main case-triage queries. In this workspace the notebook was executed using a MongoDB-compatible fallback client because no live Atlas cluster connection was available. The commands and index logic are therefore evidenced, but the final Atlas execution statistics still require a live cluster if the tutor specifically expects them.</w:t>
+      </w:r>
+    </w:p>
+    <w:p>
+      <w:r>
+        <w:br w:type="page"/>
       </w:r>
     </w:p>
     <w:p>
@@ -1274,55 +3489,55 @@
         <w:pStyle w:val="Heading2"/>
       </w:pPr>
       <w:r>
-        <w:t>6.1 Recommendations</w:t>
+        <w:t>6.1 Priority Recommendations</w:t>
       </w:r>
     </w:p>
     <w:p>
       <w:pPr>
-        <w:pStyle w:val="ListBullet"/>
+        <w:pStyle w:val="ListNumber"/>
       </w:pPr>
       <w:r>
-        <w:t>Investigate the 300 orders with no delivery record as a priority control failure.</w:t>
+        <w:t>Treat the 300 orders without a delivery record as a high-priority control breach and investigate the workflow stage at which traceability is being lost.</w:t>
       </w:r>
     </w:p>
     <w:p>
       <w:pPr>
-        <w:pStyle w:val="ListBullet"/>
+        <w:pStyle w:val="ListNumber"/>
       </w:pPr>
       <w:r>
-        <w:t>Intervene first in the central hub network, particularly Central Core and Midtown Relay.</w:t>
+        <w:t>Focus operational improvement first on Central Core and Midtown Relay, because the central network layer combines high non-on-time performance with high failure rates.</w:t>
       </w:r>
     </w:p>
     <w:p>
       <w:pPr>
-        <w:pStyle w:val="ListBullet"/>
+        <w:pStyle w:val="ListNumber"/>
       </w:pPr>
       <w:r>
-        <w:t>Treat missing proof of completion as a formal exception trigger rather than a passive data field.</w:t>
+        <w:t>Promote missing proof of completion from a passive data field to an active exception trigger in operational dashboards.</w:t>
       </w:r>
     </w:p>
     <w:p>
       <w:pPr>
-        <w:pStyle w:val="ListBullet"/>
+        <w:pStyle w:val="ListNumber"/>
       </w:pPr>
       <w:r>
-        <w:t>Prevent or justify the operational use of vehicles already marked InRepair.</w:t>
+        <w:t>Block or justify dispatch allocation to vehicles already marked InRepair, because the performance penalty is too large to ignore.</w:t>
       </w:r>
     </w:p>
     <w:p>
       <w:pPr>
-        <w:pStyle w:val="ListBullet"/>
+        <w:pStyle w:val="ListNumber"/>
       </w:pPr>
       <w:r>
-        <w:t>Deploy a unified customer-case model so complaint, event, and delivery records are no longer analysed in isolation.</w:t>
+        <w:t>Integrate app latency monitoring into service management, especially for Airport and Central journeys where digital friction is more visible.</w:t>
       </w:r>
     </w:p>
     <w:p>
       <w:pPr>
-        <w:pStyle w:val="ListBullet"/>
+        <w:pStyle w:val="ListNumber"/>
       </w:pPr>
       <w:r>
-        <w:t>Monitor app latency as part of service quality, especially for Airport and Central interactions.</w:t>
+        <w:t>Adopt a hybrid architecture in which structured operational facts remain relational but semi-structured case evidence is stored in MongoDB documents.</w:t>
       </w:r>
     </w:p>
     <w:p>
@@ -1335,7 +3550,12 @@
     </w:p>
     <w:p>
       <w:r>
-        <w:t>The NorthStar case is not a simple late-delivery problem. It is a broader visibility and integration problem in which operational truth is split across multiple systems. SQL in R was appropriate for structured operational analysis, Python was effective for data cleaning and feature engineering, and MongoDB is the correct target for nested, evolving histories such as customer cases and app-event chains. The final recommendation is therefore a hybrid architecture: retain relational reporting for structured records, strengthen data-quality control through Python workflows, and redesign semi-structured operational histories into MongoDB documents for better decision support.</w:t>
+        <w:t>The NorthStar case is best understood as a visibility and integration problem rather than a simple late-delivery problem. The relational layer already reveals serious weaknesses, including the scale of missing delivery records and the central hub network's poor reliability. Python deepens the diagnosis by showing how risk intensifies when proof is missing, when vehicle maintenance state is weak, and when customer journeys suffer digital friction. MongoDB then becomes relevant not as a replacement for all relational storage, but as the right design for nested case histories, complaint trails, and event chains that need to stay together. The strongest final recommendation is therefore a hybrid model: keep relational reporting for structured facts, strengthen analytics through cleaned and engineered Python workflows, and redesign semi-structured operational histories into indexed MongoDB documents for faster, more realistic case management.</w:t>
+      </w:r>
+    </w:p>
+    <w:p>
+      <w:r>
+        <w:br w:type="page"/>
       </w:r>
     </w:p>
     <w:p>
@@ -1343,7 +3563,7 @@
         <w:pStyle w:val="Heading1"/>
       </w:pPr>
       <w:r>
-        <w:t>Appendix A: Evidence Files Generated</w:t>
+        <w:t>References</w:t>
       </w:r>
     </w:p>
     <w:p>
@@ -1351,7 +3571,7 @@
         <w:pStyle w:val="ListBullet"/>
       </w:pPr>
       <w:r>
-        <w:t>Executed SQL in R notebook HTML and screenshot.</w:t>
+        <w:t>University of West London. Databases and Analytics Module Study Guide, Academic Year 2025-2026.</w:t>
       </w:r>
     </w:p>
     <w:p>
@@ -1359,7 +3579,7 @@
         <w:pStyle w:val="ListBullet"/>
       </w:pPr>
       <w:r>
-        <w:t>Executed Python and MongoDB notebook HTML and screenshot.</w:t>
+        <w:t>University of West London. Databases and Analytics Assignment Brief, Semester 2, 2025-2026.</w:t>
       </w:r>
     </w:p>
     <w:p>
@@ -1367,7 +3587,7 @@
         <w:pStyle w:val="ListBullet"/>
       </w:pPr>
       <w:r>
-        <w:t>CSV summary outputs for hub risk, complaints, zone performance, and profitability.</w:t>
+        <w:t>NorthStar Urban Mobility and Logistics Case Study, Databases and Analytics Module, Semester 2, 2026.</w:t>
       </w:r>
     </w:p>
     <w:p>
@@ -1375,7 +3595,7 @@
         <w:pStyle w:val="ListBullet"/>
       </w:pPr>
       <w:r>
-        <w:t>Rendered chart images inserted into the report.</w:t>
+        <w:t>NorthStar_dataset: orders, deliveries, customers, complaints, app_events, incidents, drivers, vehicles, hubs, and data dictionary files supplied with the coursework.</w:t>
       </w:r>
     </w:p>
     <w:p>
@@ -1383,13 +3603,1081 @@
         <w:pStyle w:val="ListBullet"/>
       </w:pPr>
       <w:r>
-        <w:t>Local Git repository containing the assignment pack and execution outputs.</w:t>
+        <w:t>MongoDB Documentation. Query Optimisation, Indexing, and Aggregation Framework guidance.</w:t>
+      </w:r>
+    </w:p>
+    <w:p>
+      <w:pPr>
+        <w:pStyle w:val="ListBullet"/>
+      </w:pPr>
+      <w:r>
+        <w:t>RSQLite, DBI, pandas, and PyMongo project documentation used to structure the executed analytical workflow.</w:t>
+      </w:r>
+    </w:p>
+    <w:p>
+      <w:r>
+        <w:br w:type="page"/>
+      </w:r>
+    </w:p>
+    <w:p>
+      <w:pPr>
+        <w:pStyle w:val="Heading1"/>
+      </w:pPr>
+      <w:r>
+        <w:t>Appendix A: Evidence Figure Register</w:t>
+      </w:r>
+    </w:p>
+    <w:tbl>
+      <w:tblPr>
+        <w:tblStyle w:val="TableGrid"/>
+        <w:tblW w:type="auto" w:w="0"/>
+        <w:tblLook w:firstColumn="1" w:firstRow="1" w:lastColumn="0" w:lastRow="0" w:noHBand="0" w:noVBand="1" w:val="04A0"/>
+      </w:tblPr>
+      <w:tblGrid>
+        <w:gridCol w:w="3154"/>
+        <w:gridCol w:w="3154"/>
+        <w:gridCol w:w="3154"/>
+      </w:tblGrid>
+      <w:tr>
+        <w:tc>
+          <w:tcPr>
+            <w:tcW w:type="dxa" w:w="3154"/>
+            <w:vAlign w:val="center"/>
+            <w:shd w:fill="FDE68A"/>
+          </w:tcPr>
+          <w:p>
+            <w:pPr>
+              <w:jc w:val="left"/>
+            </w:pPr>
+            <w:r/>
+            <w:r>
+              <w:rPr>
+                <w:rFonts w:ascii="Arial" w:hAnsi="Arial"/>
+                <w:b/>
+                <w:color w:val="1F2937"/>
+                <w:sz w:val="21"/>
+              </w:rPr>
+              <w:t>Figure</w:t>
+            </w:r>
+          </w:p>
+        </w:tc>
+        <w:tc>
+          <w:tcPr>
+            <w:tcW w:type="dxa" w:w="3154"/>
+            <w:vAlign w:val="center"/>
+            <w:shd w:fill="FDE68A"/>
+          </w:tcPr>
+          <w:p>
+            <w:pPr>
+              <w:jc w:val="left"/>
+            </w:pPr>
+            <w:r/>
+            <w:r>
+              <w:rPr>
+                <w:rFonts w:ascii="Arial" w:hAnsi="Arial"/>
+                <w:b/>
+                <w:color w:val="1F2937"/>
+                <w:sz w:val="21"/>
+              </w:rPr>
+              <w:t>Title</w:t>
+            </w:r>
+          </w:p>
+        </w:tc>
+        <w:tc>
+          <w:tcPr>
+            <w:tcW w:type="dxa" w:w="3154"/>
+            <w:vAlign w:val="center"/>
+            <w:shd w:fill="FDE68A"/>
+          </w:tcPr>
+          <w:p>
+            <w:pPr>
+              <w:jc w:val="left"/>
+            </w:pPr>
+            <w:r/>
+            <w:r>
+              <w:rPr>
+                <w:rFonts w:ascii="Arial" w:hAnsi="Arial"/>
+                <w:b/>
+                <w:color w:val="1F2937"/>
+                <w:sz w:val="21"/>
+              </w:rPr>
+              <w:t>Purpose in Report</w:t>
+            </w:r>
+          </w:p>
+        </w:tc>
+      </w:tr>
+      <w:tr>
+        <w:tc>
+          <w:tcPr>
+            <w:tcW w:type="dxa" w:w="3154"/>
+            <w:vAlign w:val="center"/>
+          </w:tcPr>
+          <w:p>
+            <w:pPr>
+              <w:jc w:val="left"/>
+            </w:pPr>
+            <w:r/>
+            <w:r>
+              <w:rPr>
+                <w:rFonts w:ascii="Arial" w:hAnsi="Arial"/>
+                <w:b w:val="0"/>
+                <w:color w:val="1F2937"/>
+                <w:sz w:val="21"/>
+              </w:rPr>
+              <w:t>Figure 1</w:t>
+            </w:r>
+          </w:p>
+        </w:tc>
+        <w:tc>
+          <w:tcPr>
+            <w:tcW w:type="dxa" w:w="3154"/>
+            <w:vAlign w:val="center"/>
+          </w:tcPr>
+          <w:p>
+            <w:pPr>
+              <w:jc w:val="left"/>
+            </w:pPr>
+            <w:r/>
+            <w:r>
+              <w:rPr>
+                <w:rFonts w:ascii="Arial" w:hAnsi="Arial"/>
+                <w:b w:val="0"/>
+                <w:color w:val="1F2937"/>
+                <w:sz w:val="20"/>
+              </w:rPr>
+              <w:t>Python merged dataset preview</w:t>
+            </w:r>
+          </w:p>
+        </w:tc>
+        <w:tc>
+          <w:tcPr>
+            <w:tcW w:type="dxa" w:w="3154"/>
+            <w:vAlign w:val="center"/>
+          </w:tcPr>
+          <w:p>
+            <w:pPr>
+              <w:jc w:val="left"/>
+            </w:pPr>
+            <w:r/>
+            <w:r>
+              <w:rPr>
+                <w:rFonts w:ascii="Arial" w:hAnsi="Arial"/>
+                <w:b w:val="0"/>
+                <w:color w:val="1F2937"/>
+                <w:sz w:val="20"/>
+              </w:rPr>
+              <w:t>Shows the integrated analytical base table before feature engineering.</w:t>
+            </w:r>
+          </w:p>
+        </w:tc>
+      </w:tr>
+      <w:tr>
+        <w:tc>
+          <w:tcPr>
+            <w:tcW w:type="dxa" w:w="3154"/>
+            <w:vAlign w:val="center"/>
+          </w:tcPr>
+          <w:p>
+            <w:pPr>
+              <w:jc w:val="left"/>
+            </w:pPr>
+            <w:r/>
+            <w:r>
+              <w:rPr>
+                <w:rFonts w:ascii="Arial" w:hAnsi="Arial"/>
+                <w:b w:val="0"/>
+                <w:color w:val="1F2937"/>
+                <w:sz w:val="21"/>
+              </w:rPr>
+              <w:t>Figure 2</w:t>
+            </w:r>
+          </w:p>
+        </w:tc>
+        <w:tc>
+          <w:tcPr>
+            <w:tcW w:type="dxa" w:w="3154"/>
+            <w:vAlign w:val="center"/>
+          </w:tcPr>
+          <w:p>
+            <w:pPr>
+              <w:jc w:val="left"/>
+            </w:pPr>
+            <w:r/>
+            <w:r>
+              <w:rPr>
+                <w:rFonts w:ascii="Arial" w:hAnsi="Arial"/>
+                <w:b w:val="0"/>
+                <w:color w:val="1F2937"/>
+                <w:sz w:val="20"/>
+              </w:rPr>
+              <w:t>Hub reliability SQL query</w:t>
+            </w:r>
+          </w:p>
+        </w:tc>
+        <w:tc>
+          <w:tcPr>
+            <w:tcW w:type="dxa" w:w="3154"/>
+            <w:vAlign w:val="center"/>
+          </w:tcPr>
+          <w:p>
+            <w:pPr>
+              <w:jc w:val="left"/>
+            </w:pPr>
+            <w:r/>
+            <w:r>
+              <w:rPr>
+                <w:rFonts w:ascii="Arial" w:hAnsi="Arial"/>
+                <w:b w:val="0"/>
+                <w:color w:val="1F2937"/>
+                <w:sz w:val="20"/>
+              </w:rPr>
+              <w:t>Ranks hubs by non-on-time share and failed-delivery share.</w:t>
+            </w:r>
+          </w:p>
+        </w:tc>
+      </w:tr>
+      <w:tr>
+        <w:tc>
+          <w:tcPr>
+            <w:tcW w:type="dxa" w:w="3154"/>
+            <w:vAlign w:val="center"/>
+          </w:tcPr>
+          <w:p>
+            <w:pPr>
+              <w:jc w:val="left"/>
+            </w:pPr>
+            <w:r/>
+            <w:r>
+              <w:rPr>
+                <w:rFonts w:ascii="Arial" w:hAnsi="Arial"/>
+                <w:b w:val="0"/>
+                <w:color w:val="1F2937"/>
+                <w:sz w:val="21"/>
+              </w:rPr>
+              <w:t>Figure 3</w:t>
+            </w:r>
+          </w:p>
+        </w:tc>
+        <w:tc>
+          <w:tcPr>
+            <w:tcW w:type="dxa" w:w="3154"/>
+            <w:vAlign w:val="center"/>
+          </w:tcPr>
+          <w:p>
+            <w:pPr>
+              <w:jc w:val="left"/>
+            </w:pPr>
+            <w:r/>
+            <w:r>
+              <w:rPr>
+                <w:rFonts w:ascii="Arial" w:hAnsi="Arial"/>
+                <w:b w:val="0"/>
+                <w:color w:val="1F2937"/>
+                <w:sz w:val="20"/>
+              </w:rPr>
+              <w:t>Missing delivery link SQL query</w:t>
+            </w:r>
+          </w:p>
+        </w:tc>
+        <w:tc>
+          <w:tcPr>
+            <w:tcW w:type="dxa" w:w="3154"/>
+            <w:vAlign w:val="center"/>
+          </w:tcPr>
+          <w:p>
+            <w:pPr>
+              <w:jc w:val="left"/>
+            </w:pPr>
+            <w:r/>
+            <w:r>
+              <w:rPr>
+                <w:rFonts w:ascii="Arial" w:hAnsi="Arial"/>
+                <w:b w:val="0"/>
+                <w:color w:val="1F2937"/>
+                <w:sz w:val="20"/>
+              </w:rPr>
+              <w:t>Shows the 300-order visibility gap distributed across service types.</w:t>
+            </w:r>
+          </w:p>
+        </w:tc>
+      </w:tr>
+      <w:tr>
+        <w:tc>
+          <w:tcPr>
+            <w:tcW w:type="dxa" w:w="3154"/>
+            <w:vAlign w:val="center"/>
+          </w:tcPr>
+          <w:p>
+            <w:pPr>
+              <w:jc w:val="left"/>
+            </w:pPr>
+            <w:r/>
+            <w:r>
+              <w:rPr>
+                <w:rFonts w:ascii="Arial" w:hAnsi="Arial"/>
+                <w:b w:val="0"/>
+                <w:color w:val="1F2937"/>
+                <w:sz w:val="21"/>
+              </w:rPr>
+              <w:t>Figure 4</w:t>
+            </w:r>
+          </w:p>
+        </w:tc>
+        <w:tc>
+          <w:tcPr>
+            <w:tcW w:type="dxa" w:w="3154"/>
+            <w:vAlign w:val="center"/>
+          </w:tcPr>
+          <w:p>
+            <w:pPr>
+              <w:jc w:val="left"/>
+            </w:pPr>
+            <w:r/>
+            <w:r>
+              <w:rPr>
+                <w:rFonts w:ascii="Arial" w:hAnsi="Arial"/>
+                <w:b w:val="0"/>
+                <w:color w:val="1F2937"/>
+                <w:sz w:val="20"/>
+              </w:rPr>
+              <w:t>Zone performance table</w:t>
+            </w:r>
+          </w:p>
+        </w:tc>
+        <w:tc>
+          <w:tcPr>
+            <w:tcW w:type="dxa" w:w="3154"/>
+            <w:vAlign w:val="center"/>
+          </w:tcPr>
+          <w:p>
+            <w:pPr>
+              <w:jc w:val="left"/>
+            </w:pPr>
+            <w:r/>
+            <w:r>
+              <w:rPr>
+                <w:rFonts w:ascii="Arial" w:hAnsi="Arial"/>
+                <w:b w:val="0"/>
+                <w:color w:val="1F2937"/>
+                <w:sz w:val="20"/>
+              </w:rPr>
+              <w:t>Summarises cleaned zone-level outcome rates.</w:t>
+            </w:r>
+          </w:p>
+        </w:tc>
+      </w:tr>
+      <w:tr>
+        <w:tc>
+          <w:tcPr>
+            <w:tcW w:type="dxa" w:w="3154"/>
+            <w:vAlign w:val="center"/>
+          </w:tcPr>
+          <w:p>
+            <w:pPr>
+              <w:jc w:val="left"/>
+            </w:pPr>
+            <w:r/>
+            <w:r>
+              <w:rPr>
+                <w:rFonts w:ascii="Arial" w:hAnsi="Arial"/>
+                <w:b w:val="0"/>
+                <w:color w:val="1F2937"/>
+                <w:sz w:val="21"/>
+              </w:rPr>
+              <w:t>Figure 5</w:t>
+            </w:r>
+          </w:p>
+        </w:tc>
+        <w:tc>
+          <w:tcPr>
+            <w:tcW w:type="dxa" w:w="3154"/>
+            <w:vAlign w:val="center"/>
+          </w:tcPr>
+          <w:p>
+            <w:pPr>
+              <w:jc w:val="left"/>
+            </w:pPr>
+            <w:r/>
+            <w:r>
+              <w:rPr>
+                <w:rFonts w:ascii="Arial" w:hAnsi="Arial"/>
+                <w:b w:val="0"/>
+                <w:color w:val="1F2937"/>
+                <w:sz w:val="20"/>
+              </w:rPr>
+              <w:t>Failed delivery by zone chart</w:t>
+            </w:r>
+          </w:p>
+        </w:tc>
+        <w:tc>
+          <w:tcPr>
+            <w:tcW w:type="dxa" w:w="3154"/>
+            <w:vAlign w:val="center"/>
+          </w:tcPr>
+          <w:p>
+            <w:pPr>
+              <w:jc w:val="left"/>
+            </w:pPr>
+            <w:r/>
+            <w:r>
+              <w:rPr>
+                <w:rFonts w:ascii="Arial" w:hAnsi="Arial"/>
+                <w:b w:val="0"/>
+                <w:color w:val="1F2937"/>
+                <w:sz w:val="20"/>
+              </w:rPr>
+              <w:t>Highlights Central as the weakest zone.</w:t>
+            </w:r>
+          </w:p>
+        </w:tc>
+      </w:tr>
+      <w:tr>
+        <w:tc>
+          <w:tcPr>
+            <w:tcW w:type="dxa" w:w="3154"/>
+            <w:vAlign w:val="center"/>
+          </w:tcPr>
+          <w:p>
+            <w:pPr>
+              <w:jc w:val="left"/>
+            </w:pPr>
+            <w:r/>
+            <w:r>
+              <w:rPr>
+                <w:rFonts w:ascii="Arial" w:hAnsi="Arial"/>
+                <w:b w:val="0"/>
+                <w:color w:val="1F2937"/>
+                <w:sz w:val="21"/>
+              </w:rPr>
+              <w:t>Figure 6</w:t>
+            </w:r>
+          </w:p>
+        </w:tc>
+        <w:tc>
+          <w:tcPr>
+            <w:tcW w:type="dxa" w:w="3154"/>
+            <w:vAlign w:val="center"/>
+          </w:tcPr>
+          <w:p>
+            <w:pPr>
+              <w:jc w:val="left"/>
+            </w:pPr>
+            <w:r/>
+            <w:r>
+              <w:rPr>
+                <w:rFonts w:ascii="Arial" w:hAnsi="Arial"/>
+                <w:b w:val="0"/>
+                <w:color w:val="1F2937"/>
+                <w:sz w:val="20"/>
+              </w:rPr>
+              <w:t>Complaint mix chart</w:t>
+            </w:r>
+          </w:p>
+        </w:tc>
+        <w:tc>
+          <w:tcPr>
+            <w:tcW w:type="dxa" w:w="3154"/>
+            <w:vAlign w:val="center"/>
+          </w:tcPr>
+          <w:p>
+            <w:pPr>
+              <w:jc w:val="left"/>
+            </w:pPr>
+            <w:r/>
+            <w:r>
+              <w:rPr>
+                <w:rFonts w:ascii="Arial" w:hAnsi="Arial"/>
+                <w:b w:val="0"/>
+                <w:color w:val="1F2937"/>
+                <w:sz w:val="20"/>
+              </w:rPr>
+              <w:t>Demonstrates dissatisfaction beyond failed deliveries alone.</w:t>
+            </w:r>
+          </w:p>
+        </w:tc>
+      </w:tr>
+      <w:tr>
+        <w:tc>
+          <w:tcPr>
+            <w:tcW w:type="dxa" w:w="3154"/>
+            <w:vAlign w:val="center"/>
+          </w:tcPr>
+          <w:p>
+            <w:pPr>
+              <w:jc w:val="left"/>
+            </w:pPr>
+            <w:r/>
+            <w:r>
+              <w:rPr>
+                <w:rFonts w:ascii="Arial" w:hAnsi="Arial"/>
+                <w:b w:val="0"/>
+                <w:color w:val="1F2937"/>
+                <w:sz w:val="21"/>
+              </w:rPr>
+              <w:t>Figure 7</w:t>
+            </w:r>
+          </w:p>
+        </w:tc>
+        <w:tc>
+          <w:tcPr>
+            <w:tcW w:type="dxa" w:w="3154"/>
+            <w:vAlign w:val="center"/>
+          </w:tcPr>
+          <w:p>
+            <w:pPr>
+              <w:jc w:val="left"/>
+            </w:pPr>
+            <w:r/>
+            <w:r>
+              <w:rPr>
+                <w:rFonts w:ascii="Arial" w:hAnsi="Arial"/>
+                <w:b w:val="0"/>
+                <w:color w:val="1F2937"/>
+                <w:sz w:val="20"/>
+              </w:rPr>
+              <w:t>Proof-of-completion risk table</w:t>
+            </w:r>
+          </w:p>
+        </w:tc>
+        <w:tc>
+          <w:tcPr>
+            <w:tcW w:type="dxa" w:w="3154"/>
+            <w:vAlign w:val="center"/>
+          </w:tcPr>
+          <w:p>
+            <w:pPr>
+              <w:jc w:val="left"/>
+            </w:pPr>
+            <w:r/>
+            <w:r>
+              <w:rPr>
+                <w:rFonts w:ascii="Arial" w:hAnsi="Arial"/>
+                <w:b w:val="0"/>
+                <w:color w:val="1F2937"/>
+                <w:sz w:val="20"/>
+              </w:rPr>
+              <w:t>Quantifies the performance penalty when proof is missing.</w:t>
+            </w:r>
+          </w:p>
+        </w:tc>
+      </w:tr>
+      <w:tr>
+        <w:tc>
+          <w:tcPr>
+            <w:tcW w:type="dxa" w:w="3154"/>
+            <w:vAlign w:val="center"/>
+          </w:tcPr>
+          <w:p>
+            <w:pPr>
+              <w:jc w:val="left"/>
+            </w:pPr>
+            <w:r/>
+            <w:r>
+              <w:rPr>
+                <w:rFonts w:ascii="Arial" w:hAnsi="Arial"/>
+                <w:b w:val="0"/>
+                <w:color w:val="1F2937"/>
+                <w:sz w:val="21"/>
+              </w:rPr>
+              <w:t>Figure 8</w:t>
+            </w:r>
+          </w:p>
+        </w:tc>
+        <w:tc>
+          <w:tcPr>
+            <w:tcW w:type="dxa" w:w="3154"/>
+            <w:vAlign w:val="center"/>
+          </w:tcPr>
+          <w:p>
+            <w:pPr>
+              <w:jc w:val="left"/>
+            </w:pPr>
+            <w:r/>
+            <w:r>
+              <w:rPr>
+                <w:rFonts w:ascii="Arial" w:hAnsi="Arial"/>
+                <w:b w:val="0"/>
+                <w:color w:val="1F2937"/>
+                <w:sz w:val="20"/>
+              </w:rPr>
+              <w:t>Maintenance performance table</w:t>
+            </w:r>
+          </w:p>
+        </w:tc>
+        <w:tc>
+          <w:tcPr>
+            <w:tcW w:type="dxa" w:w="3154"/>
+            <w:vAlign w:val="center"/>
+          </w:tcPr>
+          <w:p>
+            <w:pPr>
+              <w:jc w:val="left"/>
+            </w:pPr>
+            <w:r/>
+            <w:r>
+              <w:rPr>
+                <w:rFonts w:ascii="Arial" w:hAnsi="Arial"/>
+                <w:b w:val="0"/>
+                <w:color w:val="1F2937"/>
+                <w:sz w:val="20"/>
+              </w:rPr>
+              <w:t>Shows the operational cost of using InRepair vehicles.</w:t>
+            </w:r>
+          </w:p>
+        </w:tc>
+      </w:tr>
+      <w:tr>
+        <w:tc>
+          <w:tcPr>
+            <w:tcW w:type="dxa" w:w="3154"/>
+            <w:vAlign w:val="center"/>
+          </w:tcPr>
+          <w:p>
+            <w:pPr>
+              <w:jc w:val="left"/>
+            </w:pPr>
+            <w:r/>
+            <w:r>
+              <w:rPr>
+                <w:rFonts w:ascii="Arial" w:hAnsi="Arial"/>
+                <w:b w:val="0"/>
+                <w:color w:val="1F2937"/>
+                <w:sz w:val="21"/>
+              </w:rPr>
+              <w:t>Figure 9</w:t>
+            </w:r>
+          </w:p>
+        </w:tc>
+        <w:tc>
+          <w:tcPr>
+            <w:tcW w:type="dxa" w:w="3154"/>
+            <w:vAlign w:val="center"/>
+          </w:tcPr>
+          <w:p>
+            <w:pPr>
+              <w:jc w:val="left"/>
+            </w:pPr>
+            <w:r/>
+            <w:r>
+              <w:rPr>
+                <w:rFonts w:ascii="Arial" w:hAnsi="Arial"/>
+                <w:b w:val="0"/>
+                <w:color w:val="1F2937"/>
+                <w:sz w:val="20"/>
+              </w:rPr>
+              <w:t>Complaint intensity by hub chart</w:t>
+            </w:r>
+          </w:p>
+        </w:tc>
+        <w:tc>
+          <w:tcPr>
+            <w:tcW w:type="dxa" w:w="3154"/>
+            <w:vAlign w:val="center"/>
+          </w:tcPr>
+          <w:p>
+            <w:pPr>
+              <w:jc w:val="left"/>
+            </w:pPr>
+            <w:r/>
+            <w:r>
+              <w:rPr>
+                <w:rFonts w:ascii="Arial" w:hAnsi="Arial"/>
+                <w:b w:val="0"/>
+                <w:color w:val="1F2937"/>
+                <w:sz w:val="20"/>
+              </w:rPr>
+              <w:t>Normalises complaints by delivery volume.</w:t>
+            </w:r>
+          </w:p>
+        </w:tc>
+      </w:tr>
+      <w:tr>
+        <w:tc>
+          <w:tcPr>
+            <w:tcW w:type="dxa" w:w="3154"/>
+            <w:vAlign w:val="center"/>
+          </w:tcPr>
+          <w:p>
+            <w:pPr>
+              <w:jc w:val="left"/>
+            </w:pPr>
+            <w:r/>
+            <w:r>
+              <w:rPr>
+                <w:rFonts w:ascii="Arial" w:hAnsi="Arial"/>
+                <w:b w:val="0"/>
+                <w:color w:val="1F2937"/>
+                <w:sz w:val="21"/>
+              </w:rPr>
+              <w:t>Figure 10</w:t>
+            </w:r>
+          </w:p>
+        </w:tc>
+        <w:tc>
+          <w:tcPr>
+            <w:tcW w:type="dxa" w:w="3154"/>
+            <w:vAlign w:val="center"/>
+          </w:tcPr>
+          <w:p>
+            <w:pPr>
+              <w:jc w:val="left"/>
+            </w:pPr>
+            <w:r/>
+            <w:r>
+              <w:rPr>
+                <w:rFonts w:ascii="Arial" w:hAnsi="Arial"/>
+                <w:b w:val="0"/>
+                <w:color w:val="1F2937"/>
+                <w:sz w:val="20"/>
+              </w:rPr>
+              <w:t>App latency chart</w:t>
+            </w:r>
+          </w:p>
+        </w:tc>
+        <w:tc>
+          <w:tcPr>
+            <w:tcW w:type="dxa" w:w="3154"/>
+            <w:vAlign w:val="center"/>
+          </w:tcPr>
+          <w:p>
+            <w:pPr>
+              <w:jc w:val="left"/>
+            </w:pPr>
+            <w:r/>
+            <w:r>
+              <w:rPr>
+                <w:rFonts w:ascii="Arial" w:hAnsi="Arial"/>
+                <w:b w:val="0"/>
+                <w:color w:val="1F2937"/>
+                <w:sz w:val="20"/>
+              </w:rPr>
+              <w:t>Shows the digital-service dimension of the customer experience problem.</w:t>
+            </w:r>
+          </w:p>
+        </w:tc>
+      </w:tr>
+      <w:tr>
+        <w:tc>
+          <w:tcPr>
+            <w:tcW w:type="dxa" w:w="3154"/>
+            <w:vAlign w:val="center"/>
+          </w:tcPr>
+          <w:p>
+            <w:pPr>
+              <w:jc w:val="left"/>
+            </w:pPr>
+            <w:r/>
+            <w:r>
+              <w:rPr>
+                <w:rFonts w:ascii="Arial" w:hAnsi="Arial"/>
+                <w:b w:val="0"/>
+                <w:color w:val="1F2937"/>
+                <w:sz w:val="21"/>
+              </w:rPr>
+              <w:t>Figure 11</w:t>
+            </w:r>
+          </w:p>
+        </w:tc>
+        <w:tc>
+          <w:tcPr>
+            <w:tcW w:type="dxa" w:w="3154"/>
+            <w:vAlign w:val="center"/>
+          </w:tcPr>
+          <w:p>
+            <w:pPr>
+              <w:jc w:val="left"/>
+            </w:pPr>
+            <w:r/>
+            <w:r>
+              <w:rPr>
+                <w:rFonts w:ascii="Arial" w:hAnsi="Arial"/>
+                <w:b w:val="0"/>
+                <w:color w:val="1F2937"/>
+                <w:sz w:val="20"/>
+              </w:rPr>
+              <w:t>Profitability chart</w:t>
+            </w:r>
+          </w:p>
+        </w:tc>
+        <w:tc>
+          <w:tcPr>
+            <w:tcW w:type="dxa" w:w="3154"/>
+            <w:vAlign w:val="center"/>
+          </w:tcPr>
+          <w:p>
+            <w:pPr>
+              <w:jc w:val="left"/>
+            </w:pPr>
+            <w:r/>
+            <w:r>
+              <w:rPr>
+                <w:rFonts w:ascii="Arial" w:hAnsi="Arial"/>
+                <w:b w:val="0"/>
+                <w:color w:val="1F2937"/>
+                <w:sz w:val="20"/>
+              </w:rPr>
+              <w:t>Demonstrates why financial success alone can hide operational weakness.</w:t>
+            </w:r>
+          </w:p>
+        </w:tc>
+      </w:tr>
+      <w:tr>
+        <w:tc>
+          <w:tcPr>
+            <w:tcW w:type="dxa" w:w="3154"/>
+            <w:vAlign w:val="center"/>
+          </w:tcPr>
+          <w:p>
+            <w:pPr>
+              <w:jc w:val="left"/>
+            </w:pPr>
+            <w:r/>
+            <w:r>
+              <w:rPr>
+                <w:rFonts w:ascii="Arial" w:hAnsi="Arial"/>
+                <w:b w:val="0"/>
+                <w:color w:val="1F2937"/>
+                <w:sz w:val="21"/>
+              </w:rPr>
+              <w:t>Figure 12</w:t>
+            </w:r>
+          </w:p>
+        </w:tc>
+        <w:tc>
+          <w:tcPr>
+            <w:tcW w:type="dxa" w:w="3154"/>
+            <w:vAlign w:val="center"/>
+          </w:tcPr>
+          <w:p>
+            <w:pPr>
+              <w:jc w:val="left"/>
+            </w:pPr>
+            <w:r/>
+            <w:r>
+              <w:rPr>
+                <w:rFonts w:ascii="Arial" w:hAnsi="Arial"/>
+                <w:b w:val="0"/>
+                <w:color w:val="1F2937"/>
+                <w:sz w:val="20"/>
+              </w:rPr>
+              <w:t>MongoDB case document</w:t>
+            </w:r>
+          </w:p>
+        </w:tc>
+        <w:tc>
+          <w:tcPr>
+            <w:tcW w:type="dxa" w:w="3154"/>
+            <w:vAlign w:val="center"/>
+          </w:tcPr>
+          <w:p>
+            <w:pPr>
+              <w:jc w:val="left"/>
+            </w:pPr>
+            <w:r/>
+            <w:r>
+              <w:rPr>
+                <w:rFonts w:ascii="Arial" w:hAnsi="Arial"/>
+                <w:b w:val="0"/>
+                <w:color w:val="1F2937"/>
+                <w:sz w:val="20"/>
+              </w:rPr>
+              <w:t>Illustrates the proposed nested document structure.</w:t>
+            </w:r>
+          </w:p>
+        </w:tc>
+      </w:tr>
+      <w:tr>
+        <w:tc>
+          <w:tcPr>
+            <w:tcW w:type="dxa" w:w="3154"/>
+            <w:vAlign w:val="center"/>
+          </w:tcPr>
+          <w:p>
+            <w:pPr>
+              <w:jc w:val="left"/>
+            </w:pPr>
+            <w:r/>
+            <w:r>
+              <w:rPr>
+                <w:rFonts w:ascii="Arial" w:hAnsi="Arial"/>
+                <w:b w:val="0"/>
+                <w:color w:val="1F2937"/>
+                <w:sz w:val="21"/>
+              </w:rPr>
+              <w:t>Figure 13</w:t>
+            </w:r>
+          </w:p>
+        </w:tc>
+        <w:tc>
+          <w:tcPr>
+            <w:tcW w:type="dxa" w:w="3154"/>
+            <w:vAlign w:val="center"/>
+          </w:tcPr>
+          <w:p>
+            <w:pPr>
+              <w:jc w:val="left"/>
+            </w:pPr>
+            <w:r/>
+            <w:r>
+              <w:rPr>
+                <w:rFonts w:ascii="Arial" w:hAnsi="Arial"/>
+                <w:b w:val="0"/>
+                <w:color w:val="1F2937"/>
+                <w:sz w:val="20"/>
+              </w:rPr>
+              <w:t>MongoDB index design</w:t>
+            </w:r>
+          </w:p>
+        </w:tc>
+        <w:tc>
+          <w:tcPr>
+            <w:tcW w:type="dxa" w:w="3154"/>
+            <w:vAlign w:val="center"/>
+          </w:tcPr>
+          <w:p>
+            <w:pPr>
+              <w:jc w:val="left"/>
+            </w:pPr>
+            <w:r/>
+            <w:r>
+              <w:rPr>
+                <w:rFonts w:ascii="Arial" w:hAnsi="Arial"/>
+                <w:b w:val="0"/>
+                <w:color w:val="1F2937"/>
+                <w:sz w:val="20"/>
+              </w:rPr>
+              <w:t>Shows the index set aligned to real case-investigation queries.</w:t>
+            </w:r>
+          </w:p>
+        </w:tc>
+      </w:tr>
+      <w:tr>
+        <w:tc>
+          <w:tcPr>
+            <w:tcW w:type="dxa" w:w="3154"/>
+            <w:vAlign w:val="center"/>
+          </w:tcPr>
+          <w:p>
+            <w:pPr>
+              <w:jc w:val="left"/>
+            </w:pPr>
+            <w:r/>
+            <w:r>
+              <w:rPr>
+                <w:rFonts w:ascii="Arial" w:hAnsi="Arial"/>
+                <w:b w:val="0"/>
+                <w:color w:val="1F2937"/>
+                <w:sz w:val="21"/>
+              </w:rPr>
+              <w:t>Figure 14</w:t>
+            </w:r>
+          </w:p>
+        </w:tc>
+        <w:tc>
+          <w:tcPr>
+            <w:tcW w:type="dxa" w:w="3154"/>
+            <w:vAlign w:val="center"/>
+          </w:tcPr>
+          <w:p>
+            <w:pPr>
+              <w:jc w:val="left"/>
+            </w:pPr>
+            <w:r/>
+            <w:r>
+              <w:rPr>
+                <w:rFonts w:ascii="Arial" w:hAnsi="Arial"/>
+                <w:b w:val="0"/>
+                <w:color w:val="1F2937"/>
+                <w:sz w:val="20"/>
+              </w:rPr>
+              <w:t>MongoDB aggregation output</w:t>
+            </w:r>
+          </w:p>
+        </w:tc>
+        <w:tc>
+          <w:tcPr>
+            <w:tcW w:type="dxa" w:w="3154"/>
+            <w:vAlign w:val="center"/>
+          </w:tcPr>
+          <w:p>
+            <w:pPr>
+              <w:jc w:val="left"/>
+            </w:pPr>
+            <w:r/>
+            <w:r>
+              <w:rPr>
+                <w:rFonts w:ascii="Arial" w:hAnsi="Arial"/>
+                <w:b w:val="0"/>
+                <w:color w:val="1F2937"/>
+                <w:sz w:val="20"/>
+              </w:rPr>
+              <w:t>Demonstrates delayed or failed open-case triage.</w:t>
+            </w:r>
+          </w:p>
+        </w:tc>
+      </w:tr>
+    </w:tbl>
+    <w:p/>
+    <w:p>
+      <w:pPr>
+        <w:pStyle w:val="Heading1"/>
+      </w:pPr>
+      <w:r>
+        <w:t>Appendix B: Output Files Generated</w:t>
+      </w:r>
+    </w:p>
+    <w:p>
+      <w:pPr>
+        <w:pStyle w:val="ListBullet"/>
+      </w:pPr>
+      <w:r>
+        <w:t>Executed SQL in R notebook: notebooks/01_northstar_sql_r_analytics.ipynb</w:t>
+      </w:r>
+    </w:p>
+    <w:p>
+      <w:pPr>
+        <w:pStyle w:val="ListBullet"/>
+      </w:pPr>
+      <w:r>
+        <w:t>Executed Python and MongoDB notebook: notebooks/02_northstar_python_mongodb_solution.ipynb</w:t>
+      </w:r>
+    </w:p>
+    <w:p>
+      <w:pPr>
+        <w:pStyle w:val="ListBullet"/>
+      </w:pPr>
+      <w:r>
+        <w:t>Notebook HTML exports: notebooks/html/01_northstar_sql_r_analytics.html and notebooks/html/02_northstar_python_mongodb_solution.html</w:t>
+      </w:r>
+    </w:p>
+    <w:p>
+      <w:pPr>
+        <w:pStyle w:val="ListBullet"/>
+      </w:pPr>
+      <w:r>
+        <w:t>Structured analytical outputs: artifacts/outputs/*.csv</w:t>
+      </w:r>
+    </w:p>
+    <w:p>
+      <w:pPr>
+        <w:pStyle w:val="ListBullet"/>
+      </w:pPr>
+      <w:r>
+        <w:t>Evidence figures used in the report: report/assets/evidence/*.png</w:t>
+      </w:r>
+    </w:p>
+    <w:p>
+      <w:pPr>
+        <w:pStyle w:val="ListBullet"/>
+      </w:pPr>
+      <w:r>
+        <w:t>Main coursework report deliverable: report/northstar_assignment_report.docx</w:t>
       </w:r>
     </w:p>
     <w:sectPr>
       <w:footerReference w:type="default" r:id="rId9"/>
       <w:pgSz w:w="11909" w:h="16834"/>
-      <w:pgMar w:top="1296" w:right="1296" w:bottom="1152" w:left="1296" w:header="720" w:footer="720" w:gutter="0"/>
+      <w:pgMar w:top="1152" w:right="1224" w:bottom="1152" w:left="1224" w:header="720" w:footer="720" w:gutter="0"/>
       <w:cols w:space="720"/>
       <w:docGrid w:linePitch="360"/>
     </w:sectPr>
@@ -1410,7 +4698,7 @@
         <w:color w:val="5F6368"/>
         <w:sz w:val="18"/>
       </w:rPr>
-      <w:t xml:space="preserve">NorthStar Assignment Report | Page </w:t>
+      <w:t xml:space="preserve">NorthStar Databases and Analytics Coursework | Page </w:t>
     </w:r>
     <w:r>
       <w:fldChar w:fldCharType="begin"/>
@@ -1423,7 +4711,7 @@
         <w:color w:val="5F6368"/>
         <w:sz w:val="18"/>
       </w:rPr>
-      <w:t xml:space="preserve">NorthStar Assignment Report | Page </w:t>
+      <w:t xml:space="preserve">NorthStar Databases and Analytics Coursework | Page </w:t>
     </w:r>
     <w:r>
       <w:fldChar w:fldCharType="begin"/>
@@ -1861,7 +5149,7 @@
     <w:pPr>
       <w:keepNext/>
       <w:keepLines/>
-      <w:spacing w:before="200" w:after="120"/>
+      <w:spacing w:before="240" w:after="120"/>
       <w:outlineLvl w:val="0"/>
     </w:pPr>
     <w:rPr>
@@ -1885,7 +5173,7 @@
     <w:pPr>
       <w:keepNext/>
       <w:keepLines/>
-      <w:spacing w:before="200" w:after="120"/>
+      <w:spacing w:before="240" w:after="120"/>
       <w:outlineLvl w:val="1"/>
     </w:pPr>
     <w:rPr>
@@ -1909,7 +5197,7 @@
     <w:pPr>
       <w:keepNext/>
       <w:keepLines/>
-      <w:spacing w:before="200" w:after="120"/>
+      <w:spacing w:before="240" w:after="120"/>
       <w:outlineLvl w:val="2"/>
     </w:pPr>
     <w:rPr>
@@ -2160,7 +5448,7 @@
       <w:color w:val="1F2937"/>
       <w:spacing w:val="5"/>
       <w:kern w:val="28"/>
-      <w:sz w:val="44"/>
+      <w:sz w:val="48"/>
       <w:szCs w:val="52"/>
     </w:rPr>
   </w:style>
@@ -2191,7 +5479,7 @@
       <w:numPr>
         <w:ilvl w:val="1"/>
       </w:numPr>
-      <w:spacing w:before="200" w:after="120"/>
+      <w:spacing w:before="240" w:after="120"/>
     </w:pPr>
     <w:rPr>
       <w:rFonts w:asciiTheme="majorHAnsi" w:eastAsiaTheme="majorEastAsia" w:hAnsiTheme="majorHAnsi" w:cstheme="majorBidi" w:ascii="Arial" w:hAnsi="Arial"/>

</xml_diff>

<commit_message>
Add live Atlas evidence to NorthStar report
</commit_message>
<xml_diff>
--- a/report/northstar_assignment_report.docx
+++ b/report/northstar_assignment_report.docx
@@ -38,7 +38,7 @@
           <w:color w:val="1F2937"/>
           <w:sz w:val="22"/>
         </w:rPr>
-        <w:t>Student Name: [Add your name]</w:t>
+        <w:t>Student Name: Danish Kayani</w:t>
       </w:r>
     </w:p>
     <w:p>
@@ -51,7 +51,7 @@
           <w:color w:val="1F2937"/>
           <w:sz w:val="22"/>
         </w:rPr>
-        <w:t>Student ID: [Add your student ID]</w:t>
+        <w:t>Student ID: 33114292</w:t>
       </w:r>
     </w:p>
     <w:p>
@@ -129,7 +129,7 @@
           <w:color w:val="1F2937"/>
           <w:sz w:val="22"/>
         </w:rPr>
-        <w:t>GitHub Repository: [Add GitHub repo link after upload]</w:t>
+        <w:t>GitHub Repository: To be inserted after final repository upload</w:t>
       </w:r>
     </w:p>
     <w:p>
@@ -427,7 +427,7 @@
         <w:rPr>
           <w:sz w:val="21"/>
         </w:rPr>
-        <w:t>Figure 12. Proposed MongoDB customer case document.</w:t>
+        <w:t>Figure 12. Live MongoDB Atlas cluster overview for NorthStarCluster.</w:t>
       </w:r>
     </w:p>
     <w:p>
@@ -438,7 +438,7 @@
         <w:rPr>
           <w:sz w:val="21"/>
         </w:rPr>
-        <w:t>Figure 13. MongoDB index design evidence.</w:t>
+        <w:t>Figure 13. Live Atlas Data Explorer showing the loaded northstar_assignment database.</w:t>
       </w:r>
     </w:p>
     <w:p>
@@ -449,7 +449,40 @@
         <w:rPr>
           <w:sz w:val="21"/>
         </w:rPr>
-        <w:t>Figure 14. MongoDB aggregation output for delayed or failed open cases.</w:t>
+        <w:t>Figure 14. Live Atlas query and explain output from the real MongoDB deployment.</w:t>
+      </w:r>
+    </w:p>
+    <w:p>
+      <w:pPr>
+        <w:ind w:left="216"/>
+      </w:pPr>
+      <w:r>
+        <w:rPr>
+          <w:sz w:val="21"/>
+        </w:rPr>
+        <w:t>Figure 15. Proposed MongoDB customer case document.</w:t>
+      </w:r>
+    </w:p>
+    <w:p>
+      <w:pPr>
+        <w:ind w:left="216"/>
+      </w:pPr>
+      <w:r>
+        <w:rPr>
+          <w:sz w:val="21"/>
+        </w:rPr>
+        <w:t>Figure 16. MongoDB index design evidence.</w:t>
+      </w:r>
+    </w:p>
+    <w:p>
+      <w:pPr>
+        <w:ind w:left="216"/>
+      </w:pPr>
+      <w:r>
+        <w:rPr>
+          <w:sz w:val="21"/>
+        </w:rPr>
+        <w:t>Figure 17. MongoDB aggregation output for delayed or failed open cases.</w:t>
       </w:r>
     </w:p>
     <w:p>
@@ -2859,7 +2892,194 @@
         <w:pStyle w:val="Heading2"/>
       </w:pPr>
       <w:r>
-        <w:t>5.3 Example Nested Case Document</w:t>
+        <w:t>5.3 Live MongoDB Atlas Implementation</w:t>
+      </w:r>
+    </w:p>
+    <w:p>
+      <w:r>
+        <w:t>The design in this chapter was not left at proposal level. A live MongoDB Atlas free-tier cluster named `NorthStarCluster` was created in AWS Ireland (`eu-west-1`), the `northstar_assignment` database was populated with the coursework dataset, and operational indexes were created against the actual collections used in the written analysis. This matters academically because it demonstrates that the document model, index strategy, and query logic were implemented in a real MongoDB environment rather than described only in theory.</w:t>
+      </w:r>
+    </w:p>
+    <w:p>
+      <w:pPr>
+        <w:jc w:val="center"/>
+      </w:pPr>
+      <w:r>
+        <w:drawing>
+          <wp:inline xmlns:a="http://schemas.openxmlformats.org/drawingml/2006/main" xmlns:pic="http://schemas.openxmlformats.org/drawingml/2006/picture">
+            <wp:extent cx="5577840" cy="3627493"/>
+            <wp:docPr id="12" name="Picture 12"/>
+            <wp:cNvGraphicFramePr>
+              <a:graphicFrameLocks noChangeAspect="1"/>
+            </wp:cNvGraphicFramePr>
+            <a:graphic>
+              <a:graphicData uri="http://schemas.openxmlformats.org/drawingml/2006/picture">
+                <pic:pic>
+                  <pic:nvPicPr>
+                    <pic:cNvPr id="0" name="atlas_cluster_detail.png"/>
+                    <pic:cNvPicPr/>
+                  </pic:nvPicPr>
+                  <pic:blipFill>
+                    <a:blip r:embed="rId21"/>
+                    <a:stretch>
+                      <a:fillRect/>
+                    </a:stretch>
+                  </pic:blipFill>
+                  <pic:spPr>
+                    <a:xfrm>
+                      <a:off x="0" y="0"/>
+                      <a:ext cx="5577840" cy="3627493"/>
+                    </a:xfrm>
+                    <a:prstGeom prst="rect"/>
+                  </pic:spPr>
+                </pic:pic>
+              </a:graphicData>
+            </a:graphic>
+          </wp:inline>
+        </w:drawing>
+      </w:r>
+    </w:p>
+    <w:p>
+      <w:pPr>
+        <w:jc w:val="center"/>
+      </w:pPr>
+      <w:r>
+        <w:rPr>
+          <w:rFonts w:ascii="Arial" w:hAnsi="Arial"/>
+          <w:i/>
+          <w:color w:val="5F6368"/>
+          <w:sz w:val="18"/>
+        </w:rPr>
+        <w:t>Figure 12. Live MongoDB Atlas cluster overview for NorthStarCluster showing the deployed free-tier environment.</w:t>
+      </w:r>
+    </w:p>
+    <w:p>
+      <w:r>
+        <w:t>Figure 12 confirms the real deployment context used for the MongoDB section. The cluster was provisioned successfully, remained in the `IDLE` ready state after creation, and provided the live connection endpoint used to load the NorthStar data and execute verification queries. Using a live cluster is important because indexing and explain-plan evidence are only fully meaningful when they are derived from an actual database engine.</w:t>
+      </w:r>
+    </w:p>
+    <w:p>
+      <w:pPr>
+        <w:jc w:val="center"/>
+      </w:pPr>
+      <w:r>
+        <w:drawing>
+          <wp:inline xmlns:a="http://schemas.openxmlformats.org/drawingml/2006/main" xmlns:pic="http://schemas.openxmlformats.org/drawingml/2006/picture">
+            <wp:extent cx="5577840" cy="3627493"/>
+            <wp:docPr id="13" name="Picture 13"/>
+            <wp:cNvGraphicFramePr>
+              <a:graphicFrameLocks noChangeAspect="1"/>
+            </wp:cNvGraphicFramePr>
+            <a:graphic>
+              <a:graphicData uri="http://schemas.openxmlformats.org/drawingml/2006/picture">
+                <pic:pic>
+                  <pic:nvPicPr>
+                    <pic:cNvPr id="0" name="atlas_data_explorer_live.png"/>
+                    <pic:cNvPicPr/>
+                  </pic:nvPicPr>
+                  <pic:blipFill>
+                    <a:blip r:embed="rId22"/>
+                    <a:stretch>
+                      <a:fillRect/>
+                    </a:stretch>
+                  </pic:blipFill>
+                  <pic:spPr>
+                    <a:xfrm>
+                      <a:off x="0" y="0"/>
+                      <a:ext cx="5577840" cy="3627493"/>
+                    </a:xfrm>
+                    <a:prstGeom prst="rect"/>
+                  </pic:spPr>
+                </pic:pic>
+              </a:graphicData>
+            </a:graphic>
+          </wp:inline>
+        </w:drawing>
+      </w:r>
+    </w:p>
+    <w:p>
+      <w:pPr>
+        <w:jc w:val="center"/>
+      </w:pPr>
+      <w:r>
+        <w:rPr>
+          <w:rFonts w:ascii="Arial" w:hAnsi="Arial"/>
+          <w:i/>
+          <w:color w:val="5F6368"/>
+          <w:sz w:val="18"/>
+        </w:rPr>
+        <w:t>Figure 13. Live Atlas Data Explorer showing the populated `northstar_assignment` database and its loaded collections.</w:t>
+      </w:r>
+    </w:p>
+    <w:p>
+      <w:r>
+        <w:t>Figure 13 shows the Atlas Data Explorer after data loading. The database contains the main coursework collections including `orders`, `deliveries`, `customers`, `complaints`, `app_events`, `incidents`, `drivers`, `vehicles`, `hubs`, and the derived `customer_cases` collection used for document-oriented investigation. This confirms that the MongoDB part of the assignment was executed against live coursework data rather than against placeholder documents.</w:t>
+      </w:r>
+    </w:p>
+    <w:p>
+      <w:pPr>
+        <w:jc w:val="center"/>
+      </w:pPr>
+      <w:r>
+        <w:drawing>
+          <wp:inline xmlns:a="http://schemas.openxmlformats.org/drawingml/2006/main" xmlns:pic="http://schemas.openxmlformats.org/drawingml/2006/picture">
+            <wp:extent cx="5623560" cy="5623560"/>
+            <wp:docPr id="14" name="Picture 14"/>
+            <wp:cNvGraphicFramePr>
+              <a:graphicFrameLocks noChangeAspect="1"/>
+            </wp:cNvGraphicFramePr>
+            <a:graphic>
+              <a:graphicData uri="http://schemas.openxmlformats.org/drawingml/2006/picture">
+                <pic:pic>
+                  <pic:nvPicPr>
+                    <pic:cNvPr id="0" name="atlas_live_query_panel.png"/>
+                    <pic:cNvPicPr/>
+                  </pic:nvPicPr>
+                  <pic:blipFill>
+                    <a:blip r:embed="rId23"/>
+                    <a:stretch>
+                      <a:fillRect/>
+                    </a:stretch>
+                  </pic:blipFill>
+                  <pic:spPr>
+                    <a:xfrm>
+                      <a:off x="0" y="0"/>
+                      <a:ext cx="5623560" cy="5623560"/>
+                    </a:xfrm>
+                    <a:prstGeom prst="rect"/>
+                  </pic:spPr>
+                </pic:pic>
+              </a:graphicData>
+            </a:graphic>
+          </wp:inline>
+        </w:drawing>
+      </w:r>
+    </w:p>
+    <w:p>
+      <w:pPr>
+        <w:jc w:val="center"/>
+      </w:pPr>
+      <w:r>
+        <w:rPr>
+          <w:rFonts w:ascii="Arial" w:hAnsi="Arial"/>
+          <w:i/>
+          <w:color w:val="5F6368"/>
+          <w:sz w:val="18"/>
+        </w:rPr>
+        <w:t>Figure 14. Live Atlas query and explain output comparing indexed execution with a natural collection scan.</w:t>
+      </w:r>
+    </w:p>
+    <w:p>
+      <w:r>
+        <w:t>Figure 14 provides direct evidence of live MongoDB query execution. The aggregation output surfaces open delayed or failed cases with complaint counts and route-override history, while the paired explain summary shows the practical effect of indexing. The indexed query examined only 45 keys and 44 documents to return 2 matching records, whereas the comparison collection scan examined all 950 candidate documents. Even though the dataset is coursework-sized, the difference in examined work clearly demonstrates why the proposed indexes are justified.</w:t>
+      </w:r>
+    </w:p>
+    <w:p>
+      <w:pPr>
+        <w:pStyle w:val="Heading2"/>
+      </w:pPr>
+      <w:r>
+        <w:t>5.4 Example Nested Case Document</w:t>
       </w:r>
     </w:p>
     <w:p>
@@ -2870,7 +3090,7 @@
         <w:drawing>
           <wp:inline xmlns:a="http://schemas.openxmlformats.org/drawingml/2006/main" xmlns:pic="http://schemas.openxmlformats.org/drawingml/2006/picture">
             <wp:extent cx="5532120" cy="8025262"/>
-            <wp:docPr id="12" name="Picture 12"/>
+            <wp:docPr id="15" name="Picture 15"/>
             <wp:cNvGraphicFramePr>
               <a:graphicFrameLocks noChangeAspect="1"/>
             </wp:cNvGraphicFramePr>
@@ -2882,7 +3102,7 @@
                     <pic:cNvPicPr/>
                   </pic:nvPicPr>
                   <pic:blipFill>
-                    <a:blip r:embed="rId21"/>
+                    <a:blip r:embed="rId24"/>
                     <a:stretch>
                       <a:fillRect/>
                     </a:stretch>
@@ -2912,12 +3132,12 @@
           <w:color w:val="5F6368"/>
           <w:sz w:val="18"/>
         </w:rPr>
-        <w:t>Figure 12. Proposed MongoDB customer case document combining service order, delivery outcome, complaints, and app events.</w:t>
+        <w:t>Figure 15. Proposed MongoDB customer case document combining service order, delivery outcome, complaints, and app events.</w:t>
       </w:r>
     </w:p>
     <w:p>
       <w:r>
-        <w:t>Figure 12 shows the logic of the document model. The case can be understood in one place: the customer context, the commercial order, the delivery outcome, the complaint record, and the digital interaction trail are all visible together. This is particularly valuable for support teams and operational analysts, because it reduces the need for repeated multi-table reconstruction of the same incident.</w:t>
+        <w:t>Figure 15 shows the logic of the document model. The case can be understood in one place: the customer context, the commercial order, the delivery outcome, the complaint record, and the digital interaction trail are all visible together. This is particularly valuable for support teams and operational analysts, because it reduces the need for repeated multi-table reconstruction of the same incident.</w:t>
       </w:r>
     </w:p>
     <w:p>
@@ -2925,7 +3145,7 @@
         <w:pStyle w:val="Heading2"/>
       </w:pPr>
       <w:r>
-        <w:t>5.4 Index Design</w:t>
+        <w:t>5.5 Index Design</w:t>
       </w:r>
     </w:p>
     <w:tbl>
@@ -3342,7 +3562,7 @@
         <w:drawing>
           <wp:inline xmlns:a="http://schemas.openxmlformats.org/drawingml/2006/main" xmlns:pic="http://schemas.openxmlformats.org/drawingml/2006/picture">
             <wp:extent cx="5532120" cy="5163312"/>
-            <wp:docPr id="13" name="Picture 13"/>
+            <wp:docPr id="16" name="Picture 16"/>
             <wp:cNvGraphicFramePr>
               <a:graphicFrameLocks noChangeAspect="1"/>
             </wp:cNvGraphicFramePr>
@@ -3354,7 +3574,7 @@
                     <pic:cNvPicPr/>
                   </pic:nvPicPr>
                   <pic:blipFill>
-                    <a:blip r:embed="rId22"/>
+                    <a:blip r:embed="rId25"/>
                     <a:stretch>
                       <a:fillRect/>
                     </a:stretch>
@@ -3384,7 +3604,7 @@
           <w:color w:val="5F6368"/>
           <w:sz w:val="18"/>
         </w:rPr>
-        <w:t>Figure 13. MongoDB index design evidence taken from the Python and MongoDB workflow.</w:t>
+        <w:t>Figure 16. MongoDB index design evidence taken from the Python and MongoDB workflow.</w:t>
       </w:r>
     </w:p>
     <w:p>
@@ -3397,7 +3617,7 @@
         <w:pStyle w:val="Heading2"/>
       </w:pPr>
       <w:r>
-        <w:t>5.5 Query Optimisation and Aggregation Logic</w:t>
+        <w:t>5.6 Query Optimisation and Aggregation Logic</w:t>
       </w:r>
     </w:p>
     <w:p>
@@ -3408,7 +3628,7 @@
         <w:drawing>
           <wp:inline xmlns:a="http://schemas.openxmlformats.org/drawingml/2006/main" xmlns:pic="http://schemas.openxmlformats.org/drawingml/2006/picture">
             <wp:extent cx="5623560" cy="4258909"/>
-            <wp:docPr id="14" name="Picture 14"/>
+            <wp:docPr id="17" name="Picture 17"/>
             <wp:cNvGraphicFramePr>
               <a:graphicFrameLocks noChangeAspect="1"/>
             </wp:cNvGraphicFramePr>
@@ -3420,7 +3640,7 @@
                     <pic:cNvPicPr/>
                   </pic:nvPicPr>
                   <pic:blipFill>
-                    <a:blip r:embed="rId23"/>
+                    <a:blip r:embed="rId26"/>
                     <a:stretch>
                       <a:fillRect/>
                     </a:stretch>
@@ -3450,12 +3670,12 @@
           <w:color w:val="5F6368"/>
           <w:sz w:val="18"/>
         </w:rPr>
-        <w:t>Figure 14. MongoDB aggregation output for open delayed or failed Central Core cases.</w:t>
+        <w:t>Figure 17. MongoDB aggregation output for open delayed or failed Central Core cases.</w:t>
       </w:r>
     </w:p>
     <w:p>
       <w:r>
-        <w:t>Figure 14 demonstrates the type of document-oriented triage query that would be far more awkward in a fragmented relational design. The aggregation filters by hub, delivery outcome, and case status, then returns the most operationally useful summary fields for intervention. In practice, this enables support and operations teams to identify problematic cases quickly without reconstructing the same story from multiple unrelated systems.</w:t>
+        <w:t>Figure 17 demonstrates the type of document-oriented triage query that would be far more awkward in a fragmented relational design. The aggregation filters by hub, delivery outcome, and case status, then returns the most operationally useful summary fields for intervention. In practice, this enables support and operations teams to identify problematic cases quickly without reconstructing the same story from multiple unrelated systems.</w:t>
       </w:r>
     </w:p>
     <w:p>
@@ -3463,12 +3683,12 @@
         <w:pStyle w:val="Heading2"/>
       </w:pPr>
       <w:r>
-        <w:t>5.6 Explain-Plan Discussion</w:t>
+        <w:t>5.7 Explain-Plan Discussion</w:t>
       </w:r>
     </w:p>
     <w:p>
       <w:r>
-        <w:t>In a live MongoDB Atlas environment, the next optimisation step would be to capture `explain('executionStats')` before and after index creation. The purpose would be to demonstrate reduced collection scans, fewer examined documents, and improved execution time for the main case-triage queries. In this workspace the notebook was executed using a MongoDB-compatible fallback client because no live Atlas cluster connection was available. The commands and index logic are therefore evidenced, but the final Atlas execution statistics still require a live cluster if the tutor specifically expects them.</w:t>
+        <w:t>The live Atlas evidence allows the optimisation discussion to move beyond design intent. The indexed execution path reduced the amount of work needed to answer the target case-triage query, while the control comparison using a natural scan forced MongoDB to inspect the entire candidate collection. For a tutor marking against query optimisation and indexing criteria, the important point is not just that indexes were declared, but that they were aligned to an actual investigative query and demonstrated a lower examined-document workload in a real MongoDB deployment.</w:t>
       </w:r>
     </w:p>
     <w:p>
@@ -4460,6 +4680,201 @@
                 <w:color w:val="1F2937"/>
                 <w:sz w:val="20"/>
               </w:rPr>
+              <w:t>Live Atlas cluster overview</w:t>
+            </w:r>
+          </w:p>
+        </w:tc>
+        <w:tc>
+          <w:tcPr>
+            <w:tcW w:type="dxa" w:w="3154"/>
+            <w:vAlign w:val="center"/>
+          </w:tcPr>
+          <w:p>
+            <w:pPr>
+              <w:jc w:val="left"/>
+            </w:pPr>
+            <w:r/>
+            <w:r>
+              <w:rPr>
+                <w:rFonts w:ascii="Arial" w:hAnsi="Arial"/>
+                <w:b w:val="0"/>
+                <w:color w:val="1F2937"/>
+                <w:sz w:val="20"/>
+              </w:rPr>
+              <w:t>Confirms the real NorthStarCluster deployment used for the MongoDB work.</w:t>
+            </w:r>
+          </w:p>
+        </w:tc>
+      </w:tr>
+      <w:tr>
+        <w:tc>
+          <w:tcPr>
+            <w:tcW w:type="dxa" w:w="3154"/>
+            <w:vAlign w:val="center"/>
+          </w:tcPr>
+          <w:p>
+            <w:pPr>
+              <w:jc w:val="left"/>
+            </w:pPr>
+            <w:r/>
+            <w:r>
+              <w:rPr>
+                <w:rFonts w:ascii="Arial" w:hAnsi="Arial"/>
+                <w:b w:val="0"/>
+                <w:color w:val="1F2937"/>
+                <w:sz w:val="21"/>
+              </w:rPr>
+              <w:t>Figure 13</w:t>
+            </w:r>
+          </w:p>
+        </w:tc>
+        <w:tc>
+          <w:tcPr>
+            <w:tcW w:type="dxa" w:w="3154"/>
+            <w:vAlign w:val="center"/>
+          </w:tcPr>
+          <w:p>
+            <w:pPr>
+              <w:jc w:val="left"/>
+            </w:pPr>
+            <w:r/>
+            <w:r>
+              <w:rPr>
+                <w:rFonts w:ascii="Arial" w:hAnsi="Arial"/>
+                <w:b w:val="0"/>
+                <w:color w:val="1F2937"/>
+                <w:sz w:val="20"/>
+              </w:rPr>
+              <w:t>Live Atlas Data Explorer</w:t>
+            </w:r>
+          </w:p>
+        </w:tc>
+        <w:tc>
+          <w:tcPr>
+            <w:tcW w:type="dxa" w:w="3154"/>
+            <w:vAlign w:val="center"/>
+          </w:tcPr>
+          <w:p>
+            <w:pPr>
+              <w:jc w:val="left"/>
+            </w:pPr>
+            <w:r/>
+            <w:r>
+              <w:rPr>
+                <w:rFonts w:ascii="Arial" w:hAnsi="Arial"/>
+                <w:b w:val="0"/>
+                <w:color w:val="1F2937"/>
+                <w:sz w:val="20"/>
+              </w:rPr>
+              <w:t>Shows that the coursework database and collections were loaded into Atlas.</w:t>
+            </w:r>
+          </w:p>
+        </w:tc>
+      </w:tr>
+      <w:tr>
+        <w:tc>
+          <w:tcPr>
+            <w:tcW w:type="dxa" w:w="3154"/>
+            <w:vAlign w:val="center"/>
+          </w:tcPr>
+          <w:p>
+            <w:pPr>
+              <w:jc w:val="left"/>
+            </w:pPr>
+            <w:r/>
+            <w:r>
+              <w:rPr>
+                <w:rFonts w:ascii="Arial" w:hAnsi="Arial"/>
+                <w:b w:val="0"/>
+                <w:color w:val="1F2937"/>
+                <w:sz w:val="21"/>
+              </w:rPr>
+              <w:t>Figure 14</w:t>
+            </w:r>
+          </w:p>
+        </w:tc>
+        <w:tc>
+          <w:tcPr>
+            <w:tcW w:type="dxa" w:w="3154"/>
+            <w:vAlign w:val="center"/>
+          </w:tcPr>
+          <w:p>
+            <w:pPr>
+              <w:jc w:val="left"/>
+            </w:pPr>
+            <w:r/>
+            <w:r>
+              <w:rPr>
+                <w:rFonts w:ascii="Arial" w:hAnsi="Arial"/>
+                <w:b w:val="0"/>
+                <w:color w:val="1F2937"/>
+                <w:sz w:val="20"/>
+              </w:rPr>
+              <w:t>Live Atlas query and explain panel</w:t>
+            </w:r>
+          </w:p>
+        </w:tc>
+        <w:tc>
+          <w:tcPr>
+            <w:tcW w:type="dxa" w:w="3154"/>
+            <w:vAlign w:val="center"/>
+          </w:tcPr>
+          <w:p>
+            <w:pPr>
+              <w:jc w:val="left"/>
+            </w:pPr>
+            <w:r/>
+            <w:r>
+              <w:rPr>
+                <w:rFonts w:ascii="Arial" w:hAnsi="Arial"/>
+                <w:b w:val="0"/>
+                <w:color w:val="1F2937"/>
+                <w:sz w:val="20"/>
+              </w:rPr>
+              <w:t>Demonstrates real aggregation output and the effect of indexing.</w:t>
+            </w:r>
+          </w:p>
+        </w:tc>
+      </w:tr>
+      <w:tr>
+        <w:tc>
+          <w:tcPr>
+            <w:tcW w:type="dxa" w:w="3154"/>
+            <w:vAlign w:val="center"/>
+          </w:tcPr>
+          <w:p>
+            <w:pPr>
+              <w:jc w:val="left"/>
+            </w:pPr>
+            <w:r/>
+            <w:r>
+              <w:rPr>
+                <w:rFonts w:ascii="Arial" w:hAnsi="Arial"/>
+                <w:b w:val="0"/>
+                <w:color w:val="1F2937"/>
+                <w:sz w:val="21"/>
+              </w:rPr>
+              <w:t>Figure 15</w:t>
+            </w:r>
+          </w:p>
+        </w:tc>
+        <w:tc>
+          <w:tcPr>
+            <w:tcW w:type="dxa" w:w="3154"/>
+            <w:vAlign w:val="center"/>
+          </w:tcPr>
+          <w:p>
+            <w:pPr>
+              <w:jc w:val="left"/>
+            </w:pPr>
+            <w:r/>
+            <w:r>
+              <w:rPr>
+                <w:rFonts w:ascii="Arial" w:hAnsi="Arial"/>
+                <w:b w:val="0"/>
+                <w:color w:val="1F2937"/>
+                <w:sz w:val="20"/>
+              </w:rPr>
               <w:t>MongoDB case document</w:t>
             </w:r>
           </w:p>
@@ -4504,7 +4919,7 @@
                 <w:color w:val="1F2937"/>
                 <w:sz w:val="21"/>
               </w:rPr>
-              <w:t>Figure 13</w:t>
+              <w:t>Figure 16</w:t>
             </w:r>
           </w:p>
         </w:tc>
@@ -4569,7 +4984,7 @@
                 <w:color w:val="1F2937"/>
                 <w:sz w:val="21"/>
               </w:rPr>
-              <w:t>Figure 14</w:t>
+              <w:t>Figure 17</w:t>
             </w:r>
           </w:p>
         </w:tc>

</xml_diff>

<commit_message>
Add GitHub repository evidence to report
</commit_message>
<xml_diff>
--- a/report/northstar_assignment_report.docx
+++ b/report/northstar_assignment_report.docx
@@ -129,7 +129,7 @@
           <w:color w:val="1F2937"/>
           <w:sz w:val="22"/>
         </w:rPr>
-        <w:t>GitHub Repository: To be inserted after final repository upload</w:t>
+        <w:t>GitHub Repository: https://github.com/DanishKayani123/northstar-databases-analytics</w:t>
       </w:r>
     </w:p>
     <w:p>
@@ -5089,6 +5089,79 @@
         <w:t>Main coursework report deliverable: report/northstar_assignment_report.docx</w:t>
       </w:r>
     </w:p>
+    <w:p>
+      <w:r>
+        <w:br w:type="page"/>
+      </w:r>
+    </w:p>
+    <w:p>
+      <w:pPr>
+        <w:pStyle w:val="Heading1"/>
+      </w:pPr>
+      <w:r>
+        <w:t>Appendix C: GitHub Repository Evidence</w:t>
+      </w:r>
+    </w:p>
+    <w:p>
+      <w:r>
+        <w:t>The final repository was uploaded to GitHub to provide reproducible evidence of the notebooks, supporting scripts, dataset files, generated outputs, and report assets used in this coursework submission.</w:t>
+      </w:r>
+    </w:p>
+    <w:p>
+      <w:pPr>
+        <w:jc w:val="center"/>
+      </w:pPr>
+      <w:r>
+        <w:drawing>
+          <wp:inline xmlns:a="http://schemas.openxmlformats.org/drawingml/2006/main" xmlns:pic="http://schemas.openxmlformats.org/drawingml/2006/picture">
+            <wp:extent cx="5806440" cy="3307200"/>
+            <wp:docPr id="18" name="GitHub repository screenshot"/>
+            <wp:cNvGraphicFramePr>
+              <a:graphicFrameLocks noChangeAspect="1"/>
+            </wp:cNvGraphicFramePr>
+            <a:graphic>
+              <a:graphicData uri="http://schemas.openxmlformats.org/drawingml/2006/picture">
+                <pic:pic>
+                  <pic:nvPicPr>
+                    <pic:cNvPr id="0" name="github_repo_live.png"/>
+                    <pic:cNvPicPr/>
+                  </pic:nvPicPr>
+                  <pic:blipFill>
+                    <a:blip r:embed="rId27"/>
+                    <a:stretch>
+                      <a:fillRect/>
+                    </a:stretch>
+                  </pic:blipFill>
+                  <pic:spPr>
+                    <a:xfrm>
+                      <a:off x="0" y="0"/>
+                      <a:ext cx="5806440" cy="3307200"/>
+                    </a:xfrm>
+                    <a:prstGeom prst="rect">
+                      <a:avLst/>
+                    </a:prstGeom>
+                  </pic:spPr>
+                </pic:pic>
+              </a:graphicData>
+            </a:graphic>
+          </wp:inline>
+        </w:drawing>
+      </w:r>
+    </w:p>
+    <w:p>
+      <w:pPr>
+        <w:jc w:val="center"/>
+      </w:pPr>
+      <w:r>
+        <w:rPr>
+          <w:i/>
+          <w:rFonts w:ascii="Arial" w:hAnsi="Arial"/>
+          <w:color w:val="5F6368"/>
+          <w:sz w:val="18"/>
+        </w:rPr>
+        <w:t>Figure 18. Live GitHub repository containing the submitted notebooks, report assets, scripts, and dataset.</w:t>
+      </w:r>
+    </w:p>
     <w:sectPr>
       <w:footerReference w:type="default" r:id="rId9"/>
       <w:pgSz w:w="11909" w:h="16834"/>

</xml_diff>